<commit_message>
docs: Added reasons for backward P/E and Forward P/E
</commit_message>
<xml_diff>
--- a/Finanace/Stock Market Investing And Trading Foundation.docx
+++ b/Finanace/Stock Market Investing And Trading Foundation.docx
@@ -1,6 +1,6 @@
 
 <file path=word/document.xml><?xml version="1.0" encoding="utf-8"?>
-<w:document xmlns:wpc="http://schemas.microsoft.com/office/word/2010/wordprocessingCanvas" xmlns:cx="http://schemas.microsoft.com/office/drawing/2014/chartex" xmlns:cx1="http://schemas.microsoft.com/office/drawing/2015/9/8/chartex" xmlns:cx2="http://schemas.microsoft.com/office/drawing/2015/10/21/chartex" xmlns:cx3="http://schemas.microsoft.com/office/drawing/2016/5/9/chartex" xmlns:cx4="http://schemas.microsoft.com/office/drawing/2016/5/10/chartex" xmlns:cx5="http://schemas.microsoft.com/office/drawing/2016/5/11/chartex" xmlns:cx6="http://schemas.microsoft.com/office/drawing/2016/5/12/chartex" xmlns:cx7="http://schemas.microsoft.com/office/drawing/2016/5/13/chartex" xmlns:cx8="http://schemas.microsoft.com/office/drawing/2016/5/14/chartex" xmlns:mc="http://schemas.openxmlformats.org/markup-compatibility/2006" xmlns:aink="http://schemas.microsoft.com/office/drawing/2016/ink" xmlns:am3d="http://schemas.microsoft.com/office/drawing/2017/model3d" xmlns:o="urn:schemas-microsoft-com:office:office" xmlns:oel="http://schemas.microsoft.com/office/2019/extlst" xmlns:r="http://schemas.openxmlformats.org/officeDocument/2006/relationships" xmlns:m="http://schemas.openxmlformats.org/officeDocument/2006/math" xmlns:v="urn:schemas-microsoft-com:vml" xmlns:wp14="http://schemas.microsoft.com/office/word/2010/wordprocessingDrawing" xmlns:wp="http://schemas.openxmlformats.org/drawingml/2006/wordprocessingDrawing" xmlns:w10="urn:schemas-microsoft-com:office:word" xmlns:w="http://schemas.openxmlformats.org/wordprocessingml/2006/main" xmlns:w14="http://schemas.microsoft.com/office/word/2010/wordml" xmlns:w15="http://schemas.microsoft.com/office/word/2012/wordml" xmlns:w16cex="http://schemas.microsoft.com/office/word/2018/wordml/cex" xmlns:w16cid="http://schemas.microsoft.com/office/word/2016/wordml/cid" xmlns:w16="http://schemas.microsoft.com/office/word/2018/wordml" xmlns:w16sdtdh="http://schemas.microsoft.com/office/word/2020/wordml/sdtdatahash" xmlns:w16se="http://schemas.microsoft.com/office/word/2015/wordml/symex" xmlns:wpg="http://schemas.microsoft.com/office/word/2010/wordprocessingGroup" xmlns:wpi="http://schemas.microsoft.com/office/word/2010/wordprocessingInk" xmlns:wne="http://schemas.microsoft.com/office/word/2006/wordml" xmlns:wps="http://schemas.microsoft.com/office/word/2010/wordprocessingShape" mc:Ignorable="w14 w15 w16se w16cid w16 w16cex w16sdtdh wp14">
+<w:document xmlns:wpc="http://schemas.microsoft.com/office/word/2010/wordprocessingCanvas" xmlns:cx="http://schemas.microsoft.com/office/drawing/2014/chartex" xmlns:cx1="http://schemas.microsoft.com/office/drawing/2015/9/8/chartex" xmlns:cx2="http://schemas.microsoft.com/office/drawing/2015/10/21/chartex" xmlns:cx3="http://schemas.microsoft.com/office/drawing/2016/5/9/chartex" xmlns:cx4="http://schemas.microsoft.com/office/drawing/2016/5/10/chartex" xmlns:cx5="http://schemas.microsoft.com/office/drawing/2016/5/11/chartex" xmlns:cx6="http://schemas.microsoft.com/office/drawing/2016/5/12/chartex" xmlns:cx7="http://schemas.microsoft.com/office/drawing/2016/5/13/chartex" xmlns:cx8="http://schemas.microsoft.com/office/drawing/2016/5/14/chartex" xmlns:mc="http://schemas.openxmlformats.org/markup-compatibility/2006" xmlns:aink="http://schemas.microsoft.com/office/drawing/2016/ink" xmlns:am3d="http://schemas.microsoft.com/office/drawing/2017/model3d" xmlns:o="urn:schemas-microsoft-com:office:office" xmlns:oel="http://schemas.microsoft.com/office/2019/extlst" xmlns:r="http://schemas.openxmlformats.org/officeDocument/2006/relationships" xmlns:m="http://schemas.openxmlformats.org/officeDocument/2006/math" xmlns:v="urn:schemas-microsoft-com:vml" xmlns:wp14="http://schemas.microsoft.com/office/word/2010/wordprocessingDrawing" xmlns:wp="http://schemas.openxmlformats.org/drawingml/2006/wordprocessingDrawing" xmlns:w10="urn:schemas-microsoft-com:office:word" xmlns:w="http://schemas.openxmlformats.org/wordprocessingml/2006/main" xmlns:w14="http://schemas.microsoft.com/office/word/2010/wordml" xmlns:w15="http://schemas.microsoft.com/office/word/2012/wordml" xmlns:w16cex="http://schemas.microsoft.com/office/word/2018/wordml/cex" xmlns:w16cid="http://schemas.microsoft.com/office/word/2016/wordml/cid" xmlns:w16="http://schemas.microsoft.com/office/word/2018/wordml" xmlns:w16du="http://schemas.microsoft.com/office/word/2023/wordml/word16du" xmlns:w16sdtdh="http://schemas.microsoft.com/office/word/2020/wordml/sdtdatahash" xmlns:w16se="http://schemas.microsoft.com/office/word/2015/wordml/symex" xmlns:wpg="http://schemas.microsoft.com/office/word/2010/wordprocessingGroup" xmlns:wpi="http://schemas.microsoft.com/office/word/2010/wordprocessingInk" xmlns:wne="http://schemas.microsoft.com/office/word/2006/wordml" xmlns:wps="http://schemas.microsoft.com/office/word/2010/wordprocessingShape" mc:Ignorable="w14 w15 w16se w16cid w16 w16cex w16sdtdh w16du wp14">
   <w:body>
     <w:p>
       <w:pPr>
@@ -8,15 +8,7 @@
         <w:jc w:val="center"/>
       </w:pPr>
       <w:r>
-        <w:t xml:space="preserve">Stock Market Investing </w:t>
-      </w:r>
-      <w:proofErr w:type="gramStart"/>
-      <w:r>
-        <w:t>And</w:t>
-      </w:r>
-      <w:proofErr w:type="gramEnd"/>
-      <w:r>
-        <w:t xml:space="preserve"> Trading Foundation</w:t>
+        <w:t>Stock Market Investing And Trading Foundation</w:t>
       </w:r>
     </w:p>
     <w:p>
@@ -85,31 +77,7 @@
     </w:p>
     <w:p>
       <w:r>
-        <w:t xml:space="preserve">The good news for investors; long term market makes returns. </w:t>
-      </w:r>
-      <w:proofErr w:type="gramStart"/>
-      <w:r>
-        <w:t>Usually</w:t>
-      </w:r>
-      <w:proofErr w:type="gramEnd"/>
-      <w:r>
-        <w:t xml:space="preserve"> stock </w:t>
-      </w:r>
-      <w:proofErr w:type="gramStart"/>
-      <w:r>
-        <w:t>investor</w:t>
-      </w:r>
-      <w:proofErr w:type="gramEnd"/>
-      <w:r>
-        <w:t xml:space="preserve"> survive or make money only for long term investment, even </w:t>
-      </w:r>
-      <w:proofErr w:type="spellStart"/>
-      <w:r>
-        <w:t>through</w:t>
-      </w:r>
-      <w:proofErr w:type="spellEnd"/>
-      <w:r>
-        <w:t xml:space="preserve"> the great depression or covid-19 pandemic for instance. Buy why? Because stock rises over time, even with big pull back, such as covid-19 or even with high inflation.</w:t>
+        <w:t>The good news for investors; long term market makes returns. Usually stock investor survive or make money only for long term investment, even through the great depression or covid-19 pandemic for instance. Buy why? Because stock rises over time, even with big pull back, such as covid-19 or even with high inflation.</w:t>
       </w:r>
     </w:p>
     <w:p/>
@@ -123,15 +91,7 @@
     </w:p>
     <w:p>
       <w:r>
-        <w:t xml:space="preserve">There are 3 ways to evaluate </w:t>
-      </w:r>
-      <w:proofErr w:type="gramStart"/>
-      <w:r>
-        <w:t>stock</w:t>
-      </w:r>
-      <w:proofErr w:type="gramEnd"/>
-      <w:r>
-        <w:t>.</w:t>
+        <w:t>There are 3 ways to evaluate stock.</w:t>
       </w:r>
     </w:p>
     <w:p/>
@@ -217,15 +177,7 @@
     <w:p/>
     <w:p>
       <w:r>
-        <w:t xml:space="preserve">You can take an example of “Apple Inc.”. Although Apple products </w:t>
-      </w:r>
-      <w:proofErr w:type="gramStart"/>
-      <w:r>
-        <w:t>is</w:t>
-      </w:r>
-      <w:proofErr w:type="gramEnd"/>
-      <w:r>
-        <w:t xml:space="preserve"> expensive, but it has a high in terms of quality and services, also Apple is well known and has a good reputation. </w:t>
+        <w:t xml:space="preserve">You can take an example of “Apple Inc.”. Although Apple products is expensive, but it has a high in terms of quality and services, also Apple is well known and has a good reputation. </w:t>
       </w:r>
     </w:p>
     <w:p>
@@ -244,15 +196,7 @@
     </w:p>
     <w:p>
       <w:r>
-        <w:t xml:space="preserve">Ratios means the price you are paying for a stock good in relation to something. There are 3 </w:t>
-      </w:r>
-      <w:proofErr w:type="gramStart"/>
-      <w:r>
-        <w:t>type</w:t>
-      </w:r>
-      <w:proofErr w:type="gramEnd"/>
-      <w:r>
-        <w:t xml:space="preserve"> of measures in ratios. </w:t>
+        <w:t xml:space="preserve">Ratios means the price you are paying for a stock good in relation to something. There are 3 type of measures in ratios. </w:t>
       </w:r>
     </w:p>
     <w:p/>
@@ -353,15 +297,7 @@
         <w:t>out</w:t>
       </w:r>
       <w:r>
-        <w:t xml:space="preserve"> on the website (please refer to the useful links above). From the yahoo finance web </w:t>
-      </w:r>
-      <w:proofErr w:type="gramStart"/>
-      <w:r>
-        <w:t>site</w:t>
-      </w:r>
-      <w:proofErr w:type="gramEnd"/>
-      <w:r>
-        <w:t xml:space="preserve"> you can click on the </w:t>
+        <w:t xml:space="preserve"> on the website (please refer to the useful links above). From the yahoo finance web site you can click on the </w:t>
       </w:r>
       <w:r>
         <w:rPr>
@@ -371,7 +307,13 @@
         <w:t xml:space="preserve">statistic </w:t>
       </w:r>
       <w:r>
-        <w:t xml:space="preserve">link, from their you can find all </w:t>
+        <w:t xml:space="preserve">link, from </w:t>
+      </w:r>
+      <w:r>
+        <w:t>there</w:t>
+      </w:r>
+      <w:r>
+        <w:t xml:space="preserve"> you can find all </w:t>
       </w:r>
       <w:r>
         <w:t>sorts</w:t>
@@ -544,7 +486,13 @@
         </w:numPr>
       </w:pPr>
       <w:r>
-        <w:t>P/E 16.21 X ($30.31 / $1.87)</w:t>
+        <w:t xml:space="preserve">P/E </w:t>
+      </w:r>
+      <w:r>
+        <w:t xml:space="preserve">= </w:t>
+      </w:r>
+      <w:r>
+        <w:t>$30.31 / $1.87</w:t>
       </w:r>
     </w:p>
     <w:p/>
@@ -552,13 +500,9 @@
       <w:r>
         <w:t xml:space="preserve">Bank of America has a trailing P/E of 16.21. Bank of America’s P/E at 16.21 was slightly higher than the S&amp;P 500, which over time traders has a trailing P/E ratio of 15. To compare Bank of American’s P/E to </w:t>
       </w:r>
-      <w:proofErr w:type="spellStart"/>
-      <w:proofErr w:type="gramStart"/>
-      <w:r>
-        <w:t>it’s</w:t>
-      </w:r>
-      <w:proofErr w:type="spellEnd"/>
-      <w:proofErr w:type="gramEnd"/>
+      <w:r>
+        <w:t>its</w:t>
+      </w:r>
       <w:r>
         <w:t xml:space="preserve"> peer, we can calculate the P/E of JPMorgan Chase &amp; Co. as of end of 2020:</w:t>
       </w:r>
@@ -615,27 +559,26 @@
         <w:t>of</w:t>
       </w:r>
       <w:r>
-        <w:t xml:space="preserve"> America’s stock does not appear as overvalued as it did when compared with the average P/E of 15 for the S&amp;P 500. Bank of America’s higher P/E ratio might mean investors expected higher earnings growth in the future compared to JP Morgan and the overall market. Why </w:t>
-      </w:r>
-      <w:proofErr w:type="gramStart"/>
-      <w:r>
-        <w:t>expected</w:t>
-      </w:r>
-      <w:proofErr w:type="gramEnd"/>
-      <w:r>
-        <w:t xml:space="preserve"> higher earnings? Because the smaller the P/E ratio number the better the stock to buy</w:t>
-      </w:r>
-      <w:r>
-        <w:t xml:space="preserve"> (Earning increase</w:t>
-      </w:r>
-      <w:proofErr w:type="gramStart"/>
-      <w:r>
-        <w:t xml:space="preserve">) </w:t>
-      </w:r>
-      <w:r>
-        <w:t>,</w:t>
-      </w:r>
-      <w:proofErr w:type="gramEnd"/>
+        <w:t xml:space="preserve"> America’s stock does not appear as overvalued as it did when compared with the average P/E of 15 for the S&amp;P 500. Bank of America’s higher P/E ratio might mean investors expected higher earnings growth in the future compared to JP Morgan and the overall market. Why expected higher earnings? Because </w:t>
+      </w:r>
+      <w:r>
+        <w:rPr>
+          <w:color w:val="FF0000"/>
+        </w:rPr>
+        <w:t>the smaller the P/E ratio number the better the stock to buy</w:t>
+      </w:r>
+      <w:r>
+        <w:rPr>
+          <w:color w:val="FF0000"/>
+        </w:rPr>
+        <w:t xml:space="preserve"> </w:t>
+      </w:r>
+      <w:r>
+        <w:t>(Earning increase</w:t>
+      </w:r>
+      <w:r>
+        <w:t>),</w:t>
+      </w:r>
       <w:r>
         <w:t xml:space="preserve"> that means investors are </w:t>
       </w:r>
@@ -680,15 +623,7 @@
         <w:t>represents</w:t>
       </w:r>
       <w:r>
-        <w:t xml:space="preserve"> the P/E of the current </w:t>
-      </w:r>
-      <w:proofErr w:type="gramStart"/>
-      <w:r>
-        <w:t>time period</w:t>
-      </w:r>
-      <w:proofErr w:type="gramEnd"/>
-      <w:r>
-        <w:t xml:space="preserve">. For </w:t>
+        <w:t xml:space="preserve"> the P/E of the current time period. For </w:t>
       </w:r>
       <w:r>
         <w:t>instance,</w:t>
@@ -708,23 +643,7 @@
     </w:p>
     <w:p>
       <w:r>
-        <w:t xml:space="preserve">The relative P/E compares the absolute P/E to the benchmark or a range of past previous P/E over a relevant </w:t>
-      </w:r>
-      <w:proofErr w:type="gramStart"/>
-      <w:r>
-        <w:t>time period</w:t>
-      </w:r>
-      <w:proofErr w:type="gramEnd"/>
-      <w:r>
-        <w:t xml:space="preserve">, such as past 10 years. The relative P/E shows what portions or percentage of the past P/Es. The relative P/E usually compares the current P/E to the highest P/E of a given </w:t>
-      </w:r>
-      <w:proofErr w:type="gramStart"/>
-      <w:r>
-        <w:t>time period</w:t>
-      </w:r>
-      <w:proofErr w:type="gramEnd"/>
-      <w:r>
-        <w:t xml:space="preserve">. Sometimes </w:t>
+        <w:t xml:space="preserve">The relative P/E compares the absolute P/E to the benchmark or a range of past previous P/E over a relevant time period, such as past 10 years. The relative P/E shows what portions or percentage of the past P/Es. The relative P/E usually compares the current P/E to the highest P/E of a given time period. Sometimes </w:t>
       </w:r>
       <w:r>
         <w:t>investors</w:t>
@@ -809,15 +728,7 @@
     </w:p>
     <w:p>
       <w:r>
-        <w:t xml:space="preserve">Companies sometimes inherit problems with the forward P/E metrics, namely, to underestimate the earnings </w:t>
-      </w:r>
-      <w:proofErr w:type="gramStart"/>
-      <w:r>
-        <w:t>in order to</w:t>
-      </w:r>
-      <w:proofErr w:type="gramEnd"/>
-      <w:r>
-        <w:t xml:space="preserve"> beat the estimate P/E ratio, for the next </w:t>
+        <w:t xml:space="preserve">Companies sometimes inherit problems with the forward P/E metrics, namely, to underestimate the earnings in order to beat the estimate P/E ratio, for the next </w:t>
       </w:r>
       <w:r>
         <w:t>quarter’s</w:t>
@@ -840,15 +751,544 @@
         <w:t>the next</w:t>
       </w:r>
       <w:r>
-        <w:t xml:space="preserve"> quarter announcement. External analyst also provides P/E ratio estimate which may diverge from the company’s estimate which creates confusion. Companies sometimes could also provide inaccurate estimate P/E ratio, that’s why most investors prefer to choose the trailing P/E ratios. Furthermore, past performance doesn’t signal future behaviors. </w:t>
+        <w:t xml:space="preserve"> quarter announcement. External analyst also provides P/E ratio estimate which may diverge from the company’s estimate which creates confusion. Companies sometimes could also provide inaccurate estimate P/E ratio, that’s why most investors prefer to choose the trailing P/E ratios. Furthermore, past performance doesn’t signal future behaviors.</w:t>
       </w:r>
     </w:p>
     <w:p/>
+    <w:p/>
+    <w:p>
+      <w:pPr>
+        <w:widowControl/>
+        <w:jc w:val="left"/>
+      </w:pPr>
+      <w:r>
+        <w:br w:type="page"/>
+      </w:r>
+    </w:p>
+    <w:p>
+      <w:r>
+        <w:lastRenderedPageBreak/>
+        <w:t xml:space="preserve">If I am the investor, should </w:t>
+      </w:r>
+      <w:r>
+        <w:t>I</w:t>
+      </w:r>
+      <w:r>
+        <w:t xml:space="preserve"> look at Trailing P/E ratio or the forward P/E ratio</w:t>
+      </w:r>
+      <w:r>
+        <w:t>?</w:t>
+      </w:r>
+    </w:p>
+    <w:p>
+      <w:pPr>
+        <w:widowControl/>
+        <w:jc w:val="left"/>
+      </w:pPr>
+    </w:p>
+    <w:p>
+      <w:pPr>
+        <w:widowControl/>
+        <w:jc w:val="left"/>
+        <w:rPr>
+          <w:b/>
+          <w:bCs/>
+          <w:sz w:val="32"/>
+          <w:szCs w:val="32"/>
+          <w:lang w:val="en-HK"/>
+        </w:rPr>
+      </w:pPr>
+      <w:r>
+        <w:rPr>
+          <w:b/>
+          <w:bCs/>
+          <w:sz w:val="32"/>
+          <w:szCs w:val="32"/>
+          <w:lang w:val="en-HK"/>
+        </w:rPr>
+        <w:t>Trailing P/E Ratio</w:t>
+      </w:r>
+    </w:p>
+    <w:p>
+      <w:pPr>
+        <w:widowControl/>
+        <w:numPr>
+          <w:ilvl w:val="0"/>
+          <w:numId w:val="9"/>
+        </w:numPr>
+        <w:jc w:val="left"/>
+        <w:rPr>
+          <w:lang w:val="en-HK"/>
+        </w:rPr>
+      </w:pPr>
+      <w:r>
+        <w:rPr>
+          <w:b/>
+          <w:bCs/>
+          <w:lang w:val="en-HK"/>
+        </w:rPr>
+        <w:t>Definition</w:t>
+      </w:r>
+      <w:r>
+        <w:rPr>
+          <w:lang w:val="en-HK"/>
+        </w:rPr>
+        <w:t>: This ratio uses the earnings per share (EPS) from the past 12 months.</w:t>
+      </w:r>
+    </w:p>
+    <w:p>
+      <w:pPr>
+        <w:widowControl/>
+        <w:numPr>
+          <w:ilvl w:val="0"/>
+          <w:numId w:val="9"/>
+        </w:numPr>
+        <w:jc w:val="left"/>
+        <w:rPr>
+          <w:lang w:val="en-HK"/>
+        </w:rPr>
+      </w:pPr>
+      <w:r>
+        <w:rPr>
+          <w:b/>
+          <w:bCs/>
+          <w:lang w:val="en-HK"/>
+        </w:rPr>
+        <w:t>Pros</w:t>
+      </w:r>
+      <w:r>
+        <w:rPr>
+          <w:lang w:val="en-HK"/>
+        </w:rPr>
+        <w:t>:</w:t>
+      </w:r>
+    </w:p>
+    <w:p>
+      <w:pPr>
+        <w:widowControl/>
+        <w:numPr>
+          <w:ilvl w:val="1"/>
+          <w:numId w:val="9"/>
+        </w:numPr>
+        <w:jc w:val="left"/>
+        <w:rPr>
+          <w:lang w:val="en-HK"/>
+        </w:rPr>
+      </w:pPr>
+      <w:r>
+        <w:rPr>
+          <w:lang w:val="en-HK"/>
+        </w:rPr>
+        <w:t>Based on actual historical data, making it a reliable measure of past performance.</w:t>
+      </w:r>
+    </w:p>
+    <w:p>
+      <w:pPr>
+        <w:widowControl/>
+        <w:numPr>
+          <w:ilvl w:val="1"/>
+          <w:numId w:val="9"/>
+        </w:numPr>
+        <w:jc w:val="left"/>
+        <w:rPr>
+          <w:lang w:val="en-HK"/>
+        </w:rPr>
+      </w:pPr>
+      <w:r>
+        <w:rPr>
+          <w:lang w:val="en-HK"/>
+        </w:rPr>
+        <w:t>Useful for comparing a company’s current valuation to its historical performance.</w:t>
+      </w:r>
+    </w:p>
+    <w:p>
+      <w:pPr>
+        <w:widowControl/>
+        <w:numPr>
+          <w:ilvl w:val="0"/>
+          <w:numId w:val="9"/>
+        </w:numPr>
+        <w:jc w:val="left"/>
+        <w:rPr>
+          <w:lang w:val="en-HK"/>
+        </w:rPr>
+      </w:pPr>
+      <w:r>
+        <w:rPr>
+          <w:b/>
+          <w:bCs/>
+          <w:lang w:val="en-HK"/>
+        </w:rPr>
+        <w:t>Cons</w:t>
+      </w:r>
+      <w:r>
+        <w:rPr>
+          <w:lang w:val="en-HK"/>
+        </w:rPr>
+        <w:t>:</w:t>
+      </w:r>
+    </w:p>
+    <w:p>
+      <w:pPr>
+        <w:widowControl/>
+        <w:numPr>
+          <w:ilvl w:val="1"/>
+          <w:numId w:val="9"/>
+        </w:numPr>
+        <w:jc w:val="left"/>
+        <w:rPr>
+          <w:lang w:val="en-HK"/>
+        </w:rPr>
+      </w:pPr>
+      <w:r>
+        <w:rPr>
+          <w:lang w:val="en-HK"/>
+        </w:rPr>
+        <w:t>Doesn’t account for future growth or potential changes in earnings.</w:t>
+      </w:r>
+    </w:p>
+    <w:p>
+      <w:pPr>
+        <w:widowControl/>
+        <w:numPr>
+          <w:ilvl w:val="1"/>
+          <w:numId w:val="9"/>
+        </w:numPr>
+        <w:jc w:val="left"/>
+        <w:rPr>
+          <w:lang w:val="en-HK"/>
+        </w:rPr>
+      </w:pPr>
+      <w:r>
+        <w:rPr>
+          <w:lang w:val="en-HK"/>
+        </w:rPr>
+        <w:t>May not be as relevant if the company’s earnings are expected to change significantly.</w:t>
+      </w:r>
+    </w:p>
+    <w:p>
+      <w:pPr>
+        <w:widowControl/>
+        <w:ind w:left="1080"/>
+        <w:jc w:val="left"/>
+        <w:rPr>
+          <w:lang w:val="en-HK"/>
+        </w:rPr>
+      </w:pPr>
+    </w:p>
+    <w:p>
+      <w:pPr>
+        <w:widowControl/>
+        <w:jc w:val="left"/>
+        <w:rPr>
+          <w:b/>
+          <w:bCs/>
+          <w:sz w:val="32"/>
+          <w:szCs w:val="32"/>
+          <w:lang w:val="en-HK"/>
+        </w:rPr>
+      </w:pPr>
+      <w:r>
+        <w:rPr>
+          <w:b/>
+          <w:bCs/>
+          <w:sz w:val="32"/>
+          <w:szCs w:val="32"/>
+          <w:lang w:val="en-HK"/>
+        </w:rPr>
+        <w:t>Forward P/E Ratio</w:t>
+      </w:r>
+    </w:p>
+    <w:p>
+      <w:pPr>
+        <w:widowControl/>
+        <w:numPr>
+          <w:ilvl w:val="0"/>
+          <w:numId w:val="10"/>
+        </w:numPr>
+        <w:jc w:val="left"/>
+        <w:rPr>
+          <w:lang w:val="en-HK"/>
+        </w:rPr>
+      </w:pPr>
+      <w:r>
+        <w:rPr>
+          <w:b/>
+          <w:bCs/>
+          <w:lang w:val="en-HK"/>
+        </w:rPr>
+        <w:t>Definition</w:t>
+      </w:r>
+      <w:r>
+        <w:rPr>
+          <w:lang w:val="en-HK"/>
+        </w:rPr>
+        <w:t>: This ratio uses estimated future EPS, typically for the next 12 months.</w:t>
+      </w:r>
+    </w:p>
+    <w:p>
+      <w:pPr>
+        <w:widowControl/>
+        <w:numPr>
+          <w:ilvl w:val="0"/>
+          <w:numId w:val="10"/>
+        </w:numPr>
+        <w:jc w:val="left"/>
+        <w:rPr>
+          <w:lang w:val="en-HK"/>
+        </w:rPr>
+      </w:pPr>
+      <w:r>
+        <w:rPr>
+          <w:b/>
+          <w:bCs/>
+          <w:lang w:val="en-HK"/>
+        </w:rPr>
+        <w:t>Pros</w:t>
+      </w:r>
+      <w:r>
+        <w:rPr>
+          <w:lang w:val="en-HK"/>
+        </w:rPr>
+        <w:t>:</w:t>
+      </w:r>
+    </w:p>
+    <w:p>
+      <w:pPr>
+        <w:widowControl/>
+        <w:numPr>
+          <w:ilvl w:val="1"/>
+          <w:numId w:val="10"/>
+        </w:numPr>
+        <w:jc w:val="left"/>
+        <w:rPr>
+          <w:lang w:val="en-HK"/>
+        </w:rPr>
+      </w:pPr>
+      <w:r>
+        <w:rPr>
+          <w:lang w:val="en-HK"/>
+        </w:rPr>
+        <w:t>Reflects analysts’ expectations for future growth, making it useful for growth-oriented investors.</w:t>
+      </w:r>
+    </w:p>
+    <w:p>
+      <w:pPr>
+        <w:widowControl/>
+        <w:numPr>
+          <w:ilvl w:val="1"/>
+          <w:numId w:val="10"/>
+        </w:numPr>
+        <w:jc w:val="left"/>
+        <w:rPr>
+          <w:lang w:val="en-HK"/>
+        </w:rPr>
+      </w:pPr>
+      <w:r>
+        <w:rPr>
+          <w:lang w:val="en-HK"/>
+        </w:rPr>
+        <w:t>Can provide a more forward-looking perspective on a company’s valuation.</w:t>
+      </w:r>
+    </w:p>
+    <w:p>
+      <w:pPr>
+        <w:widowControl/>
+        <w:numPr>
+          <w:ilvl w:val="0"/>
+          <w:numId w:val="10"/>
+        </w:numPr>
+        <w:jc w:val="left"/>
+        <w:rPr>
+          <w:lang w:val="en-HK"/>
+        </w:rPr>
+      </w:pPr>
+      <w:r>
+        <w:rPr>
+          <w:b/>
+          <w:bCs/>
+          <w:lang w:val="en-HK"/>
+        </w:rPr>
+        <w:t>Cons</w:t>
+      </w:r>
+      <w:r>
+        <w:rPr>
+          <w:lang w:val="en-HK"/>
+        </w:rPr>
+        <w:t>:</w:t>
+      </w:r>
+    </w:p>
+    <w:p>
+      <w:pPr>
+        <w:widowControl/>
+        <w:numPr>
+          <w:ilvl w:val="1"/>
+          <w:numId w:val="10"/>
+        </w:numPr>
+        <w:jc w:val="left"/>
+        <w:rPr>
+          <w:lang w:val="en-HK"/>
+        </w:rPr>
+      </w:pPr>
+      <w:r>
+        <w:rPr>
+          <w:lang w:val="en-HK"/>
+        </w:rPr>
+        <w:t>Based on estimates, which can be inaccurate or overly optimistic.</w:t>
+      </w:r>
+    </w:p>
+    <w:p>
+      <w:pPr>
+        <w:widowControl/>
+        <w:numPr>
+          <w:ilvl w:val="1"/>
+          <w:numId w:val="10"/>
+        </w:numPr>
+        <w:jc w:val="left"/>
+        <w:rPr>
+          <w:lang w:val="en-HK"/>
+        </w:rPr>
+      </w:pPr>
+      <w:r>
+        <w:rPr>
+          <w:lang w:val="en-HK"/>
+        </w:rPr>
+        <w:t>Subject to change as new information becomes available.</w:t>
+      </w:r>
+    </w:p>
+    <w:p>
+      <w:pPr>
+        <w:widowControl/>
+        <w:ind w:left="1080"/>
+        <w:jc w:val="left"/>
+        <w:rPr>
+          <w:lang w:val="en-HK"/>
+        </w:rPr>
+      </w:pPr>
+    </w:p>
+    <w:p>
+      <w:pPr>
+        <w:widowControl/>
+        <w:jc w:val="left"/>
+        <w:rPr>
+          <w:b/>
+          <w:bCs/>
+          <w:sz w:val="32"/>
+          <w:szCs w:val="32"/>
+          <w:lang w:val="en-HK"/>
+        </w:rPr>
+      </w:pPr>
+      <w:r>
+        <w:rPr>
+          <w:b/>
+          <w:bCs/>
+          <w:sz w:val="32"/>
+          <w:szCs w:val="32"/>
+          <w:lang w:val="en-HK"/>
+        </w:rPr>
+        <w:t>Which One to Use?</w:t>
+      </w:r>
+    </w:p>
+    <w:p>
+      <w:pPr>
+        <w:widowControl/>
+        <w:numPr>
+          <w:ilvl w:val="0"/>
+          <w:numId w:val="11"/>
+        </w:numPr>
+        <w:jc w:val="left"/>
+        <w:rPr>
+          <w:lang w:val="en-HK"/>
+        </w:rPr>
+      </w:pPr>
+      <w:r>
+        <w:rPr>
+          <w:b/>
+          <w:bCs/>
+          <w:lang w:val="en-HK"/>
+        </w:rPr>
+        <w:t>Growth Investors</w:t>
+      </w:r>
+      <w:r>
+        <w:rPr>
+          <w:lang w:val="en-HK"/>
+        </w:rPr>
+        <w:t>: If you’re focused on future growth and potential, the forward P/E ratio might be more relevant.</w:t>
+      </w:r>
+    </w:p>
+    <w:p>
+      <w:pPr>
+        <w:widowControl/>
+        <w:numPr>
+          <w:ilvl w:val="0"/>
+          <w:numId w:val="11"/>
+        </w:numPr>
+        <w:jc w:val="left"/>
+        <w:rPr>
+          <w:lang w:val="en-HK"/>
+        </w:rPr>
+      </w:pPr>
+      <w:r>
+        <w:rPr>
+          <w:b/>
+          <w:bCs/>
+          <w:lang w:val="en-HK"/>
+        </w:rPr>
+        <w:t>Value Investors</w:t>
+      </w:r>
+      <w:r>
+        <w:rPr>
+          <w:lang w:val="en-HK"/>
+        </w:rPr>
+        <w:t>: If you prefer to base your decisions on historical performance and current valuation, the trailing P/E ratio could be more useful.</w:t>
+      </w:r>
+    </w:p>
+    <w:p>
+      <w:pPr>
+        <w:widowControl/>
+        <w:numPr>
+          <w:ilvl w:val="0"/>
+          <w:numId w:val="11"/>
+        </w:numPr>
+        <w:jc w:val="left"/>
+        <w:rPr>
+          <w:lang w:val="en-HK"/>
+        </w:rPr>
+      </w:pPr>
+      <w:r>
+        <w:rPr>
+          <w:b/>
+          <w:bCs/>
+          <w:lang w:val="en-HK"/>
+        </w:rPr>
+        <w:t>Balanced Approach</w:t>
+      </w:r>
+      <w:r>
+        <w:rPr>
+          <w:lang w:val="en-HK"/>
+        </w:rPr>
+        <w:t>: Many investors look at both ratios to get a comprehensive view of a company’s valuation and potential.</w:t>
+      </w:r>
+    </w:p>
+    <w:p>
+      <w:pPr>
+        <w:widowControl/>
+        <w:jc w:val="left"/>
+        <w:rPr>
+          <w:b/>
+          <w:sz w:val="32"/>
+        </w:rPr>
+      </w:pPr>
+      <w:r>
+        <w:br w:type="page"/>
+      </w:r>
+    </w:p>
     <w:p>
       <w:pPr>
         <w:pStyle w:val="Heading3"/>
       </w:pPr>
       <w:r>
+        <w:lastRenderedPageBreak/>
         <w:t>Price/Sales (PS)</w:t>
       </w:r>
     </w:p>
@@ -866,11 +1306,7 @@
     <w:p/>
     <w:p>
       <w:r>
-        <w:t xml:space="preserve">The typical 12-month period used for sales in the P/S ratio is generally the past four quarters (also </w:t>
-      </w:r>
-      <w:r>
-        <w:lastRenderedPageBreak/>
-        <w:t>called trailing 12 months or TTM), or the most recent or current fiscal year (FY). A P/S ratio that is based on the forecast sales for the current year is called a forward P/S ratio.</w:t>
+        <w:t>The typical 12-month period used for sales in the P/S ratio is generally the past four quarters (also called trailing 12 months or TTM), or the most recent or current fiscal year (FY). A P/S ratio that is based on the forecast sales for the current year is called a forward P/S ratio.</w:t>
       </w:r>
       <w:r>
         <w:t xml:space="preserve">  </w:t>
@@ -931,15 +1367,14 @@
       </w:r>
     </w:p>
     <w:p/>
+    <w:p/>
     <w:p>
       <w:r>
         <w:t xml:space="preserve">As an example, consider the quarterly sales for Acme Co. shown in the table below. The sales for fiscal year 1 (FY1) are actual sales, while sales for FY2 are </w:t>
       </w:r>
-      <w:proofErr w:type="gramStart"/>
-      <w:r>
-        <w:t>analysts</w:t>
-      </w:r>
-      <w:proofErr w:type="gramEnd"/>
+      <w:r>
+        <w:t>analysts’</w:t>
+      </w:r>
       <w:r>
         <w:t xml:space="preserve"> average forecasts (assume that we are currently in the first quarter of Q1 of F2). Acme has 100 million outstanding, with the shares presently trading at $10 per share. </w:t>
       </w:r>
@@ -1362,7 +1797,17 @@
     </w:p>
     <w:p/>
     <w:p>
-      <w:r>
+      <w:pPr>
+        <w:widowControl/>
+        <w:jc w:val="left"/>
+      </w:pPr>
+      <w:r>
+        <w:br w:type="page"/>
+      </w:r>
+    </w:p>
+    <w:p>
+      <w:r>
+        <w:lastRenderedPageBreak/>
         <w:t xml:space="preserve">If Acme’s peers, which is assume are based in the same sector and are of similar size in terms of market capitalization, are trading at an average P/S ratio (TTM) of 1.5, compared with Acme’s 2.2, it suggests a premium valuation for the company, because the P/S ratio of Acme is higher than </w:t>
       </w:r>
       <w:r>
@@ -1372,15 +1817,7 @@
         <w:t xml:space="preserve"> peers.</w:t>
       </w:r>
       <w:r>
-        <w:t xml:space="preserve"> Then a question will be asked, will you still be interested in buying this stock? The answer will be yes. Acme P/S forecast ratio is 1.92 which is still lower than its trailing P/S ratio 2.2. By </w:t>
-      </w:r>
-      <w:proofErr w:type="gramStart"/>
-      <w:r>
-        <w:t>calculating;</w:t>
-      </w:r>
-      <w:proofErr w:type="gramEnd"/>
-      <w:r>
-        <w:t xml:space="preserve"> (($520 minus $455) / $455) x 100%, there will this has an 14.3% revenue growth that Acme is expected to post in the current fiscal year. </w:t>
+        <w:t xml:space="preserve"> Then a question will be asked, will you still be interested in buying this stock? The answer will be yes. Acme P/S forecast ratio is 1.92 which is still lower than its trailing P/S ratio 2.2. By calculating; (($520 minus $455) / $455) x 100%, there will this has an 14.3% revenue growth that Acme is expected to post in the current fiscal year. </w:t>
       </w:r>
     </w:p>
     <w:p>
@@ -1393,15 +1830,7 @@
     </w:p>
     <w:p>
       <w:r>
-        <w:t xml:space="preserve">The P/S ratio doesn’t </w:t>
-      </w:r>
-      <w:proofErr w:type="gramStart"/>
-      <w:r>
-        <w:t>take into account</w:t>
-      </w:r>
-      <w:proofErr w:type="gramEnd"/>
-      <w:r>
-        <w:t xml:space="preserve"> whether the company makes any earnings or whether it will ever make earnings. Comparing companies in different industries can prove difficult as well. For example, companies that make video games will have different capabilities when it comes to turning sales into profits when compared to, say, grocery retailers. In addition, P/S ratios do not account for debt loads or the status of a company’s balance sheet. </w:t>
+        <w:t xml:space="preserve">The P/S ratio doesn’t take into account whether the company makes any earnings or whether it will ever make earnings. Comparing companies in different industries can prove difficult as well. For example, companies that make video games will have different capabilities when it comes to turning sales into profits when compared to, say, grocery retailers. In addition, P/S ratios do not account for debt loads or the status of a company’s balance sheet. </w:t>
       </w:r>
     </w:p>
     <w:p>
@@ -1409,7 +1838,6 @@
         <w:pStyle w:val="Heading3"/>
       </w:pPr>
       <w:r>
-        <w:lastRenderedPageBreak/>
         <w:t>Price/Book (PB)</w:t>
       </w:r>
     </w:p>
@@ -1437,7 +1865,7 @@
 </file>
 
 <file path=word/numbering.xml><?xml version="1.0" encoding="utf-8"?>
-<w:numbering xmlns:wpc="http://schemas.microsoft.com/office/word/2010/wordprocessingCanvas" xmlns:cx="http://schemas.microsoft.com/office/drawing/2014/chartex" xmlns:cx1="http://schemas.microsoft.com/office/drawing/2015/9/8/chartex" xmlns:cx2="http://schemas.microsoft.com/office/drawing/2015/10/21/chartex" xmlns:cx3="http://schemas.microsoft.com/office/drawing/2016/5/9/chartex" xmlns:cx4="http://schemas.microsoft.com/office/drawing/2016/5/10/chartex" xmlns:cx5="http://schemas.microsoft.com/office/drawing/2016/5/11/chartex" xmlns:cx6="http://schemas.microsoft.com/office/drawing/2016/5/12/chartex" xmlns:cx7="http://schemas.microsoft.com/office/drawing/2016/5/13/chartex" xmlns:cx8="http://schemas.microsoft.com/office/drawing/2016/5/14/chartex" xmlns:mc="http://schemas.openxmlformats.org/markup-compatibility/2006" xmlns:aink="http://schemas.microsoft.com/office/drawing/2016/ink" xmlns:am3d="http://schemas.microsoft.com/office/drawing/2017/model3d" xmlns:o="urn:schemas-microsoft-com:office:office" xmlns:oel="http://schemas.microsoft.com/office/2019/extlst" xmlns:r="http://schemas.openxmlformats.org/officeDocument/2006/relationships" xmlns:m="http://schemas.openxmlformats.org/officeDocument/2006/math" xmlns:v="urn:schemas-microsoft-com:vml" xmlns:wp14="http://schemas.microsoft.com/office/word/2010/wordprocessingDrawing" xmlns:wp="http://schemas.openxmlformats.org/drawingml/2006/wordprocessingDrawing" xmlns:w10="urn:schemas-microsoft-com:office:word" xmlns:w="http://schemas.openxmlformats.org/wordprocessingml/2006/main" xmlns:w14="http://schemas.microsoft.com/office/word/2010/wordml" xmlns:w15="http://schemas.microsoft.com/office/word/2012/wordml" xmlns:w16cex="http://schemas.microsoft.com/office/word/2018/wordml/cex" xmlns:w16cid="http://schemas.microsoft.com/office/word/2016/wordml/cid" xmlns:w16="http://schemas.microsoft.com/office/word/2018/wordml" xmlns:w16sdtdh="http://schemas.microsoft.com/office/word/2020/wordml/sdtdatahash" xmlns:w16se="http://schemas.microsoft.com/office/word/2015/wordml/symex" xmlns:wpg="http://schemas.microsoft.com/office/word/2010/wordprocessingGroup" xmlns:wpi="http://schemas.microsoft.com/office/word/2010/wordprocessingInk" xmlns:wne="http://schemas.microsoft.com/office/word/2006/wordml" xmlns:wps="http://schemas.microsoft.com/office/word/2010/wordprocessingShape" mc:Ignorable="w14 w15 w16se w16cid w16 w16cex w16sdtdh wp14">
+<w:numbering xmlns:wpc="http://schemas.microsoft.com/office/word/2010/wordprocessingCanvas" xmlns:cx="http://schemas.microsoft.com/office/drawing/2014/chartex" xmlns:cx1="http://schemas.microsoft.com/office/drawing/2015/9/8/chartex" xmlns:cx2="http://schemas.microsoft.com/office/drawing/2015/10/21/chartex" xmlns:cx3="http://schemas.microsoft.com/office/drawing/2016/5/9/chartex" xmlns:cx4="http://schemas.microsoft.com/office/drawing/2016/5/10/chartex" xmlns:cx5="http://schemas.microsoft.com/office/drawing/2016/5/11/chartex" xmlns:cx6="http://schemas.microsoft.com/office/drawing/2016/5/12/chartex" xmlns:cx7="http://schemas.microsoft.com/office/drawing/2016/5/13/chartex" xmlns:cx8="http://schemas.microsoft.com/office/drawing/2016/5/14/chartex" xmlns:mc="http://schemas.openxmlformats.org/markup-compatibility/2006" xmlns:aink="http://schemas.microsoft.com/office/drawing/2016/ink" xmlns:am3d="http://schemas.microsoft.com/office/drawing/2017/model3d" xmlns:o="urn:schemas-microsoft-com:office:office" xmlns:oel="http://schemas.microsoft.com/office/2019/extlst" xmlns:r="http://schemas.openxmlformats.org/officeDocument/2006/relationships" xmlns:m="http://schemas.openxmlformats.org/officeDocument/2006/math" xmlns:v="urn:schemas-microsoft-com:vml" xmlns:wp14="http://schemas.microsoft.com/office/word/2010/wordprocessingDrawing" xmlns:wp="http://schemas.openxmlformats.org/drawingml/2006/wordprocessingDrawing" xmlns:w10="urn:schemas-microsoft-com:office:word" xmlns:w="http://schemas.openxmlformats.org/wordprocessingml/2006/main" xmlns:w14="http://schemas.microsoft.com/office/word/2010/wordml" xmlns:w15="http://schemas.microsoft.com/office/word/2012/wordml" xmlns:w16cex="http://schemas.microsoft.com/office/word/2018/wordml/cex" xmlns:w16cid="http://schemas.microsoft.com/office/word/2016/wordml/cid" xmlns:w16="http://schemas.microsoft.com/office/word/2018/wordml" xmlns:w16du="http://schemas.microsoft.com/office/word/2023/wordml/word16du" xmlns:w16sdtdh="http://schemas.microsoft.com/office/word/2020/wordml/sdtdatahash" xmlns:w16se="http://schemas.microsoft.com/office/word/2015/wordml/symex" xmlns:wpg="http://schemas.microsoft.com/office/word/2010/wordprocessingGroup" xmlns:wpi="http://schemas.microsoft.com/office/word/2010/wordprocessingInk" xmlns:wne="http://schemas.microsoft.com/office/word/2006/wordml" xmlns:wps="http://schemas.microsoft.com/office/word/2010/wordprocessingShape" mc:Ignorable="w14 w15 w16se w16cid w16 w16cex w16sdtdh w16du wp14">
   <w:abstractNum w:abstractNumId="0" w15:restartNumberingAfterBreak="0">
     <w:nsid w:val="81B46C8C"/>
     <w:multiLevelType w:val="singleLevel"/>
@@ -1473,6 +1901,155 @@
     </w:lvl>
   </w:abstractNum>
   <w:abstractNum w:abstractNumId="2" w15:restartNumberingAfterBreak="0">
+    <w:nsid w:val="07336D60"/>
+    <w:multiLevelType w:val="multilevel"/>
+    <w:tmpl w:val="A748253A"/>
+    <w:lvl w:ilvl="0">
+      <w:start w:val="1"/>
+      <w:numFmt w:val="bullet"/>
+      <w:lvlText w:val=""/>
+      <w:lvlJc w:val="left"/>
+      <w:pPr>
+        <w:tabs>
+          <w:tab w:val="num" w:pos="720"/>
+        </w:tabs>
+        <w:ind w:left="720" w:hanging="360"/>
+      </w:pPr>
+      <w:rPr>
+        <w:rFonts w:ascii="Symbol" w:hAnsi="Symbol" w:hint="default"/>
+        <w:sz w:val="20"/>
+      </w:rPr>
+    </w:lvl>
+    <w:lvl w:ilvl="1">
+      <w:start w:val="1"/>
+      <w:numFmt w:val="bullet"/>
+      <w:lvlText w:val="o"/>
+      <w:lvlJc w:val="left"/>
+      <w:pPr>
+        <w:tabs>
+          <w:tab w:val="num" w:pos="1440"/>
+        </w:tabs>
+        <w:ind w:left="1440" w:hanging="360"/>
+      </w:pPr>
+      <w:rPr>
+        <w:rFonts w:ascii="Courier New" w:hAnsi="Courier New" w:hint="default"/>
+        <w:sz w:val="20"/>
+      </w:rPr>
+    </w:lvl>
+    <w:lvl w:ilvl="2" w:tentative="1">
+      <w:start w:val="1"/>
+      <w:numFmt w:val="bullet"/>
+      <w:lvlText w:val=""/>
+      <w:lvlJc w:val="left"/>
+      <w:pPr>
+        <w:tabs>
+          <w:tab w:val="num" w:pos="2160"/>
+        </w:tabs>
+        <w:ind w:left="2160" w:hanging="360"/>
+      </w:pPr>
+      <w:rPr>
+        <w:rFonts w:ascii="Wingdings" w:hAnsi="Wingdings" w:hint="default"/>
+        <w:sz w:val="20"/>
+      </w:rPr>
+    </w:lvl>
+    <w:lvl w:ilvl="3" w:tentative="1">
+      <w:start w:val="1"/>
+      <w:numFmt w:val="bullet"/>
+      <w:lvlText w:val=""/>
+      <w:lvlJc w:val="left"/>
+      <w:pPr>
+        <w:tabs>
+          <w:tab w:val="num" w:pos="2880"/>
+        </w:tabs>
+        <w:ind w:left="2880" w:hanging="360"/>
+      </w:pPr>
+      <w:rPr>
+        <w:rFonts w:ascii="Wingdings" w:hAnsi="Wingdings" w:hint="default"/>
+        <w:sz w:val="20"/>
+      </w:rPr>
+    </w:lvl>
+    <w:lvl w:ilvl="4" w:tentative="1">
+      <w:start w:val="1"/>
+      <w:numFmt w:val="bullet"/>
+      <w:lvlText w:val=""/>
+      <w:lvlJc w:val="left"/>
+      <w:pPr>
+        <w:tabs>
+          <w:tab w:val="num" w:pos="3600"/>
+        </w:tabs>
+        <w:ind w:left="3600" w:hanging="360"/>
+      </w:pPr>
+      <w:rPr>
+        <w:rFonts w:ascii="Wingdings" w:hAnsi="Wingdings" w:hint="default"/>
+        <w:sz w:val="20"/>
+      </w:rPr>
+    </w:lvl>
+    <w:lvl w:ilvl="5" w:tentative="1">
+      <w:start w:val="1"/>
+      <w:numFmt w:val="bullet"/>
+      <w:lvlText w:val=""/>
+      <w:lvlJc w:val="left"/>
+      <w:pPr>
+        <w:tabs>
+          <w:tab w:val="num" w:pos="4320"/>
+        </w:tabs>
+        <w:ind w:left="4320" w:hanging="360"/>
+      </w:pPr>
+      <w:rPr>
+        <w:rFonts w:ascii="Wingdings" w:hAnsi="Wingdings" w:hint="default"/>
+        <w:sz w:val="20"/>
+      </w:rPr>
+    </w:lvl>
+    <w:lvl w:ilvl="6" w:tentative="1">
+      <w:start w:val="1"/>
+      <w:numFmt w:val="bullet"/>
+      <w:lvlText w:val=""/>
+      <w:lvlJc w:val="left"/>
+      <w:pPr>
+        <w:tabs>
+          <w:tab w:val="num" w:pos="5040"/>
+        </w:tabs>
+        <w:ind w:left="5040" w:hanging="360"/>
+      </w:pPr>
+      <w:rPr>
+        <w:rFonts w:ascii="Wingdings" w:hAnsi="Wingdings" w:hint="default"/>
+        <w:sz w:val="20"/>
+      </w:rPr>
+    </w:lvl>
+    <w:lvl w:ilvl="7" w:tentative="1">
+      <w:start w:val="1"/>
+      <w:numFmt w:val="bullet"/>
+      <w:lvlText w:val=""/>
+      <w:lvlJc w:val="left"/>
+      <w:pPr>
+        <w:tabs>
+          <w:tab w:val="num" w:pos="5760"/>
+        </w:tabs>
+        <w:ind w:left="5760" w:hanging="360"/>
+      </w:pPr>
+      <w:rPr>
+        <w:rFonts w:ascii="Wingdings" w:hAnsi="Wingdings" w:hint="default"/>
+        <w:sz w:val="20"/>
+      </w:rPr>
+    </w:lvl>
+    <w:lvl w:ilvl="8" w:tentative="1">
+      <w:start w:val="1"/>
+      <w:numFmt w:val="bullet"/>
+      <w:lvlText w:val=""/>
+      <w:lvlJc w:val="left"/>
+      <w:pPr>
+        <w:tabs>
+          <w:tab w:val="num" w:pos="6480"/>
+        </w:tabs>
+        <w:ind w:left="6480" w:hanging="360"/>
+      </w:pPr>
+      <w:rPr>
+        <w:rFonts w:ascii="Wingdings" w:hAnsi="Wingdings" w:hint="default"/>
+        <w:sz w:val="20"/>
+      </w:rPr>
+    </w:lvl>
+  </w:abstractNum>
+  <w:abstractNum w:abstractNumId="3" w15:restartNumberingAfterBreak="0">
     <w:nsid w:val="0EE50C51"/>
     <w:multiLevelType w:val="hybridMultilevel"/>
     <w:tmpl w:val="3DEAB88C"/>
@@ -1585,7 +2162,156 @@
       </w:rPr>
     </w:lvl>
   </w:abstractNum>
-  <w:abstractNum w:abstractNumId="3" w15:restartNumberingAfterBreak="0">
+  <w:abstractNum w:abstractNumId="4" w15:restartNumberingAfterBreak="0">
+    <w:nsid w:val="15587880"/>
+    <w:multiLevelType w:val="multilevel"/>
+    <w:tmpl w:val="174867D8"/>
+    <w:lvl w:ilvl="0">
+      <w:start w:val="1"/>
+      <w:numFmt w:val="bullet"/>
+      <w:lvlText w:val=""/>
+      <w:lvlJc w:val="left"/>
+      <w:pPr>
+        <w:tabs>
+          <w:tab w:val="num" w:pos="720"/>
+        </w:tabs>
+        <w:ind w:left="720" w:hanging="360"/>
+      </w:pPr>
+      <w:rPr>
+        <w:rFonts w:ascii="Symbol" w:hAnsi="Symbol" w:hint="default"/>
+        <w:sz w:val="20"/>
+      </w:rPr>
+    </w:lvl>
+    <w:lvl w:ilvl="1" w:tentative="1">
+      <w:start w:val="1"/>
+      <w:numFmt w:val="bullet"/>
+      <w:lvlText w:val="o"/>
+      <w:lvlJc w:val="left"/>
+      <w:pPr>
+        <w:tabs>
+          <w:tab w:val="num" w:pos="1440"/>
+        </w:tabs>
+        <w:ind w:left="1440" w:hanging="360"/>
+      </w:pPr>
+      <w:rPr>
+        <w:rFonts w:ascii="Courier New" w:hAnsi="Courier New" w:hint="default"/>
+        <w:sz w:val="20"/>
+      </w:rPr>
+    </w:lvl>
+    <w:lvl w:ilvl="2" w:tentative="1">
+      <w:start w:val="1"/>
+      <w:numFmt w:val="bullet"/>
+      <w:lvlText w:val=""/>
+      <w:lvlJc w:val="left"/>
+      <w:pPr>
+        <w:tabs>
+          <w:tab w:val="num" w:pos="2160"/>
+        </w:tabs>
+        <w:ind w:left="2160" w:hanging="360"/>
+      </w:pPr>
+      <w:rPr>
+        <w:rFonts w:ascii="Wingdings" w:hAnsi="Wingdings" w:hint="default"/>
+        <w:sz w:val="20"/>
+      </w:rPr>
+    </w:lvl>
+    <w:lvl w:ilvl="3" w:tentative="1">
+      <w:start w:val="1"/>
+      <w:numFmt w:val="bullet"/>
+      <w:lvlText w:val=""/>
+      <w:lvlJc w:val="left"/>
+      <w:pPr>
+        <w:tabs>
+          <w:tab w:val="num" w:pos="2880"/>
+        </w:tabs>
+        <w:ind w:left="2880" w:hanging="360"/>
+      </w:pPr>
+      <w:rPr>
+        <w:rFonts w:ascii="Wingdings" w:hAnsi="Wingdings" w:hint="default"/>
+        <w:sz w:val="20"/>
+      </w:rPr>
+    </w:lvl>
+    <w:lvl w:ilvl="4" w:tentative="1">
+      <w:start w:val="1"/>
+      <w:numFmt w:val="bullet"/>
+      <w:lvlText w:val=""/>
+      <w:lvlJc w:val="left"/>
+      <w:pPr>
+        <w:tabs>
+          <w:tab w:val="num" w:pos="3600"/>
+        </w:tabs>
+        <w:ind w:left="3600" w:hanging="360"/>
+      </w:pPr>
+      <w:rPr>
+        <w:rFonts w:ascii="Wingdings" w:hAnsi="Wingdings" w:hint="default"/>
+        <w:sz w:val="20"/>
+      </w:rPr>
+    </w:lvl>
+    <w:lvl w:ilvl="5" w:tentative="1">
+      <w:start w:val="1"/>
+      <w:numFmt w:val="bullet"/>
+      <w:lvlText w:val=""/>
+      <w:lvlJc w:val="left"/>
+      <w:pPr>
+        <w:tabs>
+          <w:tab w:val="num" w:pos="4320"/>
+        </w:tabs>
+        <w:ind w:left="4320" w:hanging="360"/>
+      </w:pPr>
+      <w:rPr>
+        <w:rFonts w:ascii="Wingdings" w:hAnsi="Wingdings" w:hint="default"/>
+        <w:sz w:val="20"/>
+      </w:rPr>
+    </w:lvl>
+    <w:lvl w:ilvl="6" w:tentative="1">
+      <w:start w:val="1"/>
+      <w:numFmt w:val="bullet"/>
+      <w:lvlText w:val=""/>
+      <w:lvlJc w:val="left"/>
+      <w:pPr>
+        <w:tabs>
+          <w:tab w:val="num" w:pos="5040"/>
+        </w:tabs>
+        <w:ind w:left="5040" w:hanging="360"/>
+      </w:pPr>
+      <w:rPr>
+        <w:rFonts w:ascii="Wingdings" w:hAnsi="Wingdings" w:hint="default"/>
+        <w:sz w:val="20"/>
+      </w:rPr>
+    </w:lvl>
+    <w:lvl w:ilvl="7" w:tentative="1">
+      <w:start w:val="1"/>
+      <w:numFmt w:val="bullet"/>
+      <w:lvlText w:val=""/>
+      <w:lvlJc w:val="left"/>
+      <w:pPr>
+        <w:tabs>
+          <w:tab w:val="num" w:pos="5760"/>
+        </w:tabs>
+        <w:ind w:left="5760" w:hanging="360"/>
+      </w:pPr>
+      <w:rPr>
+        <w:rFonts w:ascii="Wingdings" w:hAnsi="Wingdings" w:hint="default"/>
+        <w:sz w:val="20"/>
+      </w:rPr>
+    </w:lvl>
+    <w:lvl w:ilvl="8" w:tentative="1">
+      <w:start w:val="1"/>
+      <w:numFmt w:val="bullet"/>
+      <w:lvlText w:val=""/>
+      <w:lvlJc w:val="left"/>
+      <w:pPr>
+        <w:tabs>
+          <w:tab w:val="num" w:pos="6480"/>
+        </w:tabs>
+        <w:ind w:left="6480" w:hanging="360"/>
+      </w:pPr>
+      <w:rPr>
+        <w:rFonts w:ascii="Wingdings" w:hAnsi="Wingdings" w:hint="default"/>
+        <w:sz w:val="20"/>
+      </w:rPr>
+    </w:lvl>
+  </w:abstractNum>
+  <w:abstractNum w:abstractNumId="5" w15:restartNumberingAfterBreak="0">
     <w:nsid w:val="1EA37AF4"/>
     <w:multiLevelType w:val="hybridMultilevel"/>
     <w:tmpl w:val="7DC2D9A2"/>
@@ -1698,7 +2424,7 @@
       </w:rPr>
     </w:lvl>
   </w:abstractNum>
-  <w:abstractNum w:abstractNumId="4" w15:restartNumberingAfterBreak="0">
+  <w:abstractNum w:abstractNumId="6" w15:restartNumberingAfterBreak="0">
     <w:nsid w:val="3EEFADBF"/>
     <w:multiLevelType w:val="singleLevel"/>
     <w:tmpl w:val="3EEFADBF"/>
@@ -1715,7 +2441,7 @@
       </w:rPr>
     </w:lvl>
   </w:abstractNum>
-  <w:abstractNum w:abstractNumId="5" w15:restartNumberingAfterBreak="0">
+  <w:abstractNum w:abstractNumId="7" w15:restartNumberingAfterBreak="0">
     <w:nsid w:val="4DD66339"/>
     <w:multiLevelType w:val="hybridMultilevel"/>
     <w:tmpl w:val="9890303E"/>
@@ -1828,7 +2554,7 @@
       </w:rPr>
     </w:lvl>
   </w:abstractNum>
-  <w:abstractNum w:abstractNumId="6" w15:restartNumberingAfterBreak="0">
+  <w:abstractNum w:abstractNumId="8" w15:restartNumberingAfterBreak="0">
     <w:nsid w:val="54021AC3"/>
     <w:multiLevelType w:val="hybridMultilevel"/>
     <w:tmpl w:val="DDB03ED4"/>
@@ -1941,7 +2667,7 @@
       </w:rPr>
     </w:lvl>
   </w:abstractNum>
-  <w:abstractNum w:abstractNumId="7" w15:restartNumberingAfterBreak="0">
+  <w:abstractNum w:abstractNumId="9" w15:restartNumberingAfterBreak="0">
     <w:nsid w:val="56306776"/>
     <w:multiLevelType w:val="singleLevel"/>
     <w:tmpl w:val="56306776"/>
@@ -1958,35 +2684,193 @@
       </w:rPr>
     </w:lvl>
   </w:abstractNum>
+  <w:abstractNum w:abstractNumId="10" w15:restartNumberingAfterBreak="0">
+    <w:nsid w:val="666330D6"/>
+    <w:multiLevelType w:val="multilevel"/>
+    <w:tmpl w:val="5CE66DFA"/>
+    <w:lvl w:ilvl="0">
+      <w:start w:val="1"/>
+      <w:numFmt w:val="bullet"/>
+      <w:lvlText w:val=""/>
+      <w:lvlJc w:val="left"/>
+      <w:pPr>
+        <w:tabs>
+          <w:tab w:val="num" w:pos="720"/>
+        </w:tabs>
+        <w:ind w:left="720" w:hanging="360"/>
+      </w:pPr>
+      <w:rPr>
+        <w:rFonts w:ascii="Symbol" w:hAnsi="Symbol" w:hint="default"/>
+        <w:sz w:val="20"/>
+      </w:rPr>
+    </w:lvl>
+    <w:lvl w:ilvl="1">
+      <w:start w:val="1"/>
+      <w:numFmt w:val="bullet"/>
+      <w:lvlText w:val="o"/>
+      <w:lvlJc w:val="left"/>
+      <w:pPr>
+        <w:tabs>
+          <w:tab w:val="num" w:pos="1440"/>
+        </w:tabs>
+        <w:ind w:left="1440" w:hanging="360"/>
+      </w:pPr>
+      <w:rPr>
+        <w:rFonts w:ascii="Courier New" w:hAnsi="Courier New" w:hint="default"/>
+        <w:sz w:val="20"/>
+      </w:rPr>
+    </w:lvl>
+    <w:lvl w:ilvl="2" w:tentative="1">
+      <w:start w:val="1"/>
+      <w:numFmt w:val="bullet"/>
+      <w:lvlText w:val=""/>
+      <w:lvlJc w:val="left"/>
+      <w:pPr>
+        <w:tabs>
+          <w:tab w:val="num" w:pos="2160"/>
+        </w:tabs>
+        <w:ind w:left="2160" w:hanging="360"/>
+      </w:pPr>
+      <w:rPr>
+        <w:rFonts w:ascii="Wingdings" w:hAnsi="Wingdings" w:hint="default"/>
+        <w:sz w:val="20"/>
+      </w:rPr>
+    </w:lvl>
+    <w:lvl w:ilvl="3" w:tentative="1">
+      <w:start w:val="1"/>
+      <w:numFmt w:val="bullet"/>
+      <w:lvlText w:val=""/>
+      <w:lvlJc w:val="left"/>
+      <w:pPr>
+        <w:tabs>
+          <w:tab w:val="num" w:pos="2880"/>
+        </w:tabs>
+        <w:ind w:left="2880" w:hanging="360"/>
+      </w:pPr>
+      <w:rPr>
+        <w:rFonts w:ascii="Wingdings" w:hAnsi="Wingdings" w:hint="default"/>
+        <w:sz w:val="20"/>
+      </w:rPr>
+    </w:lvl>
+    <w:lvl w:ilvl="4" w:tentative="1">
+      <w:start w:val="1"/>
+      <w:numFmt w:val="bullet"/>
+      <w:lvlText w:val=""/>
+      <w:lvlJc w:val="left"/>
+      <w:pPr>
+        <w:tabs>
+          <w:tab w:val="num" w:pos="3600"/>
+        </w:tabs>
+        <w:ind w:left="3600" w:hanging="360"/>
+      </w:pPr>
+      <w:rPr>
+        <w:rFonts w:ascii="Wingdings" w:hAnsi="Wingdings" w:hint="default"/>
+        <w:sz w:val="20"/>
+      </w:rPr>
+    </w:lvl>
+    <w:lvl w:ilvl="5" w:tentative="1">
+      <w:start w:val="1"/>
+      <w:numFmt w:val="bullet"/>
+      <w:lvlText w:val=""/>
+      <w:lvlJc w:val="left"/>
+      <w:pPr>
+        <w:tabs>
+          <w:tab w:val="num" w:pos="4320"/>
+        </w:tabs>
+        <w:ind w:left="4320" w:hanging="360"/>
+      </w:pPr>
+      <w:rPr>
+        <w:rFonts w:ascii="Wingdings" w:hAnsi="Wingdings" w:hint="default"/>
+        <w:sz w:val="20"/>
+      </w:rPr>
+    </w:lvl>
+    <w:lvl w:ilvl="6" w:tentative="1">
+      <w:start w:val="1"/>
+      <w:numFmt w:val="bullet"/>
+      <w:lvlText w:val=""/>
+      <w:lvlJc w:val="left"/>
+      <w:pPr>
+        <w:tabs>
+          <w:tab w:val="num" w:pos="5040"/>
+        </w:tabs>
+        <w:ind w:left="5040" w:hanging="360"/>
+      </w:pPr>
+      <w:rPr>
+        <w:rFonts w:ascii="Wingdings" w:hAnsi="Wingdings" w:hint="default"/>
+        <w:sz w:val="20"/>
+      </w:rPr>
+    </w:lvl>
+    <w:lvl w:ilvl="7" w:tentative="1">
+      <w:start w:val="1"/>
+      <w:numFmt w:val="bullet"/>
+      <w:lvlText w:val=""/>
+      <w:lvlJc w:val="left"/>
+      <w:pPr>
+        <w:tabs>
+          <w:tab w:val="num" w:pos="5760"/>
+        </w:tabs>
+        <w:ind w:left="5760" w:hanging="360"/>
+      </w:pPr>
+      <w:rPr>
+        <w:rFonts w:ascii="Wingdings" w:hAnsi="Wingdings" w:hint="default"/>
+        <w:sz w:val="20"/>
+      </w:rPr>
+    </w:lvl>
+    <w:lvl w:ilvl="8" w:tentative="1">
+      <w:start w:val="1"/>
+      <w:numFmt w:val="bullet"/>
+      <w:lvlText w:val=""/>
+      <w:lvlJc w:val="left"/>
+      <w:pPr>
+        <w:tabs>
+          <w:tab w:val="num" w:pos="6480"/>
+        </w:tabs>
+        <w:ind w:left="6480" w:hanging="360"/>
+      </w:pPr>
+      <w:rPr>
+        <w:rFonts w:ascii="Wingdings" w:hAnsi="Wingdings" w:hint="default"/>
+        <w:sz w:val="20"/>
+      </w:rPr>
+    </w:lvl>
+  </w:abstractNum>
   <w:num w:numId="1" w16cid:durableId="448402179">
-    <w:abstractNumId w:val="7"/>
+    <w:abstractNumId w:val="9"/>
   </w:num>
   <w:num w:numId="2" w16cid:durableId="1377656460">
     <w:abstractNumId w:val="0"/>
   </w:num>
   <w:num w:numId="3" w16cid:durableId="1016613346">
-    <w:abstractNumId w:val="4"/>
+    <w:abstractNumId w:val="6"/>
   </w:num>
   <w:num w:numId="4" w16cid:durableId="1288317639">
     <w:abstractNumId w:val="1"/>
   </w:num>
   <w:num w:numId="5" w16cid:durableId="1924098320">
+    <w:abstractNumId w:val="7"/>
+  </w:num>
+  <w:num w:numId="6" w16cid:durableId="74937784">
+    <w:abstractNumId w:val="8"/>
+  </w:num>
+  <w:num w:numId="7" w16cid:durableId="396173414">
+    <w:abstractNumId w:val="3"/>
+  </w:num>
+  <w:num w:numId="8" w16cid:durableId="1995912926">
     <w:abstractNumId w:val="5"/>
   </w:num>
-  <w:num w:numId="6" w16cid:durableId="74937784">
-    <w:abstractNumId w:val="6"/>
+  <w:num w:numId="9" w16cid:durableId="1208949627">
+    <w:abstractNumId w:val="10"/>
   </w:num>
-  <w:num w:numId="7" w16cid:durableId="396173414">
+  <w:num w:numId="10" w16cid:durableId="1205673031">
     <w:abstractNumId w:val="2"/>
   </w:num>
-  <w:num w:numId="8" w16cid:durableId="1995912926">
-    <w:abstractNumId w:val="3"/>
+  <w:num w:numId="11" w16cid:durableId="868839142">
+    <w:abstractNumId w:val="4"/>
   </w:num>
 </w:numbering>
 </file>
 
 <file path=word/styles.xml><?xml version="1.0" encoding="utf-8"?>
-<w:styles xmlns:mc="http://schemas.openxmlformats.org/markup-compatibility/2006" xmlns:r="http://schemas.openxmlformats.org/officeDocument/2006/relationships" xmlns:w="http://schemas.openxmlformats.org/wordprocessingml/2006/main" xmlns:w14="http://schemas.microsoft.com/office/word/2010/wordml" xmlns:w15="http://schemas.microsoft.com/office/word/2012/wordml" xmlns:w16cex="http://schemas.microsoft.com/office/word/2018/wordml/cex" xmlns:w16cid="http://schemas.microsoft.com/office/word/2016/wordml/cid" xmlns:w16="http://schemas.microsoft.com/office/word/2018/wordml" xmlns:w16sdtdh="http://schemas.microsoft.com/office/word/2020/wordml/sdtdatahash" xmlns:w16se="http://schemas.microsoft.com/office/word/2015/wordml/symex" mc:Ignorable="w14 w15 w16se w16cid w16 w16cex w16sdtdh">
+<w:styles xmlns:mc="http://schemas.openxmlformats.org/markup-compatibility/2006" xmlns:r="http://schemas.openxmlformats.org/officeDocument/2006/relationships" xmlns:w="http://schemas.openxmlformats.org/wordprocessingml/2006/main" xmlns:w14="http://schemas.microsoft.com/office/word/2010/wordml" xmlns:w15="http://schemas.microsoft.com/office/word/2012/wordml" xmlns:w16cex="http://schemas.microsoft.com/office/word/2018/wordml/cex" xmlns:w16cid="http://schemas.microsoft.com/office/word/2016/wordml/cid" xmlns:w16="http://schemas.microsoft.com/office/word/2018/wordml" xmlns:w16du="http://schemas.microsoft.com/office/word/2023/wordml/word16du" xmlns:w16sdtdh="http://schemas.microsoft.com/office/word/2020/wordml/sdtdatahash" xmlns:w16se="http://schemas.microsoft.com/office/word/2015/wordml/symex" mc:Ignorable="w14 w15 w16se w16cid w16 w16cex w16sdtdh w16du">
   <w:docDefaults>
     <w:rPrDefault>
       <w:rPr>
@@ -2354,7 +3238,6 @@
   <w:style w:type="character" w:default="1" w:styleId="DefaultParagraphFont">
     <w:name w:val="Default Paragraph Font"/>
     <w:uiPriority w:val="1"/>
-    <w:semiHidden/>
     <w:unhideWhenUsed/>
   </w:style>
   <w:style w:type="table" w:default="1" w:styleId="TableNormal">

</xml_diff>

<commit_message>
docs: Added udemy resource link
</commit_message>
<xml_diff>
--- a/Finanace/Stock Market Investing And Trading Foundation.docx
+++ b/Finanace/Stock Market Investing And Trading Foundation.docx
@@ -8,7 +8,13 @@
         <w:jc w:val="center"/>
       </w:pPr>
       <w:r>
-        <w:t>Stock Market Investing And Trading Foundation</w:t>
+        <w:t xml:space="preserve">Stock Market Investing </w:t>
+      </w:r>
+      <w:r>
+        <w:t>and</w:t>
+      </w:r>
+      <w:r>
+        <w:t xml:space="preserve"> Trading Foundation</w:t>
       </w:r>
     </w:p>
     <w:p>
@@ -57,6 +63,11 @@
           <w:ilvl w:val="0"/>
           <w:numId w:val="1"/>
         </w:numPr>
+        <w:rPr>
+          <w:rStyle w:val="Hyperlink"/>
+          <w:color w:val="auto"/>
+          <w:u w:val="none"/>
+        </w:rPr>
       </w:pPr>
       <w:hyperlink r:id="rId7" w:history="1">
         <w:r>
@@ -69,6 +80,69 @@
     </w:p>
     <w:p>
       <w:pPr>
+        <w:numPr>
+          <w:ilvl w:val="0"/>
+          <w:numId w:val="1"/>
+        </w:numPr>
+      </w:pPr>
+      <w:hyperlink r:id="rId8" w:history="1">
+        <w:r>
+          <w:rPr>
+            <w:rStyle w:val="Hyperlink"/>
+          </w:rPr>
+          <w:t>www.udemy.com</w:t>
+        </w:r>
+      </w:hyperlink>
+      <w:r>
+        <w:rPr>
+          <w:rStyle w:val="Hyperlink"/>
+          <w:u w:val="none"/>
+        </w:rPr>
+        <w:t xml:space="preserve"> </w:t>
+      </w:r>
+      <w:r>
+        <w:rPr>
+          <w:rStyle w:val="Hyperlink"/>
+          <w:color w:val="auto"/>
+          <w:u w:val="none"/>
+        </w:rPr>
+        <w:t xml:space="preserve">(Investing </w:t>
+      </w:r>
+      <w:r>
+        <w:rPr>
+          <w:rStyle w:val="Hyperlink"/>
+          <w:color w:val="auto"/>
+          <w:u w:val="none"/>
+        </w:rPr>
+        <w:t>in</w:t>
+      </w:r>
+      <w:r>
+        <w:rPr>
+          <w:rStyle w:val="Hyperlink"/>
+          <w:color w:val="auto"/>
+          <w:u w:val="none"/>
+        </w:rPr>
+        <w:t xml:space="preserve"> Stocks: The Complete Course, </w:t>
+      </w:r>
+      <w:r>
+        <w:rPr>
+          <w:rStyle w:val="Hyperlink"/>
+          <w:color w:val="auto"/>
+          <w:u w:val="none"/>
+        </w:rPr>
+        <w:t>A</w:t>
+      </w:r>
+      <w:r>
+        <w:rPr>
+          <w:rStyle w:val="Hyperlink"/>
+          <w:color w:val="auto"/>
+          <w:u w:val="none"/>
+        </w:rPr>
+        <w:t>uthor: Steve Ballinger, MBA)</w:t>
+      </w:r>
+    </w:p>
+    <w:p>
+      <w:pPr>
         <w:pStyle w:val="Heading3"/>
       </w:pPr>
       <w:r>
@@ -77,7 +151,25 @@
     </w:p>
     <w:p>
       <w:r>
-        <w:t>The good news for investors; long term market makes returns. Usually stock investor survive or make money only for long term investment, even through the great depression or covid-19 pandemic for instance. Buy why? Because stock rises over time, even with big pull back, such as covid-19 or even with high inflation.</w:t>
+        <w:t xml:space="preserve">The good news for investors; long term market makes returns. </w:t>
+      </w:r>
+      <w:r>
+        <w:t>Usually,</w:t>
+      </w:r>
+      <w:r>
+        <w:t xml:space="preserve"> stock investor </w:t>
+      </w:r>
+      <w:r>
+        <w:t>survives</w:t>
+      </w:r>
+      <w:r>
+        <w:t xml:space="preserve"> or make money only for long term investment, even </w:t>
+      </w:r>
+      <w:r>
+        <w:t>though</w:t>
+      </w:r>
+      <w:r>
+        <w:t xml:space="preserve"> the great depression or covid-19 pandemic for instance. Buy why? Because stock rises over time, even with big pull back, such as covid-19 or even with high inflation.</w:t>
       </w:r>
     </w:p>
     <w:p/>
@@ -196,7 +288,15 @@
     </w:p>
     <w:p>
       <w:r>
-        <w:t xml:space="preserve">Ratios means the price you are paying for a stock good in relation to something. There are 3 type of measures in ratios. </w:t>
+        <w:t xml:space="preserve">Ratios means the price you are paying for a stock good in relation to something. There are 3 </w:t>
+      </w:r>
+      <w:proofErr w:type="gramStart"/>
+      <w:r>
+        <w:t>type</w:t>
+      </w:r>
+      <w:proofErr w:type="gramEnd"/>
+      <w:r>
+        <w:t xml:space="preserve"> of measures in ratios. </w:t>
       </w:r>
     </w:p>
     <w:p/>
@@ -3317,6 +3417,18 @@
       <w:contextualSpacing/>
     </w:pPr>
   </w:style>
+  <w:style w:type="character" w:styleId="UnresolvedMention">
+    <w:name w:val="Unresolved Mention"/>
+    <w:basedOn w:val="DefaultParagraphFont"/>
+    <w:uiPriority w:val="99"/>
+    <w:semiHidden/>
+    <w:unhideWhenUsed/>
+    <w:rsid w:val="00F235A8"/>
+    <w:rPr>
+      <w:color w:val="605E5C"/>
+      <w:shd w:val="clear" w:color="auto" w:fill="E1DFDD"/>
+    </w:rPr>
+  </w:style>
 </w:styles>
 </file>
 

</xml_diff>

<commit_message>
docs: Added diferences of P/E and P/S
</commit_message>
<xml_diff>
--- a/Finanace/Stock Market Investing And Trading Foundation.docx
+++ b/Finanace/Stock Market Investing And Trading Foundation.docx
@@ -84,6 +84,11 @@
           <w:ilvl w:val="0"/>
           <w:numId w:val="1"/>
         </w:numPr>
+        <w:rPr>
+          <w:rStyle w:val="Hyperlink"/>
+          <w:color w:val="auto"/>
+          <w:u w:val="none"/>
+        </w:rPr>
       </w:pPr>
       <w:hyperlink r:id="rId8" w:history="1">
         <w:r>
@@ -143,6 +148,22 @@
     </w:p>
     <w:p>
       <w:pPr>
+        <w:numPr>
+          <w:ilvl w:val="0"/>
+          <w:numId w:val="1"/>
+        </w:numPr>
+      </w:pPr>
+      <w:r>
+        <w:rPr>
+          <w:rStyle w:val="Hyperlink"/>
+          <w:color w:val="auto"/>
+          <w:u w:val="none"/>
+        </w:rPr>
+        <w:t>Copilot</w:t>
+      </w:r>
+    </w:p>
+    <w:p>
+      <w:pPr>
         <w:pStyle w:val="Heading3"/>
       </w:pPr>
       <w:r>
@@ -229,6 +250,68 @@
         <w:pStyle w:val="Heading3"/>
       </w:pPr>
       <w:r>
+        <w:t>W</w:t>
+      </w:r>
+      <w:r>
+        <w:t xml:space="preserve">hat </w:t>
+      </w:r>
+      <w:r>
+        <w:t>are</w:t>
+      </w:r>
+      <w:r>
+        <w:t xml:space="preserve"> outstanding shares in stock?</w:t>
+      </w:r>
+    </w:p>
+    <w:p>
+      <w:r>
+        <w:rPr>
+          <w:b/>
+          <w:bCs/>
+        </w:rPr>
+        <w:t>Outstanding shares</w:t>
+      </w:r>
+      <w:r>
+        <w:t xml:space="preserve"> refer to the total number of shares of a company’s stock that are currently held by all its shareholders, including individual investors, institutional investors, and company insiders</w:t>
+      </w:r>
+      <w:r>
+        <w:t>.</w:t>
+      </w:r>
+    </w:p>
+    <w:p/>
+    <w:p>
+      <w:pPr>
+        <w:widowControl/>
+        <w:rPr>
+          <w:b/>
+          <w:sz w:val="32"/>
+        </w:rPr>
+      </w:pPr>
+      <w:r>
+        <w:t xml:space="preserve">The number of outstanding shares can fluctuate over time due to various factors, such as the company issuing new shares or buying back existing ones. This number is different from </w:t>
+      </w:r>
+      <w:r>
+        <w:rPr>
+          <w:b/>
+          <w:bCs/>
+        </w:rPr>
+        <w:t>authorized shares</w:t>
+      </w:r>
+      <w:r>
+        <w:t>, which are the maximum number of shares a company is legally allowed to issue</w:t>
+      </w:r>
+      <w:r>
+        <w:t>.</w:t>
+      </w:r>
+      <w:r>
+        <w:br w:type="page"/>
+      </w:r>
+    </w:p>
+    <w:p>
+      <w:pPr>
+        <w:pStyle w:val="Heading3"/>
+      </w:pPr>
+      <w:r>
+        <w:lastRenderedPageBreak/>
         <w:t>Competitive Advantages</w:t>
       </w:r>
     </w:p>
@@ -272,17 +355,12 @@
         <w:t xml:space="preserve">You can take an example of “Apple Inc.”. Although Apple products is expensive, but it has a high in terms of quality and services, also Apple is well known and has a good reputation. </w:t>
       </w:r>
     </w:p>
-    <w:p>
-      <w:r>
-        <w:br w:type="page"/>
-      </w:r>
-    </w:p>
+    <w:p/>
     <w:p>
       <w:pPr>
         <w:pStyle w:val="Heading3"/>
       </w:pPr>
       <w:r>
-        <w:lastRenderedPageBreak/>
         <w:t>Ratios</w:t>
       </w:r>
     </w:p>
@@ -290,11 +368,9 @@
       <w:r>
         <w:t xml:space="preserve">Ratios means the price you are paying for a stock good in relation to something. There are 3 </w:t>
       </w:r>
-      <w:proofErr w:type="gramStart"/>
-      <w:r>
-        <w:t>type</w:t>
-      </w:r>
-      <w:proofErr w:type="gramEnd"/>
+      <w:r>
+        <w:t>types</w:t>
+      </w:r>
       <w:r>
         <w:t xml:space="preserve"> of measures in ratios. </w:t>
       </w:r>
@@ -479,6 +555,7 @@
     <w:p/>
     <w:p>
       <w:r>
+        <w:lastRenderedPageBreak/>
         <w:t xml:space="preserve">From the formula, market value per share means the stock price, earning per share (EPS) is the value </w:t>
       </w:r>
       <w:r>
@@ -531,16 +608,6 @@
       </w:r>
     </w:p>
     <w:p/>
-    <w:p>
-      <w:r>
-        <w:br w:type="page"/>
-      </w:r>
-    </w:p>
-    <w:p>
-      <w:pPr>
-        <w:pStyle w:val="Heading3"/>
-      </w:pPr>
-    </w:p>
     <w:p>
       <w:r>
         <w:t>Let’s take an example:</w:t>
@@ -735,9 +802,23 @@
     <w:p/>
     <w:p>
       <w:pPr>
+        <w:widowControl/>
+        <w:jc w:val="left"/>
+        <w:rPr>
+          <w:b/>
+          <w:sz w:val="32"/>
+        </w:rPr>
+      </w:pPr>
+      <w:r>
+        <w:br w:type="page"/>
+      </w:r>
+    </w:p>
+    <w:p>
+      <w:pPr>
         <w:pStyle w:val="Heading3"/>
       </w:pPr>
       <w:r>
+        <w:lastRenderedPageBreak/>
         <w:t>Relative P/E</w:t>
       </w:r>
     </w:p>
@@ -764,7 +845,6 @@
         <w:pStyle w:val="Heading3"/>
       </w:pPr>
       <w:r>
-        <w:lastRenderedPageBreak/>
         <w:t>Limitations Of P/E</w:t>
       </w:r>
     </w:p>
@@ -1882,6 +1962,18 @@
       <w:r>
         <w:t>Sales per share = $5.20</w:t>
       </w:r>
+      <w:r>
+        <w:t xml:space="preserve"> </w:t>
+      </w:r>
+      <w:r>
+        <w:t>($</w:t>
+      </w:r>
+      <w:r>
+        <w:t>520</w:t>
+      </w:r>
+      <w:r>
+        <w:t xml:space="preserve"> million in sales / 100 million shares outstanding)</w:t>
+      </w:r>
     </w:p>
     <w:p>
       <w:pPr>
@@ -1932,6 +2024,516 @@
       <w:r>
         <w:t xml:space="preserve">The P/S ratio doesn’t take into account whether the company makes any earnings or whether it will ever make earnings. Comparing companies in different industries can prove difficult as well. For example, companies that make video games will have different capabilities when it comes to turning sales into profits when compared to, say, grocery retailers. In addition, P/S ratios do not account for debt loads or the status of a company’s balance sheet. </w:t>
       </w:r>
+    </w:p>
+    <w:p>
+      <w:pPr>
+        <w:widowControl/>
+        <w:jc w:val="left"/>
+      </w:pPr>
+    </w:p>
+    <w:p>
+      <w:pPr>
+        <w:widowControl/>
+        <w:jc w:val="left"/>
+        <w:rPr>
+          <w:lang w:val="en-HK"/>
+        </w:rPr>
+      </w:pPr>
+    </w:p>
+    <w:p>
+      <w:pPr>
+        <w:pStyle w:val="Heading3"/>
+        <w:rPr>
+          <w:sz w:val="28"/>
+          <w:szCs w:val="28"/>
+        </w:rPr>
+      </w:pPr>
+      <w:r>
+        <w:rPr>
+          <w:sz w:val="28"/>
+          <w:szCs w:val="28"/>
+        </w:rPr>
+        <w:t>Which to use</w:t>
+      </w:r>
+      <w:r>
+        <w:rPr>
+          <w:sz w:val="28"/>
+          <w:szCs w:val="28"/>
+        </w:rPr>
+        <w:t xml:space="preserve"> P/E or P/S when buying a stock</w:t>
+      </w:r>
+      <w:r>
+        <w:rPr>
+          <w:sz w:val="28"/>
+          <w:szCs w:val="28"/>
+        </w:rPr>
+        <w:t>?</w:t>
+      </w:r>
+      <w:r>
+        <w:rPr>
+          <w:sz w:val="28"/>
+          <w:szCs w:val="28"/>
+        </w:rPr>
+        <w:t xml:space="preserve"> What is the major difference between them</w:t>
+      </w:r>
+      <w:r>
+        <w:rPr>
+          <w:sz w:val="28"/>
+          <w:szCs w:val="28"/>
+        </w:rPr>
+        <w:t>?</w:t>
+      </w:r>
+    </w:p>
+    <w:p>
+      <w:pPr>
+        <w:rPr>
+          <w:lang w:val="en-HK"/>
+        </w:rPr>
+      </w:pPr>
+      <w:r>
+        <w:rPr>
+          <w:lang w:val="en-HK"/>
+        </w:rPr>
+        <w:t xml:space="preserve">When deciding between using the Price-to-Earnings (P/E) ratio and the Price-to-Sales (P/S) ratio for evaluating stocks, it depends on the context and the specific characteristics of the company you’re </w:t>
+      </w:r>
+      <w:r>
+        <w:rPr>
+          <w:lang w:val="en-HK"/>
+        </w:rPr>
+        <w:t>analysing</w:t>
+      </w:r>
+      <w:r>
+        <w:rPr>
+          <w:lang w:val="en-HK"/>
+        </w:rPr>
+        <w:t>.</w:t>
+      </w:r>
+    </w:p>
+    <w:p>
+      <w:pPr>
+        <w:rPr>
+          <w:lang w:val="en-HK"/>
+        </w:rPr>
+      </w:pPr>
+    </w:p>
+    <w:p>
+      <w:pPr>
+        <w:rPr>
+          <w:b/>
+          <w:bCs/>
+          <w:sz w:val="24"/>
+          <w:lang w:val="en-HK"/>
+        </w:rPr>
+      </w:pPr>
+      <w:r>
+        <w:rPr>
+          <w:b/>
+          <w:bCs/>
+          <w:sz w:val="24"/>
+          <w:lang w:val="en-HK"/>
+        </w:rPr>
+        <w:t>P/E Ratio</w:t>
+      </w:r>
+    </w:p>
+    <w:p>
+      <w:pPr>
+        <w:rPr>
+          <w:b/>
+          <w:bCs/>
+          <w:lang w:val="en-HK"/>
+        </w:rPr>
+      </w:pPr>
+    </w:p>
+    <w:p>
+      <w:pPr>
+        <w:numPr>
+          <w:ilvl w:val="0"/>
+          <w:numId w:val="12"/>
+        </w:numPr>
+        <w:rPr>
+          <w:lang w:val="en-HK"/>
+        </w:rPr>
+      </w:pPr>
+      <w:r>
+        <w:rPr>
+          <w:b/>
+          <w:bCs/>
+          <w:lang w:val="en-HK"/>
+        </w:rPr>
+        <w:t>Definition</w:t>
+      </w:r>
+      <w:r>
+        <w:rPr>
+          <w:lang w:val="en-HK"/>
+        </w:rPr>
+        <w:t>: The P/E ratio is calculated by dividing the current market price of a stock by its earnings per share (EPS).</w:t>
+      </w:r>
+    </w:p>
+    <w:p>
+      <w:pPr>
+        <w:numPr>
+          <w:ilvl w:val="0"/>
+          <w:numId w:val="12"/>
+        </w:numPr>
+        <w:rPr>
+          <w:lang w:val="en-HK"/>
+        </w:rPr>
+      </w:pPr>
+      <w:r>
+        <w:rPr>
+          <w:b/>
+          <w:bCs/>
+          <w:lang w:val="en-HK"/>
+        </w:rPr>
+        <w:t>Usage</w:t>
+      </w:r>
+      <w:r>
+        <w:rPr>
+          <w:lang w:val="en-HK"/>
+        </w:rPr>
+        <w:t>: It is widely used to determine if a stock is overvalued or undervalued compared to its earnings. A high P/E might indicate that the stock is overvalued, or investors expect high growth rates in the future.</w:t>
+      </w:r>
+    </w:p>
+    <w:p>
+      <w:pPr>
+        <w:numPr>
+          <w:ilvl w:val="0"/>
+          <w:numId w:val="12"/>
+        </w:numPr>
+        <w:rPr>
+          <w:lang w:val="en-HK"/>
+        </w:rPr>
+      </w:pPr>
+      <w:r>
+        <w:rPr>
+          <w:b/>
+          <w:bCs/>
+          <w:lang w:val="en-HK"/>
+        </w:rPr>
+        <w:t>Best For</w:t>
+      </w:r>
+      <w:r>
+        <w:rPr>
+          <w:lang w:val="en-HK"/>
+        </w:rPr>
+        <w:t>: Companies with stable earnings and profitability. It’s particularly useful for mature companies in established industries.</w:t>
+      </w:r>
+    </w:p>
+    <w:p>
+      <w:pPr>
+        <w:ind w:left="360"/>
+        <w:rPr>
+          <w:lang w:val="en-HK"/>
+        </w:rPr>
+      </w:pPr>
+    </w:p>
+    <w:p>
+      <w:pPr>
+        <w:rPr>
+          <w:b/>
+          <w:bCs/>
+          <w:sz w:val="24"/>
+          <w:lang w:val="en-HK"/>
+        </w:rPr>
+      </w:pPr>
+      <w:r>
+        <w:rPr>
+          <w:b/>
+          <w:bCs/>
+          <w:sz w:val="24"/>
+          <w:lang w:val="en-HK"/>
+        </w:rPr>
+        <w:t>P/S Ratio</w:t>
+      </w:r>
+    </w:p>
+    <w:p>
+      <w:pPr>
+        <w:rPr>
+          <w:b/>
+          <w:bCs/>
+          <w:lang w:val="en-HK"/>
+        </w:rPr>
+      </w:pPr>
+    </w:p>
+    <w:p>
+      <w:pPr>
+        <w:numPr>
+          <w:ilvl w:val="0"/>
+          <w:numId w:val="13"/>
+        </w:numPr>
+        <w:rPr>
+          <w:lang w:val="en-HK"/>
+        </w:rPr>
+      </w:pPr>
+      <w:r>
+        <w:rPr>
+          <w:b/>
+          <w:bCs/>
+          <w:lang w:val="en-HK"/>
+        </w:rPr>
+        <w:t>Definition</w:t>
+      </w:r>
+      <w:r>
+        <w:rPr>
+          <w:lang w:val="en-HK"/>
+        </w:rPr>
+        <w:t>: The P/S ratio is calculated by dividing the current market price of a stock by its sales per share.</w:t>
+      </w:r>
+    </w:p>
+    <w:p>
+      <w:pPr>
+        <w:numPr>
+          <w:ilvl w:val="0"/>
+          <w:numId w:val="13"/>
+        </w:numPr>
+        <w:rPr>
+          <w:lang w:val="en-HK"/>
+        </w:rPr>
+      </w:pPr>
+      <w:r>
+        <w:rPr>
+          <w:b/>
+          <w:bCs/>
+          <w:lang w:val="en-HK"/>
+        </w:rPr>
+        <w:t>Usage</w:t>
+      </w:r>
+      <w:r>
+        <w:rPr>
+          <w:lang w:val="en-HK"/>
+        </w:rPr>
+        <w:t>: It is useful for evaluating companies that may not yet be profitable or have inconsistent earnings. A lower P/S ratio might indicate that the stock is undervalued relative to its sales.</w:t>
+      </w:r>
+    </w:p>
+    <w:p>
+      <w:pPr>
+        <w:numPr>
+          <w:ilvl w:val="0"/>
+          <w:numId w:val="13"/>
+        </w:numPr>
+        <w:rPr>
+          <w:lang w:val="en-HK"/>
+        </w:rPr>
+      </w:pPr>
+      <w:r>
+        <w:rPr>
+          <w:b/>
+          <w:bCs/>
+          <w:lang w:val="en-HK"/>
+        </w:rPr>
+        <w:lastRenderedPageBreak/>
+        <w:t>Best For</w:t>
+      </w:r>
+      <w:r>
+        <w:rPr>
+          <w:lang w:val="en-HK"/>
+        </w:rPr>
+        <w:t>: Startups, high-growth companies, or industries where earnings are not yet stable, such as technology or biotech firms.</w:t>
+      </w:r>
+    </w:p>
+    <w:p>
+      <w:pPr>
+        <w:ind w:left="360"/>
+        <w:rPr>
+          <w:lang w:val="en-HK"/>
+        </w:rPr>
+      </w:pPr>
+    </w:p>
+    <w:p>
+      <w:pPr>
+        <w:rPr>
+          <w:b/>
+          <w:bCs/>
+          <w:sz w:val="24"/>
+          <w:lang w:val="en-HK"/>
+        </w:rPr>
+      </w:pPr>
+      <w:r>
+        <w:rPr>
+          <w:b/>
+          <w:bCs/>
+          <w:sz w:val="24"/>
+          <w:lang w:val="en-HK"/>
+        </w:rPr>
+        <w:t>Major Differences</w:t>
+      </w:r>
+    </w:p>
+    <w:p>
+      <w:pPr>
+        <w:rPr>
+          <w:b/>
+          <w:bCs/>
+          <w:lang w:val="en-HK"/>
+        </w:rPr>
+      </w:pPr>
+    </w:p>
+    <w:p>
+      <w:pPr>
+        <w:numPr>
+          <w:ilvl w:val="0"/>
+          <w:numId w:val="14"/>
+        </w:numPr>
+        <w:rPr>
+          <w:lang w:val="en-HK"/>
+        </w:rPr>
+      </w:pPr>
+      <w:r>
+        <w:rPr>
+          <w:b/>
+          <w:bCs/>
+          <w:lang w:val="en-HK"/>
+        </w:rPr>
+        <w:t>Focus</w:t>
+      </w:r>
+      <w:r>
+        <w:rPr>
+          <w:lang w:val="en-HK"/>
+        </w:rPr>
+        <w:t>: P/E focuses on earnings, while P/S focuses on sales. This makes P/E more suitable for profitable companies and P/S for companies with high sales growth but not necessarily profits.</w:t>
+      </w:r>
+    </w:p>
+    <w:p>
+      <w:pPr>
+        <w:numPr>
+          <w:ilvl w:val="0"/>
+          <w:numId w:val="14"/>
+        </w:numPr>
+        <w:rPr>
+          <w:lang w:val="en-HK"/>
+        </w:rPr>
+      </w:pPr>
+      <w:r>
+        <w:rPr>
+          <w:b/>
+          <w:bCs/>
+          <w:lang w:val="en-HK"/>
+        </w:rPr>
+        <w:t>Volatility</w:t>
+      </w:r>
+      <w:r>
+        <w:rPr>
+          <w:lang w:val="en-HK"/>
+        </w:rPr>
+        <w:t>: Earnings can be more volatile than sales, making the P/E ratio more susceptible to fluctuations due to temporary changes in profitability.</w:t>
+      </w:r>
+    </w:p>
+    <w:p>
+      <w:pPr>
+        <w:numPr>
+          <w:ilvl w:val="0"/>
+          <w:numId w:val="14"/>
+        </w:numPr>
+        <w:rPr>
+          <w:lang w:val="en-HK"/>
+        </w:rPr>
+      </w:pPr>
+      <w:r>
+        <w:rPr>
+          <w:b/>
+          <w:bCs/>
+          <w:lang w:val="en-HK"/>
+        </w:rPr>
+        <w:t>Industry Relevance</w:t>
+      </w:r>
+      <w:r>
+        <w:rPr>
+          <w:lang w:val="en-HK"/>
+        </w:rPr>
+        <w:t>: Different industries have different norms for these ratios. For example, tech companies often have high P/E ratios due to growth expectations, while retail companies might be better evaluated using P/S ratios.</w:t>
+      </w:r>
+    </w:p>
+    <w:p>
+      <w:pPr>
+        <w:ind w:left="360"/>
+        <w:rPr>
+          <w:lang w:val="en-HK"/>
+        </w:rPr>
+      </w:pPr>
+    </w:p>
+    <w:p>
+      <w:pPr>
+        <w:rPr>
+          <w:b/>
+          <w:bCs/>
+          <w:sz w:val="24"/>
+          <w:lang w:val="en-HK"/>
+        </w:rPr>
+      </w:pPr>
+      <w:r>
+        <w:rPr>
+          <w:b/>
+          <w:bCs/>
+          <w:sz w:val="24"/>
+          <w:lang w:val="en-HK"/>
+        </w:rPr>
+        <w:t>Recommendation</w:t>
+      </w:r>
+    </w:p>
+    <w:p>
+      <w:pPr>
+        <w:rPr>
+          <w:b/>
+          <w:bCs/>
+          <w:lang w:val="en-HK"/>
+        </w:rPr>
+      </w:pPr>
+    </w:p>
+    <w:p>
+      <w:pPr>
+        <w:numPr>
+          <w:ilvl w:val="0"/>
+          <w:numId w:val="15"/>
+        </w:numPr>
+        <w:rPr>
+          <w:lang w:val="en-HK"/>
+        </w:rPr>
+      </w:pPr>
+      <w:r>
+        <w:rPr>
+          <w:b/>
+          <w:bCs/>
+          <w:lang w:val="en-HK"/>
+        </w:rPr>
+        <w:t>Use P/E</w:t>
+      </w:r>
+      <w:r>
+        <w:rPr>
+          <w:lang w:val="en-HK"/>
+        </w:rPr>
+        <w:t>: For established companies with consistent earnings.</w:t>
+      </w:r>
+    </w:p>
+    <w:p>
+      <w:pPr>
+        <w:numPr>
+          <w:ilvl w:val="0"/>
+          <w:numId w:val="15"/>
+        </w:numPr>
+        <w:rPr>
+          <w:lang w:val="en-HK"/>
+        </w:rPr>
+      </w:pPr>
+      <w:r>
+        <w:rPr>
+          <w:b/>
+          <w:bCs/>
+          <w:lang w:val="en-HK"/>
+        </w:rPr>
+        <w:t>Use P/S</w:t>
+      </w:r>
+      <w:r>
+        <w:rPr>
+          <w:lang w:val="en-HK"/>
+        </w:rPr>
+        <w:t>: For high-growth companies or those not yet profitable.</w:t>
+      </w:r>
+    </w:p>
+    <w:p>
+      <w:pPr>
+        <w:rPr>
+          <w:lang w:val="en-HK"/>
+        </w:rPr>
+      </w:pPr>
     </w:p>
     <w:p>
       <w:pPr>
@@ -2150,6 +2752,155 @@
     </w:lvl>
   </w:abstractNum>
   <w:abstractNum w:abstractNumId="3" w15:restartNumberingAfterBreak="0">
+    <w:nsid w:val="0B5A2470"/>
+    <w:multiLevelType w:val="multilevel"/>
+    <w:tmpl w:val="13D67FE0"/>
+    <w:lvl w:ilvl="0">
+      <w:start w:val="1"/>
+      <w:numFmt w:val="bullet"/>
+      <w:lvlText w:val=""/>
+      <w:lvlJc w:val="left"/>
+      <w:pPr>
+        <w:tabs>
+          <w:tab w:val="num" w:pos="720"/>
+        </w:tabs>
+        <w:ind w:left="720" w:hanging="360"/>
+      </w:pPr>
+      <w:rPr>
+        <w:rFonts w:ascii="Symbol" w:hAnsi="Symbol" w:hint="default"/>
+        <w:sz w:val="20"/>
+      </w:rPr>
+    </w:lvl>
+    <w:lvl w:ilvl="1" w:tentative="1">
+      <w:start w:val="1"/>
+      <w:numFmt w:val="bullet"/>
+      <w:lvlText w:val="o"/>
+      <w:lvlJc w:val="left"/>
+      <w:pPr>
+        <w:tabs>
+          <w:tab w:val="num" w:pos="1440"/>
+        </w:tabs>
+        <w:ind w:left="1440" w:hanging="360"/>
+      </w:pPr>
+      <w:rPr>
+        <w:rFonts w:ascii="Courier New" w:hAnsi="Courier New" w:hint="default"/>
+        <w:sz w:val="20"/>
+      </w:rPr>
+    </w:lvl>
+    <w:lvl w:ilvl="2" w:tentative="1">
+      <w:start w:val="1"/>
+      <w:numFmt w:val="bullet"/>
+      <w:lvlText w:val=""/>
+      <w:lvlJc w:val="left"/>
+      <w:pPr>
+        <w:tabs>
+          <w:tab w:val="num" w:pos="2160"/>
+        </w:tabs>
+        <w:ind w:left="2160" w:hanging="360"/>
+      </w:pPr>
+      <w:rPr>
+        <w:rFonts w:ascii="Wingdings" w:hAnsi="Wingdings" w:hint="default"/>
+        <w:sz w:val="20"/>
+      </w:rPr>
+    </w:lvl>
+    <w:lvl w:ilvl="3" w:tentative="1">
+      <w:start w:val="1"/>
+      <w:numFmt w:val="bullet"/>
+      <w:lvlText w:val=""/>
+      <w:lvlJc w:val="left"/>
+      <w:pPr>
+        <w:tabs>
+          <w:tab w:val="num" w:pos="2880"/>
+        </w:tabs>
+        <w:ind w:left="2880" w:hanging="360"/>
+      </w:pPr>
+      <w:rPr>
+        <w:rFonts w:ascii="Wingdings" w:hAnsi="Wingdings" w:hint="default"/>
+        <w:sz w:val="20"/>
+      </w:rPr>
+    </w:lvl>
+    <w:lvl w:ilvl="4" w:tentative="1">
+      <w:start w:val="1"/>
+      <w:numFmt w:val="bullet"/>
+      <w:lvlText w:val=""/>
+      <w:lvlJc w:val="left"/>
+      <w:pPr>
+        <w:tabs>
+          <w:tab w:val="num" w:pos="3600"/>
+        </w:tabs>
+        <w:ind w:left="3600" w:hanging="360"/>
+      </w:pPr>
+      <w:rPr>
+        <w:rFonts w:ascii="Wingdings" w:hAnsi="Wingdings" w:hint="default"/>
+        <w:sz w:val="20"/>
+      </w:rPr>
+    </w:lvl>
+    <w:lvl w:ilvl="5" w:tentative="1">
+      <w:start w:val="1"/>
+      <w:numFmt w:val="bullet"/>
+      <w:lvlText w:val=""/>
+      <w:lvlJc w:val="left"/>
+      <w:pPr>
+        <w:tabs>
+          <w:tab w:val="num" w:pos="4320"/>
+        </w:tabs>
+        <w:ind w:left="4320" w:hanging="360"/>
+      </w:pPr>
+      <w:rPr>
+        <w:rFonts w:ascii="Wingdings" w:hAnsi="Wingdings" w:hint="default"/>
+        <w:sz w:val="20"/>
+      </w:rPr>
+    </w:lvl>
+    <w:lvl w:ilvl="6" w:tentative="1">
+      <w:start w:val="1"/>
+      <w:numFmt w:val="bullet"/>
+      <w:lvlText w:val=""/>
+      <w:lvlJc w:val="left"/>
+      <w:pPr>
+        <w:tabs>
+          <w:tab w:val="num" w:pos="5040"/>
+        </w:tabs>
+        <w:ind w:left="5040" w:hanging="360"/>
+      </w:pPr>
+      <w:rPr>
+        <w:rFonts w:ascii="Wingdings" w:hAnsi="Wingdings" w:hint="default"/>
+        <w:sz w:val="20"/>
+      </w:rPr>
+    </w:lvl>
+    <w:lvl w:ilvl="7" w:tentative="1">
+      <w:start w:val="1"/>
+      <w:numFmt w:val="bullet"/>
+      <w:lvlText w:val=""/>
+      <w:lvlJc w:val="left"/>
+      <w:pPr>
+        <w:tabs>
+          <w:tab w:val="num" w:pos="5760"/>
+        </w:tabs>
+        <w:ind w:left="5760" w:hanging="360"/>
+      </w:pPr>
+      <w:rPr>
+        <w:rFonts w:ascii="Wingdings" w:hAnsi="Wingdings" w:hint="default"/>
+        <w:sz w:val="20"/>
+      </w:rPr>
+    </w:lvl>
+    <w:lvl w:ilvl="8" w:tentative="1">
+      <w:start w:val="1"/>
+      <w:numFmt w:val="bullet"/>
+      <w:lvlText w:val=""/>
+      <w:lvlJc w:val="left"/>
+      <w:pPr>
+        <w:tabs>
+          <w:tab w:val="num" w:pos="6480"/>
+        </w:tabs>
+        <w:ind w:left="6480" w:hanging="360"/>
+      </w:pPr>
+      <w:rPr>
+        <w:rFonts w:ascii="Wingdings" w:hAnsi="Wingdings" w:hint="default"/>
+        <w:sz w:val="20"/>
+      </w:rPr>
+    </w:lvl>
+  </w:abstractNum>
+  <w:abstractNum w:abstractNumId="4" w15:restartNumberingAfterBreak="0">
     <w:nsid w:val="0EE50C51"/>
     <w:multiLevelType w:val="hybridMultilevel"/>
     <w:tmpl w:val="3DEAB88C"/>
@@ -2262,7 +3013,156 @@
       </w:rPr>
     </w:lvl>
   </w:abstractNum>
-  <w:abstractNum w:abstractNumId="4" w15:restartNumberingAfterBreak="0">
+  <w:abstractNum w:abstractNumId="5" w15:restartNumberingAfterBreak="0">
+    <w:nsid w:val="12395327"/>
+    <w:multiLevelType w:val="multilevel"/>
+    <w:tmpl w:val="80721148"/>
+    <w:lvl w:ilvl="0">
+      <w:start w:val="1"/>
+      <w:numFmt w:val="bullet"/>
+      <w:lvlText w:val=""/>
+      <w:lvlJc w:val="left"/>
+      <w:pPr>
+        <w:tabs>
+          <w:tab w:val="num" w:pos="720"/>
+        </w:tabs>
+        <w:ind w:left="720" w:hanging="360"/>
+      </w:pPr>
+      <w:rPr>
+        <w:rFonts w:ascii="Symbol" w:hAnsi="Symbol" w:hint="default"/>
+        <w:sz w:val="20"/>
+      </w:rPr>
+    </w:lvl>
+    <w:lvl w:ilvl="1" w:tentative="1">
+      <w:start w:val="1"/>
+      <w:numFmt w:val="bullet"/>
+      <w:lvlText w:val="o"/>
+      <w:lvlJc w:val="left"/>
+      <w:pPr>
+        <w:tabs>
+          <w:tab w:val="num" w:pos="1440"/>
+        </w:tabs>
+        <w:ind w:left="1440" w:hanging="360"/>
+      </w:pPr>
+      <w:rPr>
+        <w:rFonts w:ascii="Courier New" w:hAnsi="Courier New" w:hint="default"/>
+        <w:sz w:val="20"/>
+      </w:rPr>
+    </w:lvl>
+    <w:lvl w:ilvl="2" w:tentative="1">
+      <w:start w:val="1"/>
+      <w:numFmt w:val="bullet"/>
+      <w:lvlText w:val=""/>
+      <w:lvlJc w:val="left"/>
+      <w:pPr>
+        <w:tabs>
+          <w:tab w:val="num" w:pos="2160"/>
+        </w:tabs>
+        <w:ind w:left="2160" w:hanging="360"/>
+      </w:pPr>
+      <w:rPr>
+        <w:rFonts w:ascii="Wingdings" w:hAnsi="Wingdings" w:hint="default"/>
+        <w:sz w:val="20"/>
+      </w:rPr>
+    </w:lvl>
+    <w:lvl w:ilvl="3" w:tentative="1">
+      <w:start w:val="1"/>
+      <w:numFmt w:val="bullet"/>
+      <w:lvlText w:val=""/>
+      <w:lvlJc w:val="left"/>
+      <w:pPr>
+        <w:tabs>
+          <w:tab w:val="num" w:pos="2880"/>
+        </w:tabs>
+        <w:ind w:left="2880" w:hanging="360"/>
+      </w:pPr>
+      <w:rPr>
+        <w:rFonts w:ascii="Wingdings" w:hAnsi="Wingdings" w:hint="default"/>
+        <w:sz w:val="20"/>
+      </w:rPr>
+    </w:lvl>
+    <w:lvl w:ilvl="4" w:tentative="1">
+      <w:start w:val="1"/>
+      <w:numFmt w:val="bullet"/>
+      <w:lvlText w:val=""/>
+      <w:lvlJc w:val="left"/>
+      <w:pPr>
+        <w:tabs>
+          <w:tab w:val="num" w:pos="3600"/>
+        </w:tabs>
+        <w:ind w:left="3600" w:hanging="360"/>
+      </w:pPr>
+      <w:rPr>
+        <w:rFonts w:ascii="Wingdings" w:hAnsi="Wingdings" w:hint="default"/>
+        <w:sz w:val="20"/>
+      </w:rPr>
+    </w:lvl>
+    <w:lvl w:ilvl="5" w:tentative="1">
+      <w:start w:val="1"/>
+      <w:numFmt w:val="bullet"/>
+      <w:lvlText w:val=""/>
+      <w:lvlJc w:val="left"/>
+      <w:pPr>
+        <w:tabs>
+          <w:tab w:val="num" w:pos="4320"/>
+        </w:tabs>
+        <w:ind w:left="4320" w:hanging="360"/>
+      </w:pPr>
+      <w:rPr>
+        <w:rFonts w:ascii="Wingdings" w:hAnsi="Wingdings" w:hint="default"/>
+        <w:sz w:val="20"/>
+      </w:rPr>
+    </w:lvl>
+    <w:lvl w:ilvl="6" w:tentative="1">
+      <w:start w:val="1"/>
+      <w:numFmt w:val="bullet"/>
+      <w:lvlText w:val=""/>
+      <w:lvlJc w:val="left"/>
+      <w:pPr>
+        <w:tabs>
+          <w:tab w:val="num" w:pos="5040"/>
+        </w:tabs>
+        <w:ind w:left="5040" w:hanging="360"/>
+      </w:pPr>
+      <w:rPr>
+        <w:rFonts w:ascii="Wingdings" w:hAnsi="Wingdings" w:hint="default"/>
+        <w:sz w:val="20"/>
+      </w:rPr>
+    </w:lvl>
+    <w:lvl w:ilvl="7" w:tentative="1">
+      <w:start w:val="1"/>
+      <w:numFmt w:val="bullet"/>
+      <w:lvlText w:val=""/>
+      <w:lvlJc w:val="left"/>
+      <w:pPr>
+        <w:tabs>
+          <w:tab w:val="num" w:pos="5760"/>
+        </w:tabs>
+        <w:ind w:left="5760" w:hanging="360"/>
+      </w:pPr>
+      <w:rPr>
+        <w:rFonts w:ascii="Wingdings" w:hAnsi="Wingdings" w:hint="default"/>
+        <w:sz w:val="20"/>
+      </w:rPr>
+    </w:lvl>
+    <w:lvl w:ilvl="8" w:tentative="1">
+      <w:start w:val="1"/>
+      <w:numFmt w:val="bullet"/>
+      <w:lvlText w:val=""/>
+      <w:lvlJc w:val="left"/>
+      <w:pPr>
+        <w:tabs>
+          <w:tab w:val="num" w:pos="6480"/>
+        </w:tabs>
+        <w:ind w:left="6480" w:hanging="360"/>
+      </w:pPr>
+      <w:rPr>
+        <w:rFonts w:ascii="Wingdings" w:hAnsi="Wingdings" w:hint="default"/>
+        <w:sz w:val="20"/>
+      </w:rPr>
+    </w:lvl>
+  </w:abstractNum>
+  <w:abstractNum w:abstractNumId="6" w15:restartNumberingAfterBreak="0">
     <w:nsid w:val="15587880"/>
     <w:multiLevelType w:val="multilevel"/>
     <w:tmpl w:val="174867D8"/>
@@ -2411,7 +3311,7 @@
       </w:rPr>
     </w:lvl>
   </w:abstractNum>
-  <w:abstractNum w:abstractNumId="5" w15:restartNumberingAfterBreak="0">
+  <w:abstractNum w:abstractNumId="7" w15:restartNumberingAfterBreak="0">
     <w:nsid w:val="1EA37AF4"/>
     <w:multiLevelType w:val="hybridMultilevel"/>
     <w:tmpl w:val="7DC2D9A2"/>
@@ -2524,7 +3424,305 @@
       </w:rPr>
     </w:lvl>
   </w:abstractNum>
-  <w:abstractNum w:abstractNumId="6" w15:restartNumberingAfterBreak="0">
+  <w:abstractNum w:abstractNumId="8" w15:restartNumberingAfterBreak="0">
+    <w:nsid w:val="326A5225"/>
+    <w:multiLevelType w:val="multilevel"/>
+    <w:tmpl w:val="3B7A029E"/>
+    <w:lvl w:ilvl="0">
+      <w:start w:val="1"/>
+      <w:numFmt w:val="bullet"/>
+      <w:lvlText w:val=""/>
+      <w:lvlJc w:val="left"/>
+      <w:pPr>
+        <w:tabs>
+          <w:tab w:val="num" w:pos="720"/>
+        </w:tabs>
+        <w:ind w:left="720" w:hanging="360"/>
+      </w:pPr>
+      <w:rPr>
+        <w:rFonts w:ascii="Symbol" w:hAnsi="Symbol" w:hint="default"/>
+        <w:sz w:val="20"/>
+      </w:rPr>
+    </w:lvl>
+    <w:lvl w:ilvl="1" w:tentative="1">
+      <w:start w:val="1"/>
+      <w:numFmt w:val="bullet"/>
+      <w:lvlText w:val="o"/>
+      <w:lvlJc w:val="left"/>
+      <w:pPr>
+        <w:tabs>
+          <w:tab w:val="num" w:pos="1440"/>
+        </w:tabs>
+        <w:ind w:left="1440" w:hanging="360"/>
+      </w:pPr>
+      <w:rPr>
+        <w:rFonts w:ascii="Courier New" w:hAnsi="Courier New" w:hint="default"/>
+        <w:sz w:val="20"/>
+      </w:rPr>
+    </w:lvl>
+    <w:lvl w:ilvl="2" w:tentative="1">
+      <w:start w:val="1"/>
+      <w:numFmt w:val="bullet"/>
+      <w:lvlText w:val=""/>
+      <w:lvlJc w:val="left"/>
+      <w:pPr>
+        <w:tabs>
+          <w:tab w:val="num" w:pos="2160"/>
+        </w:tabs>
+        <w:ind w:left="2160" w:hanging="360"/>
+      </w:pPr>
+      <w:rPr>
+        <w:rFonts w:ascii="Wingdings" w:hAnsi="Wingdings" w:hint="default"/>
+        <w:sz w:val="20"/>
+      </w:rPr>
+    </w:lvl>
+    <w:lvl w:ilvl="3" w:tentative="1">
+      <w:start w:val="1"/>
+      <w:numFmt w:val="bullet"/>
+      <w:lvlText w:val=""/>
+      <w:lvlJc w:val="left"/>
+      <w:pPr>
+        <w:tabs>
+          <w:tab w:val="num" w:pos="2880"/>
+        </w:tabs>
+        <w:ind w:left="2880" w:hanging="360"/>
+      </w:pPr>
+      <w:rPr>
+        <w:rFonts w:ascii="Wingdings" w:hAnsi="Wingdings" w:hint="default"/>
+        <w:sz w:val="20"/>
+      </w:rPr>
+    </w:lvl>
+    <w:lvl w:ilvl="4" w:tentative="1">
+      <w:start w:val="1"/>
+      <w:numFmt w:val="bullet"/>
+      <w:lvlText w:val=""/>
+      <w:lvlJc w:val="left"/>
+      <w:pPr>
+        <w:tabs>
+          <w:tab w:val="num" w:pos="3600"/>
+        </w:tabs>
+        <w:ind w:left="3600" w:hanging="360"/>
+      </w:pPr>
+      <w:rPr>
+        <w:rFonts w:ascii="Wingdings" w:hAnsi="Wingdings" w:hint="default"/>
+        <w:sz w:val="20"/>
+      </w:rPr>
+    </w:lvl>
+    <w:lvl w:ilvl="5" w:tentative="1">
+      <w:start w:val="1"/>
+      <w:numFmt w:val="bullet"/>
+      <w:lvlText w:val=""/>
+      <w:lvlJc w:val="left"/>
+      <w:pPr>
+        <w:tabs>
+          <w:tab w:val="num" w:pos="4320"/>
+        </w:tabs>
+        <w:ind w:left="4320" w:hanging="360"/>
+      </w:pPr>
+      <w:rPr>
+        <w:rFonts w:ascii="Wingdings" w:hAnsi="Wingdings" w:hint="default"/>
+        <w:sz w:val="20"/>
+      </w:rPr>
+    </w:lvl>
+    <w:lvl w:ilvl="6" w:tentative="1">
+      <w:start w:val="1"/>
+      <w:numFmt w:val="bullet"/>
+      <w:lvlText w:val=""/>
+      <w:lvlJc w:val="left"/>
+      <w:pPr>
+        <w:tabs>
+          <w:tab w:val="num" w:pos="5040"/>
+        </w:tabs>
+        <w:ind w:left="5040" w:hanging="360"/>
+      </w:pPr>
+      <w:rPr>
+        <w:rFonts w:ascii="Wingdings" w:hAnsi="Wingdings" w:hint="default"/>
+        <w:sz w:val="20"/>
+      </w:rPr>
+    </w:lvl>
+    <w:lvl w:ilvl="7" w:tentative="1">
+      <w:start w:val="1"/>
+      <w:numFmt w:val="bullet"/>
+      <w:lvlText w:val=""/>
+      <w:lvlJc w:val="left"/>
+      <w:pPr>
+        <w:tabs>
+          <w:tab w:val="num" w:pos="5760"/>
+        </w:tabs>
+        <w:ind w:left="5760" w:hanging="360"/>
+      </w:pPr>
+      <w:rPr>
+        <w:rFonts w:ascii="Wingdings" w:hAnsi="Wingdings" w:hint="default"/>
+        <w:sz w:val="20"/>
+      </w:rPr>
+    </w:lvl>
+    <w:lvl w:ilvl="8" w:tentative="1">
+      <w:start w:val="1"/>
+      <w:numFmt w:val="bullet"/>
+      <w:lvlText w:val=""/>
+      <w:lvlJc w:val="left"/>
+      <w:pPr>
+        <w:tabs>
+          <w:tab w:val="num" w:pos="6480"/>
+        </w:tabs>
+        <w:ind w:left="6480" w:hanging="360"/>
+      </w:pPr>
+      <w:rPr>
+        <w:rFonts w:ascii="Wingdings" w:hAnsi="Wingdings" w:hint="default"/>
+        <w:sz w:val="20"/>
+      </w:rPr>
+    </w:lvl>
+  </w:abstractNum>
+  <w:abstractNum w:abstractNumId="9" w15:restartNumberingAfterBreak="0">
+    <w:nsid w:val="39936EBE"/>
+    <w:multiLevelType w:val="multilevel"/>
+    <w:tmpl w:val="729A1254"/>
+    <w:lvl w:ilvl="0">
+      <w:start w:val="1"/>
+      <w:numFmt w:val="bullet"/>
+      <w:lvlText w:val=""/>
+      <w:lvlJc w:val="left"/>
+      <w:pPr>
+        <w:tabs>
+          <w:tab w:val="num" w:pos="720"/>
+        </w:tabs>
+        <w:ind w:left="720" w:hanging="360"/>
+      </w:pPr>
+      <w:rPr>
+        <w:rFonts w:ascii="Symbol" w:hAnsi="Symbol" w:hint="default"/>
+        <w:sz w:val="20"/>
+      </w:rPr>
+    </w:lvl>
+    <w:lvl w:ilvl="1" w:tentative="1">
+      <w:start w:val="1"/>
+      <w:numFmt w:val="bullet"/>
+      <w:lvlText w:val="o"/>
+      <w:lvlJc w:val="left"/>
+      <w:pPr>
+        <w:tabs>
+          <w:tab w:val="num" w:pos="1440"/>
+        </w:tabs>
+        <w:ind w:left="1440" w:hanging="360"/>
+      </w:pPr>
+      <w:rPr>
+        <w:rFonts w:ascii="Courier New" w:hAnsi="Courier New" w:hint="default"/>
+        <w:sz w:val="20"/>
+      </w:rPr>
+    </w:lvl>
+    <w:lvl w:ilvl="2" w:tentative="1">
+      <w:start w:val="1"/>
+      <w:numFmt w:val="bullet"/>
+      <w:lvlText w:val=""/>
+      <w:lvlJc w:val="left"/>
+      <w:pPr>
+        <w:tabs>
+          <w:tab w:val="num" w:pos="2160"/>
+        </w:tabs>
+        <w:ind w:left="2160" w:hanging="360"/>
+      </w:pPr>
+      <w:rPr>
+        <w:rFonts w:ascii="Wingdings" w:hAnsi="Wingdings" w:hint="default"/>
+        <w:sz w:val="20"/>
+      </w:rPr>
+    </w:lvl>
+    <w:lvl w:ilvl="3" w:tentative="1">
+      <w:start w:val="1"/>
+      <w:numFmt w:val="bullet"/>
+      <w:lvlText w:val=""/>
+      <w:lvlJc w:val="left"/>
+      <w:pPr>
+        <w:tabs>
+          <w:tab w:val="num" w:pos="2880"/>
+        </w:tabs>
+        <w:ind w:left="2880" w:hanging="360"/>
+      </w:pPr>
+      <w:rPr>
+        <w:rFonts w:ascii="Wingdings" w:hAnsi="Wingdings" w:hint="default"/>
+        <w:sz w:val="20"/>
+      </w:rPr>
+    </w:lvl>
+    <w:lvl w:ilvl="4" w:tentative="1">
+      <w:start w:val="1"/>
+      <w:numFmt w:val="bullet"/>
+      <w:lvlText w:val=""/>
+      <w:lvlJc w:val="left"/>
+      <w:pPr>
+        <w:tabs>
+          <w:tab w:val="num" w:pos="3600"/>
+        </w:tabs>
+        <w:ind w:left="3600" w:hanging="360"/>
+      </w:pPr>
+      <w:rPr>
+        <w:rFonts w:ascii="Wingdings" w:hAnsi="Wingdings" w:hint="default"/>
+        <w:sz w:val="20"/>
+      </w:rPr>
+    </w:lvl>
+    <w:lvl w:ilvl="5" w:tentative="1">
+      <w:start w:val="1"/>
+      <w:numFmt w:val="bullet"/>
+      <w:lvlText w:val=""/>
+      <w:lvlJc w:val="left"/>
+      <w:pPr>
+        <w:tabs>
+          <w:tab w:val="num" w:pos="4320"/>
+        </w:tabs>
+        <w:ind w:left="4320" w:hanging="360"/>
+      </w:pPr>
+      <w:rPr>
+        <w:rFonts w:ascii="Wingdings" w:hAnsi="Wingdings" w:hint="default"/>
+        <w:sz w:val="20"/>
+      </w:rPr>
+    </w:lvl>
+    <w:lvl w:ilvl="6" w:tentative="1">
+      <w:start w:val="1"/>
+      <w:numFmt w:val="bullet"/>
+      <w:lvlText w:val=""/>
+      <w:lvlJc w:val="left"/>
+      <w:pPr>
+        <w:tabs>
+          <w:tab w:val="num" w:pos="5040"/>
+        </w:tabs>
+        <w:ind w:left="5040" w:hanging="360"/>
+      </w:pPr>
+      <w:rPr>
+        <w:rFonts w:ascii="Wingdings" w:hAnsi="Wingdings" w:hint="default"/>
+        <w:sz w:val="20"/>
+      </w:rPr>
+    </w:lvl>
+    <w:lvl w:ilvl="7" w:tentative="1">
+      <w:start w:val="1"/>
+      <w:numFmt w:val="bullet"/>
+      <w:lvlText w:val=""/>
+      <w:lvlJc w:val="left"/>
+      <w:pPr>
+        <w:tabs>
+          <w:tab w:val="num" w:pos="5760"/>
+        </w:tabs>
+        <w:ind w:left="5760" w:hanging="360"/>
+      </w:pPr>
+      <w:rPr>
+        <w:rFonts w:ascii="Wingdings" w:hAnsi="Wingdings" w:hint="default"/>
+        <w:sz w:val="20"/>
+      </w:rPr>
+    </w:lvl>
+    <w:lvl w:ilvl="8" w:tentative="1">
+      <w:start w:val="1"/>
+      <w:numFmt w:val="bullet"/>
+      <w:lvlText w:val=""/>
+      <w:lvlJc w:val="left"/>
+      <w:pPr>
+        <w:tabs>
+          <w:tab w:val="num" w:pos="6480"/>
+        </w:tabs>
+        <w:ind w:left="6480" w:hanging="360"/>
+      </w:pPr>
+      <w:rPr>
+        <w:rFonts w:ascii="Wingdings" w:hAnsi="Wingdings" w:hint="default"/>
+        <w:sz w:val="20"/>
+      </w:rPr>
+    </w:lvl>
+  </w:abstractNum>
+  <w:abstractNum w:abstractNumId="10" w15:restartNumberingAfterBreak="0">
     <w:nsid w:val="3EEFADBF"/>
     <w:multiLevelType w:val="singleLevel"/>
     <w:tmpl w:val="3EEFADBF"/>
@@ -2541,7 +3739,7 @@
       </w:rPr>
     </w:lvl>
   </w:abstractNum>
-  <w:abstractNum w:abstractNumId="7" w15:restartNumberingAfterBreak="0">
+  <w:abstractNum w:abstractNumId="11" w15:restartNumberingAfterBreak="0">
     <w:nsid w:val="4DD66339"/>
     <w:multiLevelType w:val="hybridMultilevel"/>
     <w:tmpl w:val="9890303E"/>
@@ -2654,7 +3852,7 @@
       </w:rPr>
     </w:lvl>
   </w:abstractNum>
-  <w:abstractNum w:abstractNumId="8" w15:restartNumberingAfterBreak="0">
+  <w:abstractNum w:abstractNumId="12" w15:restartNumberingAfterBreak="0">
     <w:nsid w:val="54021AC3"/>
     <w:multiLevelType w:val="hybridMultilevel"/>
     <w:tmpl w:val="DDB03ED4"/>
@@ -2767,7 +3965,7 @@
       </w:rPr>
     </w:lvl>
   </w:abstractNum>
-  <w:abstractNum w:abstractNumId="9" w15:restartNumberingAfterBreak="0">
+  <w:abstractNum w:abstractNumId="13" w15:restartNumberingAfterBreak="0">
     <w:nsid w:val="56306776"/>
     <w:multiLevelType w:val="singleLevel"/>
     <w:tmpl w:val="56306776"/>
@@ -2784,7 +3982,7 @@
       </w:rPr>
     </w:lvl>
   </w:abstractNum>
-  <w:abstractNum w:abstractNumId="10" w15:restartNumberingAfterBreak="0">
+  <w:abstractNum w:abstractNumId="14" w15:restartNumberingAfterBreak="0">
     <w:nsid w:val="666330D6"/>
     <w:multiLevelType w:val="multilevel"/>
     <w:tmpl w:val="5CE66DFA"/>
@@ -2934,37 +4132,49 @@
     </w:lvl>
   </w:abstractNum>
   <w:num w:numId="1" w16cid:durableId="448402179">
-    <w:abstractNumId w:val="9"/>
+    <w:abstractNumId w:val="13"/>
   </w:num>
   <w:num w:numId="2" w16cid:durableId="1377656460">
     <w:abstractNumId w:val="0"/>
   </w:num>
   <w:num w:numId="3" w16cid:durableId="1016613346">
-    <w:abstractNumId w:val="6"/>
+    <w:abstractNumId w:val="10"/>
   </w:num>
   <w:num w:numId="4" w16cid:durableId="1288317639">
     <w:abstractNumId w:val="1"/>
   </w:num>
   <w:num w:numId="5" w16cid:durableId="1924098320">
+    <w:abstractNumId w:val="11"/>
+  </w:num>
+  <w:num w:numId="6" w16cid:durableId="74937784">
+    <w:abstractNumId w:val="12"/>
+  </w:num>
+  <w:num w:numId="7" w16cid:durableId="396173414">
+    <w:abstractNumId w:val="4"/>
+  </w:num>
+  <w:num w:numId="8" w16cid:durableId="1995912926">
     <w:abstractNumId w:val="7"/>
   </w:num>
-  <w:num w:numId="6" w16cid:durableId="74937784">
-    <w:abstractNumId w:val="8"/>
-  </w:num>
-  <w:num w:numId="7" w16cid:durableId="396173414">
-    <w:abstractNumId w:val="3"/>
-  </w:num>
-  <w:num w:numId="8" w16cid:durableId="1995912926">
-    <w:abstractNumId w:val="5"/>
-  </w:num>
   <w:num w:numId="9" w16cid:durableId="1208949627">
-    <w:abstractNumId w:val="10"/>
+    <w:abstractNumId w:val="14"/>
   </w:num>
   <w:num w:numId="10" w16cid:durableId="1205673031">
     <w:abstractNumId w:val="2"/>
   </w:num>
   <w:num w:numId="11" w16cid:durableId="868839142">
-    <w:abstractNumId w:val="4"/>
+    <w:abstractNumId w:val="6"/>
+  </w:num>
+  <w:num w:numId="12" w16cid:durableId="468012408">
+    <w:abstractNumId w:val="3"/>
+  </w:num>
+  <w:num w:numId="13" w16cid:durableId="1021860773">
+    <w:abstractNumId w:val="9"/>
+  </w:num>
+  <w:num w:numId="14" w16cid:durableId="836505575">
+    <w:abstractNumId w:val="5"/>
+  </w:num>
+  <w:num w:numId="15" w16cid:durableId="1358043813">
+    <w:abstractNumId w:val="8"/>
   </w:num>
 </w:numbering>
 </file>
@@ -3335,6 +4545,26 @@
       <w:sz w:val="32"/>
     </w:rPr>
   </w:style>
+  <w:style w:type="paragraph" w:styleId="Heading5">
+    <w:name w:val="heading 5"/>
+    <w:basedOn w:val="Normal"/>
+    <w:next w:val="Normal"/>
+    <w:link w:val="Heading5Char"/>
+    <w:semiHidden/>
+    <w:unhideWhenUsed/>
+    <w:qFormat/>
+    <w:rsid w:val="00307771"/>
+    <w:pPr>
+      <w:keepNext/>
+      <w:keepLines/>
+      <w:spacing w:before="40"/>
+      <w:outlineLvl w:val="4"/>
+    </w:pPr>
+    <w:rPr>
+      <w:rFonts w:asciiTheme="majorHAnsi" w:eastAsiaTheme="majorEastAsia" w:hAnsiTheme="majorHAnsi" w:cstheme="majorBidi"/>
+      <w:color w:val="2E74B5" w:themeColor="accent1" w:themeShade="BF"/>
+    </w:rPr>
+  </w:style>
   <w:style w:type="character" w:default="1" w:styleId="DefaultParagraphFont">
     <w:name w:val="Default Paragraph Font"/>
     <w:uiPriority w:val="1"/>
@@ -3427,6 +4657,20 @@
     <w:rPr>
       <w:color w:val="605E5C"/>
       <w:shd w:val="clear" w:color="auto" w:fill="E1DFDD"/>
+    </w:rPr>
+  </w:style>
+  <w:style w:type="character" w:customStyle="1" w:styleId="Heading5Char">
+    <w:name w:val="Heading 5 Char"/>
+    <w:basedOn w:val="DefaultParagraphFont"/>
+    <w:link w:val="Heading5"/>
+    <w:semiHidden/>
+    <w:rsid w:val="00307771"/>
+    <w:rPr>
+      <w:rFonts w:asciiTheme="majorHAnsi" w:eastAsiaTheme="majorEastAsia" w:hAnsiTheme="majorHAnsi" w:cstheme="majorBidi"/>
+      <w:color w:val="2E74B5" w:themeColor="accent1" w:themeShade="BF"/>
+      <w:kern w:val="2"/>
+      <w:sz w:val="21"/>
+      <w:szCs w:val="24"/>
     </w:rPr>
   </w:style>
 </w:styles>

</xml_diff>

<commit_message>
docs: added the P/E and P/S why to take into account when considering buying stocks.
</commit_message>
<xml_diff>
--- a/Finanace/Stock Market Investing And Trading Foundation.docx
+++ b/Finanace/Stock Market Investing And Trading Foundation.docx
@@ -439,7 +439,18 @@
         <w:t>the S&amp;</w:t>
       </w:r>
       <w:r>
-        <w:t xml:space="preserve">P Index. P/E can be estimate by trailing (backward looking) or a forward looking (future projected estimate or even call “estimate price to earnings”). P/E less than 25 is good. But the rule of thumb, the </w:t>
+        <w:t xml:space="preserve">P Index. P/E can be estimate by trailing (backward looking) or a forward looking (future projected estimate or even call “estimate price to earnings”). </w:t>
+      </w:r>
+      <w:r>
+        <w:rPr>
+          <w:b/>
+          <w:bCs/>
+          <w:color w:val="FF0000"/>
+        </w:rPr>
+        <w:t>P/E less than 25 is good</w:t>
+      </w:r>
+      <w:r>
+        <w:t xml:space="preserve">. But the rule of thumb, the </w:t>
       </w:r>
       <w:r>
         <w:rPr>
@@ -2546,16 +2557,154 @@
     </w:p>
     <w:p>
       <w:pPr>
-        <w:rPr>
-          <w:lang w:val="en-HK"/>
-        </w:rPr>
-      </w:pPr>
+        <w:ind w:left="360"/>
+        <w:rPr>
+          <w:lang w:val="en-HK"/>
+        </w:rPr>
+      </w:pPr>
+    </w:p>
+    <w:p>
+      <w:pPr>
+        <w:rPr>
+          <w:lang w:val="en-HK"/>
+        </w:rPr>
+      </w:pPr>
+    </w:p>
+    <w:p>
+      <w:pPr>
+        <w:rPr>
+          <w:lang w:val="en-HK"/>
+        </w:rPr>
+      </w:pPr>
+      <w:r>
+        <w:rPr>
+          <w:lang w:val="en-HK"/>
+        </w:rPr>
+        <w:t>Although P/E and P/S ratio each has its own usage. But for an overview and evaluation of a particular stock whether to buy or not. It is better to take into account of these two values. For instance, a retail stock, P/S ratio seems be better for evaluation, because we are looking at the company’s sales. However, if the P/S ratio is low, that is undervalued, however, we need also need to know whether the company is making a profit that is what we are talking about P/E ratio. Low P/S ratio sometimes have high P/E</w:t>
+      </w:r>
+      <w:r>
+        <w:rPr>
+          <w:lang w:val="en-HK"/>
+        </w:rPr>
+        <w:t xml:space="preserve"> ratio</w:t>
+      </w:r>
+      <w:r>
+        <w:rPr>
+          <w:lang w:val="en-HK"/>
+        </w:rPr>
+        <w:t xml:space="preserve">, which </w:t>
+      </w:r>
+      <w:r>
+        <w:rPr>
+          <w:lang w:val="en-HK"/>
+        </w:rPr>
+        <w:t>means</w:t>
+      </w:r>
+      <w:r>
+        <w:rPr>
+          <w:lang w:val="en-HK"/>
+        </w:rPr>
+        <w:t xml:space="preserve"> we have the sales but not making profit</w:t>
+      </w:r>
+      <w:r>
+        <w:rPr>
+          <w:lang w:val="en-HK"/>
+        </w:rPr>
+        <w:t xml:space="preserve">, </w:t>
+      </w:r>
+      <w:r>
+        <w:rPr>
+          <w:lang w:val="en-HK"/>
+        </w:rPr>
+        <w:t xml:space="preserve">in </w:t>
+      </w:r>
+      <w:r>
+        <w:rPr>
+          <w:lang w:val="en-HK"/>
+        </w:rPr>
+        <w:t>retail this is largely due to high store rents or high products or transportation costs or even staff’s salaries.</w:t>
+      </w:r>
+      <w:r>
+        <w:rPr>
+          <w:lang w:val="en-HK"/>
+        </w:rPr>
+        <w:t xml:space="preserve"> Therefore, taken into account of theses two figures will give you a general understanding about a company’s business. As a rule of thumb, it is best to select a stock of low P/S (high sales), and low P/</w:t>
+      </w:r>
+      <w:r>
+        <w:rPr>
+          <w:lang w:val="en-HK"/>
+        </w:rPr>
+        <w:t>E (</w:t>
+      </w:r>
+      <w:r>
+        <w:rPr>
+          <w:lang w:val="en-HK"/>
+        </w:rPr>
+        <w:t xml:space="preserve">high earnings). </w:t>
+      </w:r>
+      <w:r>
+        <w:rPr>
+          <w:lang w:val="en-HK"/>
+        </w:rPr>
+        <w:t>However, if a company has low P/S (high sales) and high P/E not earning money, does that means we are not considering this stock. No, it is up to the management of the company, based on what strategies they use, that is either switching the business from off line (store) to online, or perhaps the most effective way, increase the purchase price</w:t>
+      </w:r>
+      <w:r>
+        <w:rPr>
+          <w:lang w:val="en-HK"/>
+        </w:rPr>
+        <w:t xml:space="preserve"> for each product. </w:t>
+      </w:r>
+      <w:r>
+        <w:rPr>
+          <w:lang w:val="en-HK"/>
+        </w:rPr>
+        <w:t xml:space="preserve">   </w:t>
+      </w:r>
+      <w:r>
+        <w:rPr>
+          <w:lang w:val="en-HK"/>
+        </w:rPr>
+        <w:t xml:space="preserve"> </w:t>
+      </w:r>
+      <w:r>
+        <w:rPr>
+          <w:lang w:val="en-HK"/>
+        </w:rPr>
+        <w:t xml:space="preserve"> </w:t>
+      </w:r>
+      <w:r>
+        <w:rPr>
+          <w:lang w:val="en-HK"/>
+        </w:rPr>
+        <w:t xml:space="preserve">    </w:t>
+      </w:r>
+    </w:p>
+    <w:p>
+      <w:pPr>
+        <w:rPr>
+          <w:lang w:val="en-HK"/>
+        </w:rPr>
+      </w:pPr>
+    </w:p>
+    <w:p>
+      <w:pPr>
+        <w:widowControl/>
+        <w:jc w:val="left"/>
+        <w:rPr>
+          <w:b/>
+          <w:sz w:val="32"/>
+        </w:rPr>
+      </w:pPr>
+      <w:r>
+        <w:br w:type="page"/>
+      </w:r>
     </w:p>
     <w:p>
       <w:pPr>
         <w:pStyle w:val="Heading3"/>
       </w:pPr>
       <w:r>
+        <w:lastRenderedPageBreak/>
         <w:t>Price/Book (PB)</w:t>
       </w:r>
     </w:p>

</xml_diff>

<commit_message>
docs: Updated the P/E and P/S why to take into account when considering buying stocks.
</commit_message>
<xml_diff>
--- a/Finanace/Stock Market Investing And Trading Foundation.docx
+++ b/Finanace/Stock Market Investing And Trading Foundation.docx
@@ -2652,13 +2652,55 @@
         <w:rPr>
           <w:lang w:val="en-HK"/>
         </w:rPr>
-        <w:t xml:space="preserve"> for each product. </w:t>
-      </w:r>
-      <w:r>
-        <w:rPr>
-          <w:lang w:val="en-HK"/>
-        </w:rPr>
-        <w:t xml:space="preserve">   </w:t>
+        <w:t xml:space="preserve"> for each product.</w:t>
+      </w:r>
+      <w:r>
+        <w:rPr>
+          <w:lang w:val="en-HK"/>
+        </w:rPr>
+        <w:t xml:space="preserve"> But are there any companies has high P/S and low P/E. Yes, usually these companies come from selling luxuries, such as gold smith, high end bag store (LV, Chanel for instances). </w:t>
+      </w:r>
+      <w:r>
+        <w:rPr>
+          <w:lang w:val="en-HK"/>
+        </w:rPr>
+        <w:t>But theses companies due to low P/S, they are very sensitive or fluctuated by the surrounding economic environment</w:t>
+      </w:r>
+      <w:r>
+        <w:rPr>
+          <w:lang w:val="en-HK"/>
+        </w:rPr>
+        <w:t xml:space="preserve"> and it is not easy to increase the sales.</w:t>
+      </w:r>
+      <w:r>
+        <w:rPr>
+          <w:lang w:val="en-HK"/>
+        </w:rPr>
+        <w:t xml:space="preserve"> </w:t>
+      </w:r>
+      <w:r>
+        <w:rPr>
+          <w:lang w:val="en-HK"/>
+        </w:rPr>
+        <w:t xml:space="preserve"> </w:t>
+      </w:r>
+      <w:r>
+        <w:rPr>
+          <w:lang w:val="en-HK"/>
+        </w:rPr>
+        <w:t xml:space="preserve"> </w:t>
+      </w:r>
+      <w:r>
+        <w:rPr>
+          <w:lang w:val="en-HK"/>
+        </w:rPr>
+        <w:t xml:space="preserve"> </w:t>
+      </w:r>
+      <w:r>
+        <w:rPr>
+          <w:lang w:val="en-HK"/>
+        </w:rPr>
+        <w:t xml:space="preserve">  </w:t>
       </w:r>
       <w:r>
         <w:rPr>

</xml_diff>

<commit_message>
docs: Added P/B ratio
</commit_message>
<xml_diff>
--- a/Finanace/Stock Market Investing And Trading Foundation.docx
+++ b/Finanace/Stock Market Investing And Trading Foundation.docx
@@ -2756,6 +2756,218 @@
       </w:r>
     </w:p>
     <w:p/>
+    <w:p>
+      <m:oMathPara>
+        <m:oMath>
+          <m:r>
+            <m:rPr>
+              <m:sty m:val="p"/>
+            </m:rPr>
+            <w:rPr>
+              <w:rFonts w:ascii="Cambria Math" w:hAnsi="Cambria Math"/>
+            </w:rPr>
+            <m:t xml:space="preserve">P/B Ratio </m:t>
+          </m:r>
+          <m:r>
+            <w:rPr>
+              <w:rFonts w:ascii="Cambria Math" w:hAnsi="Cambria Math"/>
+            </w:rPr>
+            <m:t>=</m:t>
+          </m:r>
+          <m:f>
+            <m:fPr>
+              <m:ctrlPr>
+                <w:rPr>
+                  <w:rFonts w:ascii="Cambria Math" w:hAnsi="Cambria Math"/>
+                  <w:i/>
+                </w:rPr>
+              </m:ctrlPr>
+            </m:fPr>
+            <m:num>
+              <m:r>
+                <w:rPr>
+                  <w:rFonts w:ascii="Cambria Math" w:hAnsi="Cambria Math"/>
+                </w:rPr>
+                <m:t>Stock Price Per Share</m:t>
+              </m:r>
+            </m:num>
+            <m:den>
+              <m:r>
+                <w:rPr>
+                  <w:rFonts w:ascii="Cambria Math" w:hAnsi="Cambria Math"/>
+                </w:rPr>
+                <m:t>Book Value Per Share</m:t>
+              </m:r>
+            </m:den>
+          </m:f>
+        </m:oMath>
+      </m:oMathPara>
+    </w:p>
+    <w:p/>
+    <w:p>
+      <w:pPr>
+        <w:rPr>
+          <w:lang w:val="en-HK"/>
+        </w:rPr>
+      </w:pPr>
+      <w:r>
+        <w:rPr>
+          <w:lang w:val="en-HK"/>
+        </w:rPr>
+        <w:t>Where:</w:t>
+      </w:r>
+    </w:p>
+    <w:p>
+      <w:pPr>
+        <w:numPr>
+          <w:ilvl w:val="0"/>
+          <w:numId w:val="16"/>
+        </w:numPr>
+        <w:rPr>
+          <w:lang w:val="en-HK"/>
+        </w:rPr>
+      </w:pPr>
+      <w:r>
+        <w:rPr>
+          <w:lang w:val="en-HK"/>
+        </w:rPr>
+        <w:t>Market Price per Share = Current market price of the share</w:t>
+      </w:r>
+    </w:p>
+    <w:p>
+      <w:pPr>
+        <w:numPr>
+          <w:ilvl w:val="0"/>
+          <w:numId w:val="16"/>
+        </w:numPr>
+        <w:rPr>
+          <w:lang w:val="en-HK"/>
+        </w:rPr>
+      </w:pPr>
+      <w:r>
+        <w:rPr>
+          <w:lang w:val="en-HK"/>
+        </w:rPr>
+        <w:t>Book Value per Share = (Total assets - intangible assets - total liabilities) ÷ number of outstanding shares</w:t>
+      </w:r>
+      <w:r>
+        <w:rPr>
+          <w:lang w:val="en-HK"/>
+        </w:rPr>
+        <w:t>.</w:t>
+      </w:r>
+    </w:p>
+    <w:p>
+      <w:pPr>
+        <w:rPr>
+          <w:lang w:val="en-HK"/>
+        </w:rPr>
+      </w:pPr>
+    </w:p>
+    <w:p>
+      <w:r>
+        <w:t xml:space="preserve">A </w:t>
+      </w:r>
+      <w:r>
+        <w:t xml:space="preserve">company's P/B ratio </w:t>
+      </w:r>
+      <w:r>
+        <w:rPr>
+          <w:color w:val="FF0000"/>
+        </w:rPr>
+        <w:t>can dive below a value of 1.0</w:t>
+      </w:r>
+      <w:r>
+        <w:t>, which means the market value is lower than the book value. Usually, investors</w:t>
+      </w:r>
+      <w:r>
+        <w:t xml:space="preserve"> hope to be rewarded when the market realizes the stock is undervalued and returns its price to where it should b</w:t>
+      </w:r>
+      <w:r>
+        <w:t>e.</w:t>
+      </w:r>
+      <w:r>
+        <w:rPr>
+          <w:lang w:val="en-HK"/>
+        </w:rPr>
+        <w:t xml:space="preserve"> An</w:t>
+      </w:r>
+      <w:r>
+        <w:rPr>
+          <w:lang w:val="en-HK"/>
+        </w:rPr>
+        <w:t xml:space="preserve"> example, in most cases, companies must expense research and development costs, </w:t>
+      </w:r>
+      <w:r>
+        <w:rPr>
+          <w:color w:val="FF0000"/>
+          <w:lang w:val="en-HK"/>
+        </w:rPr>
+        <w:t xml:space="preserve">reducing book value </w:t>
+      </w:r>
+      <w:r>
+        <w:rPr>
+          <w:lang w:val="en-HK"/>
+        </w:rPr>
+        <w:t>because this includes the expenses on the balance sheet. However, these R&amp;D outlays can create unique production processes for a company or result in new patents that can bring royalty revenues.</w:t>
+      </w:r>
+      <w:r>
+        <w:t xml:space="preserve"> </w:t>
+      </w:r>
+      <w:r>
+        <w:rPr>
+          <w:lang w:val="en-HK"/>
+        </w:rPr>
+        <w:t xml:space="preserve">While accounting principles </w:t>
+      </w:r>
+      <w:r>
+        <w:rPr>
+          <w:lang w:val="en-HK"/>
+        </w:rPr>
+        <w:t>f</w:t>
+      </w:r>
+      <w:r>
+        <w:rPr>
+          <w:lang w:val="en-HK"/>
+        </w:rPr>
+        <w:t>avour a conservative approach in capitalizing costs, market participants may raise the stock price because of such R&amp;D efforts, resulting in wide differences between the market and book values of equity.</w:t>
+      </w:r>
+    </w:p>
+    <w:p>
+      <w:pPr>
+        <w:rPr>
+          <w:lang w:val="en-HK"/>
+        </w:rPr>
+      </w:pPr>
+    </w:p>
+    <w:p/>
+    <w:p>
+      <w:pPr>
+        <w:rPr>
+          <w:lang w:val="en-HK"/>
+        </w:rPr>
+      </w:pPr>
+      <w:r>
+        <w:t xml:space="preserve">The P/B ratio has been favored by value investors for decades and is widely used by market analysts. Traditionally, any value under 1.0 is considered desirable for value investors, indicating an undervalued stock may have been identified. However, some value investors may often consider stocks with a less stringent P/B value of less than </w:t>
+      </w:r>
+      <w:r>
+        <w:rPr>
+          <w:b/>
+          <w:bCs/>
+        </w:rPr>
+        <w:t xml:space="preserve">3.0 </w:t>
+      </w:r>
+      <w:r>
+        <w:t>as their benchmark.</w:t>
+      </w:r>
+    </w:p>
+    <w:p>
+      <w:pPr>
+        <w:rPr>
+          <w:lang w:val="en-HK"/>
+        </w:rPr>
+      </w:pPr>
+    </w:p>
     <w:p/>
     <w:p/>
     <w:p>
@@ -3781,6 +3993,155 @@
     </w:lvl>
   </w:abstractNum>
   <w:abstractNum w:abstractNumId="9" w15:restartNumberingAfterBreak="0">
+    <w:nsid w:val="381F42E7"/>
+    <w:multiLevelType w:val="multilevel"/>
+    <w:tmpl w:val="BA24A55C"/>
+    <w:lvl w:ilvl="0">
+      <w:start w:val="1"/>
+      <w:numFmt w:val="bullet"/>
+      <w:lvlText w:val=""/>
+      <w:lvlJc w:val="left"/>
+      <w:pPr>
+        <w:tabs>
+          <w:tab w:val="num" w:pos="720"/>
+        </w:tabs>
+        <w:ind w:left="720" w:hanging="360"/>
+      </w:pPr>
+      <w:rPr>
+        <w:rFonts w:ascii="Symbol" w:hAnsi="Symbol" w:hint="default"/>
+        <w:sz w:val="20"/>
+      </w:rPr>
+    </w:lvl>
+    <w:lvl w:ilvl="1" w:tentative="1">
+      <w:start w:val="1"/>
+      <w:numFmt w:val="bullet"/>
+      <w:lvlText w:val=""/>
+      <w:lvlJc w:val="left"/>
+      <w:pPr>
+        <w:tabs>
+          <w:tab w:val="num" w:pos="1440"/>
+        </w:tabs>
+        <w:ind w:left="1440" w:hanging="360"/>
+      </w:pPr>
+      <w:rPr>
+        <w:rFonts w:ascii="Symbol" w:hAnsi="Symbol" w:hint="default"/>
+        <w:sz w:val="20"/>
+      </w:rPr>
+    </w:lvl>
+    <w:lvl w:ilvl="2" w:tentative="1">
+      <w:start w:val="1"/>
+      <w:numFmt w:val="bullet"/>
+      <w:lvlText w:val=""/>
+      <w:lvlJc w:val="left"/>
+      <w:pPr>
+        <w:tabs>
+          <w:tab w:val="num" w:pos="2160"/>
+        </w:tabs>
+        <w:ind w:left="2160" w:hanging="360"/>
+      </w:pPr>
+      <w:rPr>
+        <w:rFonts w:ascii="Symbol" w:hAnsi="Symbol" w:hint="default"/>
+        <w:sz w:val="20"/>
+      </w:rPr>
+    </w:lvl>
+    <w:lvl w:ilvl="3" w:tentative="1">
+      <w:start w:val="1"/>
+      <w:numFmt w:val="bullet"/>
+      <w:lvlText w:val=""/>
+      <w:lvlJc w:val="left"/>
+      <w:pPr>
+        <w:tabs>
+          <w:tab w:val="num" w:pos="2880"/>
+        </w:tabs>
+        <w:ind w:left="2880" w:hanging="360"/>
+      </w:pPr>
+      <w:rPr>
+        <w:rFonts w:ascii="Symbol" w:hAnsi="Symbol" w:hint="default"/>
+        <w:sz w:val="20"/>
+      </w:rPr>
+    </w:lvl>
+    <w:lvl w:ilvl="4" w:tentative="1">
+      <w:start w:val="1"/>
+      <w:numFmt w:val="bullet"/>
+      <w:lvlText w:val=""/>
+      <w:lvlJc w:val="left"/>
+      <w:pPr>
+        <w:tabs>
+          <w:tab w:val="num" w:pos="3600"/>
+        </w:tabs>
+        <w:ind w:left="3600" w:hanging="360"/>
+      </w:pPr>
+      <w:rPr>
+        <w:rFonts w:ascii="Symbol" w:hAnsi="Symbol" w:hint="default"/>
+        <w:sz w:val="20"/>
+      </w:rPr>
+    </w:lvl>
+    <w:lvl w:ilvl="5" w:tentative="1">
+      <w:start w:val="1"/>
+      <w:numFmt w:val="bullet"/>
+      <w:lvlText w:val=""/>
+      <w:lvlJc w:val="left"/>
+      <w:pPr>
+        <w:tabs>
+          <w:tab w:val="num" w:pos="4320"/>
+        </w:tabs>
+        <w:ind w:left="4320" w:hanging="360"/>
+      </w:pPr>
+      <w:rPr>
+        <w:rFonts w:ascii="Symbol" w:hAnsi="Symbol" w:hint="default"/>
+        <w:sz w:val="20"/>
+      </w:rPr>
+    </w:lvl>
+    <w:lvl w:ilvl="6" w:tentative="1">
+      <w:start w:val="1"/>
+      <w:numFmt w:val="bullet"/>
+      <w:lvlText w:val=""/>
+      <w:lvlJc w:val="left"/>
+      <w:pPr>
+        <w:tabs>
+          <w:tab w:val="num" w:pos="5040"/>
+        </w:tabs>
+        <w:ind w:left="5040" w:hanging="360"/>
+      </w:pPr>
+      <w:rPr>
+        <w:rFonts w:ascii="Symbol" w:hAnsi="Symbol" w:hint="default"/>
+        <w:sz w:val="20"/>
+      </w:rPr>
+    </w:lvl>
+    <w:lvl w:ilvl="7" w:tentative="1">
+      <w:start w:val="1"/>
+      <w:numFmt w:val="bullet"/>
+      <w:lvlText w:val=""/>
+      <w:lvlJc w:val="left"/>
+      <w:pPr>
+        <w:tabs>
+          <w:tab w:val="num" w:pos="5760"/>
+        </w:tabs>
+        <w:ind w:left="5760" w:hanging="360"/>
+      </w:pPr>
+      <w:rPr>
+        <w:rFonts w:ascii="Symbol" w:hAnsi="Symbol" w:hint="default"/>
+        <w:sz w:val="20"/>
+      </w:rPr>
+    </w:lvl>
+    <w:lvl w:ilvl="8" w:tentative="1">
+      <w:start w:val="1"/>
+      <w:numFmt w:val="bullet"/>
+      <w:lvlText w:val=""/>
+      <w:lvlJc w:val="left"/>
+      <w:pPr>
+        <w:tabs>
+          <w:tab w:val="num" w:pos="6480"/>
+        </w:tabs>
+        <w:ind w:left="6480" w:hanging="360"/>
+      </w:pPr>
+      <w:rPr>
+        <w:rFonts w:ascii="Symbol" w:hAnsi="Symbol" w:hint="default"/>
+        <w:sz w:val="20"/>
+      </w:rPr>
+    </w:lvl>
+  </w:abstractNum>
+  <w:abstractNum w:abstractNumId="10" w15:restartNumberingAfterBreak="0">
     <w:nsid w:val="39936EBE"/>
     <w:multiLevelType w:val="multilevel"/>
     <w:tmpl w:val="729A1254"/>
@@ -3929,7 +4290,7 @@
       </w:rPr>
     </w:lvl>
   </w:abstractNum>
-  <w:abstractNum w:abstractNumId="10" w15:restartNumberingAfterBreak="0">
+  <w:abstractNum w:abstractNumId="11" w15:restartNumberingAfterBreak="0">
     <w:nsid w:val="3EEFADBF"/>
     <w:multiLevelType w:val="singleLevel"/>
     <w:tmpl w:val="3EEFADBF"/>
@@ -3946,7 +4307,7 @@
       </w:rPr>
     </w:lvl>
   </w:abstractNum>
-  <w:abstractNum w:abstractNumId="11" w15:restartNumberingAfterBreak="0">
+  <w:abstractNum w:abstractNumId="12" w15:restartNumberingAfterBreak="0">
     <w:nsid w:val="4DD66339"/>
     <w:multiLevelType w:val="hybridMultilevel"/>
     <w:tmpl w:val="9890303E"/>
@@ -4059,7 +4420,7 @@
       </w:rPr>
     </w:lvl>
   </w:abstractNum>
-  <w:abstractNum w:abstractNumId="12" w15:restartNumberingAfterBreak="0">
+  <w:abstractNum w:abstractNumId="13" w15:restartNumberingAfterBreak="0">
     <w:nsid w:val="54021AC3"/>
     <w:multiLevelType w:val="hybridMultilevel"/>
     <w:tmpl w:val="DDB03ED4"/>
@@ -4172,7 +4533,7 @@
       </w:rPr>
     </w:lvl>
   </w:abstractNum>
-  <w:abstractNum w:abstractNumId="13" w15:restartNumberingAfterBreak="0">
+  <w:abstractNum w:abstractNumId="14" w15:restartNumberingAfterBreak="0">
     <w:nsid w:val="56306776"/>
     <w:multiLevelType w:val="singleLevel"/>
     <w:tmpl w:val="56306776"/>
@@ -4189,7 +4550,7 @@
       </w:rPr>
     </w:lvl>
   </w:abstractNum>
-  <w:abstractNum w:abstractNumId="14" w15:restartNumberingAfterBreak="0">
+  <w:abstractNum w:abstractNumId="15" w15:restartNumberingAfterBreak="0">
     <w:nsid w:val="666330D6"/>
     <w:multiLevelType w:val="multilevel"/>
     <w:tmpl w:val="5CE66DFA"/>
@@ -4339,22 +4700,22 @@
     </w:lvl>
   </w:abstractNum>
   <w:num w:numId="1" w16cid:durableId="448402179">
-    <w:abstractNumId w:val="13"/>
+    <w:abstractNumId w:val="14"/>
   </w:num>
   <w:num w:numId="2" w16cid:durableId="1377656460">
     <w:abstractNumId w:val="0"/>
   </w:num>
   <w:num w:numId="3" w16cid:durableId="1016613346">
-    <w:abstractNumId w:val="10"/>
+    <w:abstractNumId w:val="11"/>
   </w:num>
   <w:num w:numId="4" w16cid:durableId="1288317639">
     <w:abstractNumId w:val="1"/>
   </w:num>
   <w:num w:numId="5" w16cid:durableId="1924098320">
-    <w:abstractNumId w:val="11"/>
+    <w:abstractNumId w:val="12"/>
   </w:num>
   <w:num w:numId="6" w16cid:durableId="74937784">
-    <w:abstractNumId w:val="12"/>
+    <w:abstractNumId w:val="13"/>
   </w:num>
   <w:num w:numId="7" w16cid:durableId="396173414">
     <w:abstractNumId w:val="4"/>
@@ -4363,7 +4724,7 @@
     <w:abstractNumId w:val="7"/>
   </w:num>
   <w:num w:numId="9" w16cid:durableId="1208949627">
-    <w:abstractNumId w:val="14"/>
+    <w:abstractNumId w:val="15"/>
   </w:num>
   <w:num w:numId="10" w16cid:durableId="1205673031">
     <w:abstractNumId w:val="2"/>
@@ -4375,13 +4736,16 @@
     <w:abstractNumId w:val="3"/>
   </w:num>
   <w:num w:numId="13" w16cid:durableId="1021860773">
-    <w:abstractNumId w:val="9"/>
+    <w:abstractNumId w:val="10"/>
   </w:num>
   <w:num w:numId="14" w16cid:durableId="836505575">
     <w:abstractNumId w:val="5"/>
   </w:num>
   <w:num w:numId="15" w16cid:durableId="1358043813">
     <w:abstractNumId w:val="8"/>
+  </w:num>
+  <w:num w:numId="16" w16cid:durableId="920258597">
+    <w:abstractNumId w:val="9"/>
   </w:num>
 </w:numbering>
 </file>

</xml_diff>

<commit_message>
docs: Added ratio definition.
</commit_message>
<xml_diff>
--- a/Finanace/Stock Market Investing And Trading Foundation.docx
+++ b/Finanace/Stock Market Investing And Trading Foundation.docx
@@ -415,6 +415,354 @@
       </w:r>
       <w:r>
         <w:t>)</w:t>
+      </w:r>
+    </w:p>
+    <w:p>
+      <w:pPr>
+        <w:widowControl/>
+        <w:jc w:val="left"/>
+      </w:pPr>
+    </w:p>
+    <w:p>
+      <w:pPr>
+        <w:widowControl/>
+        <w:jc w:val="left"/>
+      </w:pPr>
+    </w:p>
+    <w:p>
+      <w:pPr>
+        <w:widowControl/>
+        <w:jc w:val="left"/>
+        <w:rPr>
+          <w:b/>
+          <w:bCs/>
+          <w:sz w:val="32"/>
+          <w:szCs w:val="32"/>
+          <w:lang w:val="en-HK"/>
+        </w:rPr>
+      </w:pPr>
+      <w:r>
+        <w:rPr>
+          <w:b/>
+          <w:bCs/>
+          <w:sz w:val="32"/>
+          <w:szCs w:val="32"/>
+          <w:lang w:val="en-HK"/>
+        </w:rPr>
+        <w:t>W</w:t>
+      </w:r>
+      <w:r>
+        <w:rPr>
+          <w:b/>
+          <w:bCs/>
+          <w:sz w:val="32"/>
+          <w:szCs w:val="32"/>
+          <w:lang w:val="en-HK"/>
+        </w:rPr>
+        <w:t>hat is ratio, how to interpret 1:1.9</w:t>
+      </w:r>
+      <w:r>
+        <w:rPr>
+          <w:b/>
+          <w:bCs/>
+          <w:sz w:val="32"/>
+          <w:szCs w:val="32"/>
+          <w:lang w:val="en-HK"/>
+        </w:rPr>
+        <w:t xml:space="preserve"> or 1/1.9</w:t>
+      </w:r>
+      <w:r>
+        <w:rPr>
+          <w:b/>
+          <w:bCs/>
+          <w:sz w:val="32"/>
+          <w:szCs w:val="32"/>
+          <w:lang w:val="en-HK"/>
+        </w:rPr>
+        <w:t>?</w:t>
+      </w:r>
+    </w:p>
+    <w:p>
+      <w:pPr>
+        <w:widowControl/>
+        <w:jc w:val="left"/>
+      </w:pPr>
+    </w:p>
+    <w:p>
+      <w:pPr>
+        <w:widowControl/>
+        <w:jc w:val="left"/>
+        <w:rPr>
+          <w:lang w:val="en-HK"/>
+        </w:rPr>
+      </w:pPr>
+      <w:r>
+        <w:rPr>
+          <w:lang w:val="en-HK"/>
+        </w:rPr>
+        <w:t>A ratio is a way to compare two quantities by showing the relative size of one quantity to another. It is often written in the form (</w:t>
+      </w:r>
+      <w:proofErr w:type="spellStart"/>
+      <w:r>
+        <w:rPr>
+          <w:lang w:val="en-HK"/>
+        </w:rPr>
+        <w:t>a:b</w:t>
+      </w:r>
+      <w:proofErr w:type="spellEnd"/>
+      <w:r>
+        <w:rPr>
+          <w:lang w:val="en-HK"/>
+        </w:rPr>
+        <w:t>) or as a fraction (\frac{a}{b}).</w:t>
+      </w:r>
+    </w:p>
+    <w:p>
+      <w:pPr>
+        <w:widowControl/>
+        <w:jc w:val="left"/>
+        <w:rPr>
+          <w:lang w:val="en-HK"/>
+        </w:rPr>
+      </w:pPr>
+      <w:r>
+        <w:rPr>
+          <w:lang w:val="en-HK"/>
+        </w:rPr>
+        <w:t>In the ratio 1:1.9, it means for every 1 unit of the first quantity, there are 1.9 units of the second quantity. Here’s how you can interpret it:</w:t>
+      </w:r>
+    </w:p>
+    <w:p>
+      <w:pPr>
+        <w:widowControl/>
+        <w:numPr>
+          <w:ilvl w:val="0"/>
+          <w:numId w:val="17"/>
+        </w:numPr>
+        <w:jc w:val="left"/>
+        <w:rPr>
+          <w:lang w:val="en-HK"/>
+        </w:rPr>
+      </w:pPr>
+      <w:r>
+        <w:rPr>
+          <w:lang w:val="en-HK"/>
+        </w:rPr>
+        <w:t>If you have 1 apple, you would have 1.9 oranges.</w:t>
+      </w:r>
+    </w:p>
+    <w:p>
+      <w:pPr>
+        <w:widowControl/>
+        <w:numPr>
+          <w:ilvl w:val="0"/>
+          <w:numId w:val="17"/>
+        </w:numPr>
+        <w:jc w:val="left"/>
+        <w:rPr>
+          <w:lang w:val="en-HK"/>
+        </w:rPr>
+      </w:pPr>
+      <w:r>
+        <w:rPr>
+          <w:lang w:val="en-HK"/>
+        </w:rPr>
+        <w:t>For every 1 dollar invested, you would get 1.9 dollars in return.</w:t>
+      </w:r>
+    </w:p>
+    <w:p>
+      <w:pPr>
+        <w:widowControl/>
+        <w:numPr>
+          <w:ilvl w:val="0"/>
+          <w:numId w:val="17"/>
+        </w:numPr>
+        <w:jc w:val="left"/>
+        <w:rPr>
+          <w:lang w:val="en-HK"/>
+        </w:rPr>
+      </w:pPr>
+      <w:r>
+        <w:rPr>
+          <w:lang w:val="en-HK"/>
+        </w:rPr>
+        <w:t>In a recipe, for every 1 cup of flour, you would use 1.9 cups of sugar.</w:t>
+      </w:r>
+    </w:p>
+    <w:p>
+      <w:pPr>
+        <w:widowControl/>
+        <w:jc w:val="left"/>
+        <w:rPr>
+          <w:lang w:val="en-HK"/>
+        </w:rPr>
+      </w:pPr>
+    </w:p>
+    <w:p>
+      <w:pPr>
+        <w:pStyle w:val="Heading3"/>
+        <w:rPr>
+          <w:b w:val="0"/>
+          <w:bCs/>
+          <w:sz w:val="21"/>
+          <w:szCs w:val="21"/>
+        </w:rPr>
+      </w:pPr>
+      <w:r>
+        <w:rPr>
+          <w:b w:val="0"/>
+          <w:bCs/>
+          <w:sz w:val="21"/>
+          <w:szCs w:val="21"/>
+        </w:rPr>
+        <w:lastRenderedPageBreak/>
+        <w:t>Price/Earnings (P</w:t>
+      </w:r>
+      <w:r>
+        <w:rPr>
+          <w:b w:val="0"/>
+          <w:bCs/>
+          <w:sz w:val="21"/>
+          <w:szCs w:val="21"/>
+        </w:rPr>
+        <w:t>/</w:t>
+      </w:r>
+      <w:r>
+        <w:rPr>
+          <w:b w:val="0"/>
+          <w:bCs/>
+          <w:sz w:val="21"/>
+          <w:szCs w:val="21"/>
+        </w:rPr>
+        <w:t>E)</w:t>
+      </w:r>
+      <w:r>
+        <w:rPr>
+          <w:b w:val="0"/>
+          <w:bCs/>
+          <w:sz w:val="21"/>
+          <w:szCs w:val="21"/>
+        </w:rPr>
+        <w:t xml:space="preserve"> </w:t>
+      </w:r>
+      <w:r>
+        <w:rPr>
+          <w:b w:val="0"/>
+          <w:bCs/>
+          <w:sz w:val="21"/>
+          <w:szCs w:val="21"/>
+        </w:rPr>
+        <w:t xml:space="preserve">1:1.9 (a ratio of 0.526) – For a stock, for a price of $1 you would have $1.9 dollar </w:t>
+      </w:r>
+      <w:r>
+        <w:rPr>
+          <w:b w:val="0"/>
+          <w:bCs/>
+          <w:sz w:val="21"/>
+          <w:szCs w:val="21"/>
+        </w:rPr>
+        <w:t xml:space="preserve">of </w:t>
+      </w:r>
+      <w:r>
+        <w:rPr>
+          <w:b w:val="0"/>
+          <w:bCs/>
+          <w:sz w:val="21"/>
+          <w:szCs w:val="21"/>
+        </w:rPr>
+        <w:t xml:space="preserve">earnings.   </w:t>
+      </w:r>
+    </w:p>
+    <w:p>
+      <w:pPr>
+        <w:pStyle w:val="Heading3"/>
+        <w:rPr>
+          <w:b w:val="0"/>
+          <w:bCs/>
+          <w:sz w:val="21"/>
+          <w:szCs w:val="21"/>
+        </w:rPr>
+      </w:pPr>
+      <w:r>
+        <w:rPr>
+          <w:b w:val="0"/>
+          <w:bCs/>
+          <w:sz w:val="21"/>
+          <w:szCs w:val="21"/>
+        </w:rPr>
+        <w:t>Price/</w:t>
+      </w:r>
+      <w:r>
+        <w:rPr>
+          <w:b w:val="0"/>
+          <w:bCs/>
+          <w:sz w:val="21"/>
+          <w:szCs w:val="21"/>
+        </w:rPr>
+        <w:t>Sales</w:t>
+      </w:r>
+      <w:r>
+        <w:rPr>
+          <w:b w:val="0"/>
+          <w:bCs/>
+          <w:sz w:val="21"/>
+          <w:szCs w:val="21"/>
+        </w:rPr>
+        <w:t xml:space="preserve"> (P</w:t>
+      </w:r>
+      <w:r>
+        <w:rPr>
+          <w:b w:val="0"/>
+          <w:bCs/>
+          <w:sz w:val="21"/>
+          <w:szCs w:val="21"/>
+        </w:rPr>
+        <w:t>/S</w:t>
+      </w:r>
+      <w:r>
+        <w:rPr>
+          <w:b w:val="0"/>
+          <w:bCs/>
+          <w:sz w:val="21"/>
+          <w:szCs w:val="21"/>
+        </w:rPr>
+        <w:t xml:space="preserve">) </w:t>
+      </w:r>
+      <w:r>
+        <w:rPr>
+          <w:b w:val="0"/>
+          <w:bCs/>
+          <w:sz w:val="21"/>
+          <w:szCs w:val="21"/>
+        </w:rPr>
+        <w:t xml:space="preserve">1:1.9 (a ratio of 0.526) – For a stock, for a price of $1 you would have $1.9 dollar </w:t>
+      </w:r>
+      <w:r>
+        <w:rPr>
+          <w:b w:val="0"/>
+          <w:bCs/>
+          <w:sz w:val="21"/>
+          <w:szCs w:val="21"/>
+        </w:rPr>
+        <w:t xml:space="preserve">of </w:t>
+      </w:r>
+      <w:r>
+        <w:rPr>
+          <w:b w:val="0"/>
+          <w:bCs/>
+          <w:sz w:val="21"/>
+          <w:szCs w:val="21"/>
+        </w:rPr>
+        <w:t>sales</w:t>
+      </w:r>
+      <w:r>
+        <w:rPr>
+          <w:b w:val="0"/>
+          <w:bCs/>
+          <w:sz w:val="21"/>
+          <w:szCs w:val="21"/>
+        </w:rPr>
+        <w:t xml:space="preserve">.   </w:t>
       </w:r>
     </w:p>
     <w:p>
@@ -560,7 +908,6 @@
     <w:p/>
     <w:p>
       <w:r>
-        <w:lastRenderedPageBreak/>
         <w:t xml:space="preserve">From the formula, market value per share means the stock price, earning per share (EPS) is the value </w:t>
       </w:r>
       <w:r>
@@ -819,148 +1166,131 @@
     <w:p/>
     <w:p>
       <w:pPr>
+        <w:pStyle w:val="Heading3"/>
+      </w:pPr>
+      <w:r>
+        <w:t>Relative P/E</w:t>
+      </w:r>
+    </w:p>
+    <w:p>
+      <w:r>
+        <w:t xml:space="preserve">The relative P/E compares the absolute P/E to the benchmark or a range of past previous P/E over a relevant time period, such as past 10 years. The relative P/E shows what portions or percentage of the past P/Es. The relative P/E usually compares the current P/E to the highest P/E of a given time period. Sometimes </w:t>
+      </w:r>
+      <w:r>
+        <w:t>investors</w:t>
+      </w:r>
+      <w:r>
+        <w:t xml:space="preserve"> could even </w:t>
+      </w:r>
+      <w:r>
+        <w:t>compare</w:t>
+      </w:r>
+      <w:r>
+        <w:t xml:space="preserve"> the current P/E to the lowest P/E range, which indicates how close the current P/E is to the historic low. P/E below 100% if the current P/E is lower than the historical P/E range, P/E above 100% tells the investor the current P/E pass or surpass the past value.</w:t>
+      </w:r>
+    </w:p>
+    <w:p/>
+    <w:p>
+      <w:pPr>
+        <w:pStyle w:val="Heading3"/>
+      </w:pPr>
+      <w:r>
+        <w:t>Limitations Of P/E</w:t>
+      </w:r>
+    </w:p>
+    <w:p>
+      <w:r>
+        <w:t xml:space="preserve">One primary </w:t>
+      </w:r>
+      <w:r>
+        <w:t>limitation</w:t>
+      </w:r>
+      <w:r>
+        <w:t xml:space="preserve"> of P/E is when comparing P/E with P/E ratios of different companies. Valuation growth rates of companies often vary between sectors due to </w:t>
+      </w:r>
+      <w:r>
+        <w:t>the different</w:t>
+      </w:r>
+      <w:r>
+        <w:t xml:space="preserve"> way companies earn money and different timeline. As such, one should use P/E as a comparative tool when comparing companies with the same sector.  </w:t>
+      </w:r>
+    </w:p>
+    <w:p/>
+    <w:p>
+      <w:pPr>
+        <w:pStyle w:val="Heading3"/>
+      </w:pPr>
+      <w:r>
+        <w:lastRenderedPageBreak/>
+        <w:t>Pros of P/E</w:t>
+      </w:r>
+    </w:p>
+    <w:p>
+      <w:r>
+        <w:t xml:space="preserve">Investors can valuate short to </w:t>
+      </w:r>
+      <w:r>
+        <w:t>long-term</w:t>
+      </w:r>
+      <w:r>
+        <w:t xml:space="preserve"> valuation trends such as P/E 10 to P/E 30, which the average of 10 to 30 years. The benefit of long-term measures can </w:t>
+      </w:r>
+      <w:r>
+        <w:t>compensate for</w:t>
+      </w:r>
+      <w:r>
+        <w:t xml:space="preserve"> the changes or fruition of the business cycle. Can be used as a tool for the company’s future </w:t>
+      </w:r>
+      <w:r>
+        <w:t>estimates</w:t>
+      </w:r>
+      <w:r>
+        <w:t xml:space="preserve">, which provides a clear picture of what earnings will look like, without changes or accounting adjustment. </w:t>
+      </w:r>
+    </w:p>
+    <w:p/>
+    <w:p>
+      <w:pPr>
+        <w:pStyle w:val="Heading3"/>
+      </w:pPr>
+      <w:r>
+        <w:t>Cons of P/E</w:t>
+      </w:r>
+    </w:p>
+    <w:p>
+      <w:r>
+        <w:t xml:space="preserve">Companies sometimes inherit problems with the forward P/E metrics, namely, to underestimate the earnings in order to beat the estimate P/E ratio, for the next </w:t>
+      </w:r>
+      <w:r>
+        <w:t>quarter’s</w:t>
+      </w:r>
+      <w:r>
+        <w:t xml:space="preserve"> </w:t>
+      </w:r>
+      <w:r>
+        <w:t>earnings</w:t>
+      </w:r>
+      <w:r>
+        <w:t xml:space="preserve"> announcement.  </w:t>
+      </w:r>
+    </w:p>
+    <w:p>
+      <w:r>
+        <w:t xml:space="preserve">Other companies could even overestimate the P/E ratio and made adjustment later in </w:t>
+      </w:r>
+      <w:r>
+        <w:t>the next</w:t>
+      </w:r>
+      <w:r>
+        <w:t xml:space="preserve"> quarter announcement. External analyst also provides P/E ratio estimate which may diverge from the company’s estimate which creates confusion. Companies sometimes could also provide inaccurate estimate P/E ratio, that’s why most investors prefer to choose the trailing P/E ratios. Furthermore, past performance doesn’t signal future behaviors.</w:t>
+      </w:r>
+    </w:p>
+    <w:p/>
+    <w:p>
+      <w:pPr>
         <w:widowControl/>
         <w:jc w:val="left"/>
-        <w:rPr>
-          <w:b/>
-          <w:sz w:val="32"/>
-        </w:rPr>
-      </w:pPr>
-      <w:r>
-        <w:br w:type="page"/>
-      </w:r>
-    </w:p>
-    <w:p>
-      <w:pPr>
-        <w:pStyle w:val="Heading3"/>
-      </w:pPr>
-      <w:r>
-        <w:lastRenderedPageBreak/>
-        <w:t>Relative P/E</w:t>
-      </w:r>
-    </w:p>
-    <w:p>
-      <w:r>
-        <w:t xml:space="preserve">The relative P/E compares the absolute P/E to the benchmark or a range of past previous P/E over a relevant time period, such as past 10 years. The relative P/E shows what portions or percentage of the past P/Es. The relative P/E usually compares the current P/E to the highest P/E of a given time period. Sometimes </w:t>
-      </w:r>
-      <w:r>
-        <w:t>investors</w:t>
-      </w:r>
-      <w:r>
-        <w:t xml:space="preserve"> could even </w:t>
-      </w:r>
-      <w:r>
-        <w:t>compare</w:t>
-      </w:r>
-      <w:r>
-        <w:t xml:space="preserve"> the current P/E to the lowest P/E range, which indicates how close the current P/E is to the historic low. P/E below 100% if the current P/E is lower than the historical P/E range, P/E above 100% tells the investor the current P/E pass or surpass the past value.</w:t>
-      </w:r>
-    </w:p>
-    <w:p/>
-    <w:p>
-      <w:pPr>
-        <w:pStyle w:val="Heading3"/>
-      </w:pPr>
-      <w:r>
-        <w:t>Limitations Of P/E</w:t>
-      </w:r>
-    </w:p>
-    <w:p>
-      <w:r>
-        <w:t xml:space="preserve">One primary </w:t>
-      </w:r>
-      <w:r>
-        <w:t>limitation</w:t>
-      </w:r>
-      <w:r>
-        <w:t xml:space="preserve"> of P/E is when comparing P/E with P/E ratios of different companies. Valuation growth rates of companies often vary between sectors due to </w:t>
-      </w:r>
-      <w:r>
-        <w:t>the different</w:t>
-      </w:r>
-      <w:r>
-        <w:t xml:space="preserve"> way companies earn money and different timeline. As such, one should use P/E as a comparative tool when comparing companies with the same sector.  </w:t>
-      </w:r>
-    </w:p>
-    <w:p/>
-    <w:p>
-      <w:pPr>
-        <w:pStyle w:val="Heading3"/>
-      </w:pPr>
-      <w:r>
-        <w:t>Pros of P/E</w:t>
-      </w:r>
-    </w:p>
-    <w:p>
-      <w:r>
-        <w:t xml:space="preserve">Investors can valuate short to </w:t>
-      </w:r>
-      <w:r>
-        <w:t>long-term</w:t>
-      </w:r>
-      <w:r>
-        <w:t xml:space="preserve"> valuation trends such as P/E 10 to P/E 30, which the average of 10 to 30 years. The benefit of long-term measures can </w:t>
-      </w:r>
-      <w:r>
-        <w:t>compensate for</w:t>
-      </w:r>
-      <w:r>
-        <w:t xml:space="preserve"> the changes or fruition of the business cycle. Can be used as a tool for the company’s future </w:t>
-      </w:r>
-      <w:r>
-        <w:t>estimates</w:t>
-      </w:r>
-      <w:r>
-        <w:t xml:space="preserve">, which provides a clear picture of what earnings will look like, without changes or accounting adjustment. </w:t>
-      </w:r>
-    </w:p>
-    <w:p/>
-    <w:p>
-      <w:pPr>
-        <w:pStyle w:val="Heading3"/>
-      </w:pPr>
-      <w:r>
-        <w:t>Cons of P/E</w:t>
-      </w:r>
-    </w:p>
-    <w:p>
-      <w:r>
-        <w:t xml:space="preserve">Companies sometimes inherit problems with the forward P/E metrics, namely, to underestimate the earnings in order to beat the estimate P/E ratio, for the next </w:t>
-      </w:r>
-      <w:r>
-        <w:t>quarter’s</w:t>
-      </w:r>
-      <w:r>
-        <w:t xml:space="preserve"> </w:t>
-      </w:r>
-      <w:r>
-        <w:t>earnings</w:t>
-      </w:r>
-      <w:r>
-        <w:t xml:space="preserve"> announcement.  </w:t>
-      </w:r>
-    </w:p>
-    <w:p>
-      <w:r>
-        <w:t xml:space="preserve">Other companies could even overestimate the P/E ratio and made adjustment later in </w:t>
-      </w:r>
-      <w:r>
-        <w:t>the next</w:t>
-      </w:r>
-      <w:r>
-        <w:t xml:space="preserve"> quarter announcement. External analyst also provides P/E ratio estimate which may diverge from the company’s estimate which creates confusion. Companies sometimes could also provide inaccurate estimate P/E ratio, that’s why most investors prefer to choose the trailing P/E ratios. Furthermore, past performance doesn’t signal future behaviors.</w:t>
-      </w:r>
-    </w:p>
-    <w:p/>
-    <w:p/>
-    <w:p>
-      <w:pPr>
-        <w:widowControl/>
-        <w:jc w:val="left"/>
-      </w:pPr>
-      <w:r>
-        <w:br w:type="page"/>
-      </w:r>
+      </w:pPr>
     </w:p>
     <w:p>
       <w:pPr>
@@ -978,7 +1308,6 @@
           <w:sz w:val="32"/>
           <w:szCs w:val="32"/>
         </w:rPr>
-        <w:lastRenderedPageBreak/>
         <w:t>If I am the investor, should I look at Trailing P/E ratio or the forward P/E ratio?</w:t>
       </w:r>
     </w:p>
@@ -1211,6 +1540,30 @@
           <w:szCs w:val="28"/>
           <w:lang w:val="en-HK"/>
         </w:rPr>
+        <w:br w:type="page"/>
+      </w:r>
+    </w:p>
+    <w:p>
+      <w:pPr>
+        <w:widowControl/>
+        <w:jc w:val="left"/>
+        <w:rPr>
+          <w:b/>
+          <w:bCs/>
+          <w:sz w:val="28"/>
+          <w:szCs w:val="28"/>
+          <w:lang w:val="en-HK"/>
+        </w:rPr>
+      </w:pPr>
+      <w:r>
+        <w:rPr>
+          <w:b/>
+          <w:bCs/>
+          <w:sz w:val="28"/>
+          <w:szCs w:val="28"/>
+          <w:lang w:val="en-HK"/>
+        </w:rPr>
+        <w:lastRenderedPageBreak/>
         <w:t>Forward P/E Ratio</w:t>
       </w:r>
     </w:p>
@@ -1500,23 +1853,9 @@
     </w:p>
     <w:p>
       <w:pPr>
-        <w:widowControl/>
-        <w:jc w:val="left"/>
-        <w:rPr>
-          <w:b/>
-          <w:sz w:val="32"/>
-        </w:rPr>
-      </w:pPr>
-      <w:r>
-        <w:br w:type="page"/>
-      </w:r>
-    </w:p>
-    <w:p>
-      <w:pPr>
         <w:pStyle w:val="Heading3"/>
       </w:pPr>
       <w:r>
-        <w:lastRenderedPageBreak/>
         <w:t>Price/Sales (PS)</w:t>
       </w:r>
     </w:p>
@@ -1594,7 +1933,6 @@
         <w:t>Let’s take an example:</w:t>
       </w:r>
     </w:p>
-    <w:p/>
     <w:p/>
     <w:p>
       <w:r>
@@ -2032,13 +2370,9 @@
         <w:widowControl/>
         <w:jc w:val="left"/>
       </w:pPr>
-      <w:r>
-        <w:br w:type="page"/>
-      </w:r>
-    </w:p>
-    <w:p>
-      <w:r>
-        <w:lastRenderedPageBreak/>
+    </w:p>
+    <w:p>
+      <w:r>
         <w:t xml:space="preserve">If Acme’s peers, which is assume are based in the same sector and are of similar size in terms of market capitalization, are trading at an average P/S ratio (TTM) of 1.5, compared with Acme’s 2.2, it suggests a premium valuation for the company, because the P/S ratio of Acme is higher than </w:t>
       </w:r>
       <w:r>
@@ -2081,8 +2415,10 @@
     </w:p>
     <w:p>
       <w:pPr>
-        <w:pStyle w:val="Heading3"/>
-        <w:rPr>
+        <w:widowControl/>
+        <w:jc w:val="left"/>
+        <w:rPr>
+          <w:b/>
           <w:sz w:val="28"/>
           <w:szCs w:val="28"/>
         </w:rPr>
@@ -2092,6 +2428,23 @@
           <w:sz w:val="28"/>
           <w:szCs w:val="28"/>
         </w:rPr>
+        <w:br w:type="page"/>
+      </w:r>
+    </w:p>
+    <w:p>
+      <w:pPr>
+        <w:pStyle w:val="Heading3"/>
+        <w:rPr>
+          <w:sz w:val="28"/>
+          <w:szCs w:val="28"/>
+        </w:rPr>
+      </w:pPr>
+      <w:r>
+        <w:rPr>
+          <w:sz w:val="28"/>
+          <w:szCs w:val="28"/>
+        </w:rPr>
+        <w:lastRenderedPageBreak/>
         <w:t>Which to use</w:t>
       </w:r>
       <w:r>
@@ -2348,7 +2701,6 @@
           <w:bCs/>
           <w:lang w:val="en-HK"/>
         </w:rPr>
-        <w:lastRenderedPageBreak/>
         <w:t>Best For</w:t>
       </w:r>
       <w:r>
@@ -2479,6 +2831,8 @@
     </w:p>
     <w:p>
       <w:pPr>
+        <w:widowControl/>
+        <w:jc w:val="left"/>
         <w:rPr>
           <w:b/>
           <w:bCs/>
@@ -2493,6 +2847,26 @@
           <w:sz w:val="24"/>
           <w:lang w:val="en-HK"/>
         </w:rPr>
+        <w:br w:type="page"/>
+      </w:r>
+    </w:p>
+    <w:p>
+      <w:pPr>
+        <w:rPr>
+          <w:b/>
+          <w:bCs/>
+          <w:sz w:val="24"/>
+          <w:lang w:val="en-HK"/>
+        </w:rPr>
+      </w:pPr>
+      <w:r>
+        <w:rPr>
+          <w:b/>
+          <w:bCs/>
+          <w:sz w:val="24"/>
+          <w:lang w:val="en-HK"/>
+        </w:rPr>
+        <w:lastRenderedPageBreak/>
         <w:t>Recommendation</w:t>
       </w:r>
     </w:p>
@@ -3731,6 +4105,155 @@
     </w:lvl>
   </w:abstractNum>
   <w:abstractNum w:abstractNumId="7" w15:restartNumberingAfterBreak="0">
+    <w:nsid w:val="18FE7AF6"/>
+    <w:multiLevelType w:val="multilevel"/>
+    <w:tmpl w:val="F3F46BC0"/>
+    <w:lvl w:ilvl="0">
+      <w:start w:val="1"/>
+      <w:numFmt w:val="bullet"/>
+      <w:lvlText w:val=""/>
+      <w:lvlJc w:val="left"/>
+      <w:pPr>
+        <w:tabs>
+          <w:tab w:val="num" w:pos="720"/>
+        </w:tabs>
+        <w:ind w:left="720" w:hanging="360"/>
+      </w:pPr>
+      <w:rPr>
+        <w:rFonts w:ascii="Symbol" w:hAnsi="Symbol" w:hint="default"/>
+        <w:sz w:val="20"/>
+      </w:rPr>
+    </w:lvl>
+    <w:lvl w:ilvl="1" w:tentative="1">
+      <w:start w:val="1"/>
+      <w:numFmt w:val="bullet"/>
+      <w:lvlText w:val="o"/>
+      <w:lvlJc w:val="left"/>
+      <w:pPr>
+        <w:tabs>
+          <w:tab w:val="num" w:pos="1440"/>
+        </w:tabs>
+        <w:ind w:left="1440" w:hanging="360"/>
+      </w:pPr>
+      <w:rPr>
+        <w:rFonts w:ascii="Courier New" w:hAnsi="Courier New" w:hint="default"/>
+        <w:sz w:val="20"/>
+      </w:rPr>
+    </w:lvl>
+    <w:lvl w:ilvl="2" w:tentative="1">
+      <w:start w:val="1"/>
+      <w:numFmt w:val="bullet"/>
+      <w:lvlText w:val=""/>
+      <w:lvlJc w:val="left"/>
+      <w:pPr>
+        <w:tabs>
+          <w:tab w:val="num" w:pos="2160"/>
+        </w:tabs>
+        <w:ind w:left="2160" w:hanging="360"/>
+      </w:pPr>
+      <w:rPr>
+        <w:rFonts w:ascii="Wingdings" w:hAnsi="Wingdings" w:hint="default"/>
+        <w:sz w:val="20"/>
+      </w:rPr>
+    </w:lvl>
+    <w:lvl w:ilvl="3" w:tentative="1">
+      <w:start w:val="1"/>
+      <w:numFmt w:val="bullet"/>
+      <w:lvlText w:val=""/>
+      <w:lvlJc w:val="left"/>
+      <w:pPr>
+        <w:tabs>
+          <w:tab w:val="num" w:pos="2880"/>
+        </w:tabs>
+        <w:ind w:left="2880" w:hanging="360"/>
+      </w:pPr>
+      <w:rPr>
+        <w:rFonts w:ascii="Wingdings" w:hAnsi="Wingdings" w:hint="default"/>
+        <w:sz w:val="20"/>
+      </w:rPr>
+    </w:lvl>
+    <w:lvl w:ilvl="4" w:tentative="1">
+      <w:start w:val="1"/>
+      <w:numFmt w:val="bullet"/>
+      <w:lvlText w:val=""/>
+      <w:lvlJc w:val="left"/>
+      <w:pPr>
+        <w:tabs>
+          <w:tab w:val="num" w:pos="3600"/>
+        </w:tabs>
+        <w:ind w:left="3600" w:hanging="360"/>
+      </w:pPr>
+      <w:rPr>
+        <w:rFonts w:ascii="Wingdings" w:hAnsi="Wingdings" w:hint="default"/>
+        <w:sz w:val="20"/>
+      </w:rPr>
+    </w:lvl>
+    <w:lvl w:ilvl="5" w:tentative="1">
+      <w:start w:val="1"/>
+      <w:numFmt w:val="bullet"/>
+      <w:lvlText w:val=""/>
+      <w:lvlJc w:val="left"/>
+      <w:pPr>
+        <w:tabs>
+          <w:tab w:val="num" w:pos="4320"/>
+        </w:tabs>
+        <w:ind w:left="4320" w:hanging="360"/>
+      </w:pPr>
+      <w:rPr>
+        <w:rFonts w:ascii="Wingdings" w:hAnsi="Wingdings" w:hint="default"/>
+        <w:sz w:val="20"/>
+      </w:rPr>
+    </w:lvl>
+    <w:lvl w:ilvl="6" w:tentative="1">
+      <w:start w:val="1"/>
+      <w:numFmt w:val="bullet"/>
+      <w:lvlText w:val=""/>
+      <w:lvlJc w:val="left"/>
+      <w:pPr>
+        <w:tabs>
+          <w:tab w:val="num" w:pos="5040"/>
+        </w:tabs>
+        <w:ind w:left="5040" w:hanging="360"/>
+      </w:pPr>
+      <w:rPr>
+        <w:rFonts w:ascii="Wingdings" w:hAnsi="Wingdings" w:hint="default"/>
+        <w:sz w:val="20"/>
+      </w:rPr>
+    </w:lvl>
+    <w:lvl w:ilvl="7" w:tentative="1">
+      <w:start w:val="1"/>
+      <w:numFmt w:val="bullet"/>
+      <w:lvlText w:val=""/>
+      <w:lvlJc w:val="left"/>
+      <w:pPr>
+        <w:tabs>
+          <w:tab w:val="num" w:pos="5760"/>
+        </w:tabs>
+        <w:ind w:left="5760" w:hanging="360"/>
+      </w:pPr>
+      <w:rPr>
+        <w:rFonts w:ascii="Wingdings" w:hAnsi="Wingdings" w:hint="default"/>
+        <w:sz w:val="20"/>
+      </w:rPr>
+    </w:lvl>
+    <w:lvl w:ilvl="8" w:tentative="1">
+      <w:start w:val="1"/>
+      <w:numFmt w:val="bullet"/>
+      <w:lvlText w:val=""/>
+      <w:lvlJc w:val="left"/>
+      <w:pPr>
+        <w:tabs>
+          <w:tab w:val="num" w:pos="6480"/>
+        </w:tabs>
+        <w:ind w:left="6480" w:hanging="360"/>
+      </w:pPr>
+      <w:rPr>
+        <w:rFonts w:ascii="Wingdings" w:hAnsi="Wingdings" w:hint="default"/>
+        <w:sz w:val="20"/>
+      </w:rPr>
+    </w:lvl>
+  </w:abstractNum>
+  <w:abstractNum w:abstractNumId="8" w15:restartNumberingAfterBreak="0">
     <w:nsid w:val="1EA37AF4"/>
     <w:multiLevelType w:val="hybridMultilevel"/>
     <w:tmpl w:val="7DC2D9A2"/>
@@ -3843,7 +4366,7 @@
       </w:rPr>
     </w:lvl>
   </w:abstractNum>
-  <w:abstractNum w:abstractNumId="8" w15:restartNumberingAfterBreak="0">
+  <w:abstractNum w:abstractNumId="9" w15:restartNumberingAfterBreak="0">
     <w:nsid w:val="326A5225"/>
     <w:multiLevelType w:val="multilevel"/>
     <w:tmpl w:val="3B7A029E"/>
@@ -3992,7 +4515,7 @@
       </w:rPr>
     </w:lvl>
   </w:abstractNum>
-  <w:abstractNum w:abstractNumId="9" w15:restartNumberingAfterBreak="0">
+  <w:abstractNum w:abstractNumId="10" w15:restartNumberingAfterBreak="0">
     <w:nsid w:val="381F42E7"/>
     <w:multiLevelType w:val="multilevel"/>
     <w:tmpl w:val="BA24A55C"/>
@@ -4141,7 +4664,7 @@
       </w:rPr>
     </w:lvl>
   </w:abstractNum>
-  <w:abstractNum w:abstractNumId="10" w15:restartNumberingAfterBreak="0">
+  <w:abstractNum w:abstractNumId="11" w15:restartNumberingAfterBreak="0">
     <w:nsid w:val="39936EBE"/>
     <w:multiLevelType w:val="multilevel"/>
     <w:tmpl w:val="729A1254"/>
@@ -4290,7 +4813,7 @@
       </w:rPr>
     </w:lvl>
   </w:abstractNum>
-  <w:abstractNum w:abstractNumId="11" w15:restartNumberingAfterBreak="0">
+  <w:abstractNum w:abstractNumId="12" w15:restartNumberingAfterBreak="0">
     <w:nsid w:val="3EEFADBF"/>
     <w:multiLevelType w:val="singleLevel"/>
     <w:tmpl w:val="3EEFADBF"/>
@@ -4307,7 +4830,7 @@
       </w:rPr>
     </w:lvl>
   </w:abstractNum>
-  <w:abstractNum w:abstractNumId="12" w15:restartNumberingAfterBreak="0">
+  <w:abstractNum w:abstractNumId="13" w15:restartNumberingAfterBreak="0">
     <w:nsid w:val="4DD66339"/>
     <w:multiLevelType w:val="hybridMultilevel"/>
     <w:tmpl w:val="9890303E"/>
@@ -4420,7 +4943,7 @@
       </w:rPr>
     </w:lvl>
   </w:abstractNum>
-  <w:abstractNum w:abstractNumId="13" w15:restartNumberingAfterBreak="0">
+  <w:abstractNum w:abstractNumId="14" w15:restartNumberingAfterBreak="0">
     <w:nsid w:val="54021AC3"/>
     <w:multiLevelType w:val="hybridMultilevel"/>
     <w:tmpl w:val="DDB03ED4"/>
@@ -4533,7 +5056,7 @@
       </w:rPr>
     </w:lvl>
   </w:abstractNum>
-  <w:abstractNum w:abstractNumId="14" w15:restartNumberingAfterBreak="0">
+  <w:abstractNum w:abstractNumId="15" w15:restartNumberingAfterBreak="0">
     <w:nsid w:val="56306776"/>
     <w:multiLevelType w:val="singleLevel"/>
     <w:tmpl w:val="56306776"/>
@@ -4550,7 +5073,7 @@
       </w:rPr>
     </w:lvl>
   </w:abstractNum>
-  <w:abstractNum w:abstractNumId="15" w15:restartNumberingAfterBreak="0">
+  <w:abstractNum w:abstractNumId="16" w15:restartNumberingAfterBreak="0">
     <w:nsid w:val="666330D6"/>
     <w:multiLevelType w:val="multilevel"/>
     <w:tmpl w:val="5CE66DFA"/>
@@ -4700,31 +5223,31 @@
     </w:lvl>
   </w:abstractNum>
   <w:num w:numId="1" w16cid:durableId="448402179">
-    <w:abstractNumId w:val="14"/>
+    <w:abstractNumId w:val="15"/>
   </w:num>
   <w:num w:numId="2" w16cid:durableId="1377656460">
     <w:abstractNumId w:val="0"/>
   </w:num>
   <w:num w:numId="3" w16cid:durableId="1016613346">
-    <w:abstractNumId w:val="11"/>
+    <w:abstractNumId w:val="12"/>
   </w:num>
   <w:num w:numId="4" w16cid:durableId="1288317639">
     <w:abstractNumId w:val="1"/>
   </w:num>
   <w:num w:numId="5" w16cid:durableId="1924098320">
-    <w:abstractNumId w:val="12"/>
+    <w:abstractNumId w:val="13"/>
   </w:num>
   <w:num w:numId="6" w16cid:durableId="74937784">
-    <w:abstractNumId w:val="13"/>
+    <w:abstractNumId w:val="14"/>
   </w:num>
   <w:num w:numId="7" w16cid:durableId="396173414">
     <w:abstractNumId w:val="4"/>
   </w:num>
   <w:num w:numId="8" w16cid:durableId="1995912926">
-    <w:abstractNumId w:val="7"/>
+    <w:abstractNumId w:val="8"/>
   </w:num>
   <w:num w:numId="9" w16cid:durableId="1208949627">
-    <w:abstractNumId w:val="15"/>
+    <w:abstractNumId w:val="16"/>
   </w:num>
   <w:num w:numId="10" w16cid:durableId="1205673031">
     <w:abstractNumId w:val="2"/>
@@ -4736,16 +5259,19 @@
     <w:abstractNumId w:val="3"/>
   </w:num>
   <w:num w:numId="13" w16cid:durableId="1021860773">
-    <w:abstractNumId w:val="10"/>
+    <w:abstractNumId w:val="11"/>
   </w:num>
   <w:num w:numId="14" w16cid:durableId="836505575">
     <w:abstractNumId w:val="5"/>
   </w:num>
   <w:num w:numId="15" w16cid:durableId="1358043813">
-    <w:abstractNumId w:val="8"/>
+    <w:abstractNumId w:val="9"/>
   </w:num>
   <w:num w:numId="16" w16cid:durableId="920258597">
-    <w:abstractNumId w:val="9"/>
+    <w:abstractNumId w:val="10"/>
+  </w:num>
+  <w:num w:numId="17" w16cid:durableId="254751665">
+    <w:abstractNumId w:val="7"/>
   </w:num>
 </w:numbering>
 </file>
@@ -5139,7 +5665,6 @@
   <w:style w:type="character" w:default="1" w:styleId="DefaultParagraphFont">
     <w:name w:val="Default Paragraph Font"/>
     <w:uiPriority w:val="1"/>
-    <w:semiHidden/>
     <w:unhideWhenUsed/>
   </w:style>
   <w:style w:type="table" w:default="1" w:styleId="TableNormal">

</xml_diff>

<commit_message>
docs: Added P/E ratio
</commit_message>
<xml_diff>
--- a/Finanace/Stock Market Investing And Trading Foundation.docx
+++ b/Finanace/Stock Market Investing And Trading Foundation.docx
@@ -449,7 +449,7 @@
           <w:szCs w:val="32"/>
           <w:lang w:val="en-HK"/>
         </w:rPr>
-        <w:t>W</w:t>
+        <w:t>What is ratio, how to interpret 1:1.9</w:t>
       </w:r>
       <w:r>
         <w:rPr>
@@ -459,7 +459,7 @@
           <w:szCs w:val="32"/>
           <w:lang w:val="en-HK"/>
         </w:rPr>
-        <w:t>hat is ratio, how to interpret 1:1.9</w:t>
+        <w:t xml:space="preserve"> or 1/1.9</w:t>
       </w:r>
       <w:r>
         <w:rPr>
@@ -469,16 +469,6 @@
           <w:szCs w:val="32"/>
           <w:lang w:val="en-HK"/>
         </w:rPr>
-        <w:t xml:space="preserve"> or 1/1.9</w:t>
-      </w:r>
-      <w:r>
-        <w:rPr>
-          <w:b/>
-          <w:bCs/>
-          <w:sz w:val="32"/>
-          <w:szCs w:val="32"/>
-          <w:lang w:val="en-HK"/>
-        </w:rPr>
         <w:t>?</w:t>
       </w:r>
     </w:p>
@@ -500,21 +490,7 @@
         <w:rPr>
           <w:lang w:val="en-HK"/>
         </w:rPr>
-        <w:t>A ratio is a way to compare two quantities by showing the relative size of one quantity to another. It is often written in the form (</w:t>
-      </w:r>
-      <w:proofErr w:type="spellStart"/>
-      <w:r>
-        <w:rPr>
-          <w:lang w:val="en-HK"/>
-        </w:rPr>
-        <w:t>a:b</w:t>
-      </w:r>
-      <w:proofErr w:type="spellEnd"/>
-      <w:r>
-        <w:rPr>
-          <w:lang w:val="en-HK"/>
-        </w:rPr>
-        <w:t>) or as a fraction (\frac{a}{b}).</w:t>
+        <w:t>A ratio is a way to compare two quantities by showing the relative size of one quantity to another. It is often written in the form (a:b) or as a fraction (\frac{a}{b}).</w:t>
       </w:r>
     </w:p>
     <w:p>
@@ -634,7 +610,7 @@
           <w:sz w:val="21"/>
           <w:szCs w:val="21"/>
         </w:rPr>
-        <w:t>E)</w:t>
+        <w:t xml:space="preserve">E) </w:t>
       </w:r>
       <w:r>
         <w:rPr>
@@ -643,7 +619,7 @@
           <w:sz w:val="21"/>
           <w:szCs w:val="21"/>
         </w:rPr>
-        <w:t xml:space="preserve"> </w:t>
+        <w:t xml:space="preserve">1:1.9 (a ratio of 0.526) – For a stock, for a price of $1 you would have $1.9 dollar </w:t>
       </w:r>
       <w:r>
         <w:rPr>
@@ -652,7 +628,7 @@
           <w:sz w:val="21"/>
           <w:szCs w:val="21"/>
         </w:rPr>
-        <w:t xml:space="preserve">1:1.9 (a ratio of 0.526) – For a stock, for a price of $1 you would have $1.9 dollar </w:t>
+        <w:t xml:space="preserve">of </w:t>
       </w:r>
       <w:r>
         <w:rPr>
@@ -661,28 +637,28 @@
           <w:sz w:val="21"/>
           <w:szCs w:val="21"/>
         </w:rPr>
-        <w:t xml:space="preserve">of </w:t>
-      </w:r>
-      <w:r>
+        <w:t xml:space="preserve">earnings.   </w:t>
+      </w:r>
+    </w:p>
+    <w:p>
+      <w:pPr>
+        <w:pStyle w:val="Heading3"/>
         <w:rPr>
           <w:b w:val="0"/>
           <w:bCs/>
           <w:sz w:val="21"/>
           <w:szCs w:val="21"/>
         </w:rPr>
-        <w:t xml:space="preserve">earnings.   </w:t>
-      </w:r>
-    </w:p>
-    <w:p>
-      <w:pPr>
-        <w:pStyle w:val="Heading3"/>
+      </w:pPr>
+      <w:r>
         <w:rPr>
           <w:b w:val="0"/>
           <w:bCs/>
           <w:sz w:val="21"/>
           <w:szCs w:val="21"/>
         </w:rPr>
-      </w:pPr>
+        <w:t>Price/</w:t>
+      </w:r>
       <w:r>
         <w:rPr>
           <w:b w:val="0"/>
@@ -690,7 +666,7 @@
           <w:sz w:val="21"/>
           <w:szCs w:val="21"/>
         </w:rPr>
-        <w:t>Price/</w:t>
+        <w:t>Sales</w:t>
       </w:r>
       <w:r>
         <w:rPr>
@@ -699,7 +675,7 @@
           <w:sz w:val="21"/>
           <w:szCs w:val="21"/>
         </w:rPr>
-        <w:t>Sales</w:t>
+        <w:t xml:space="preserve"> (P</w:t>
       </w:r>
       <w:r>
         <w:rPr>
@@ -708,7 +684,7 @@
           <w:sz w:val="21"/>
           <w:szCs w:val="21"/>
         </w:rPr>
-        <w:t xml:space="preserve"> (P</w:t>
+        <w:t>/S</w:t>
       </w:r>
       <w:r>
         <w:rPr>
@@ -717,7 +693,7 @@
           <w:sz w:val="21"/>
           <w:szCs w:val="21"/>
         </w:rPr>
-        <w:t>/S</w:t>
+        <w:t xml:space="preserve">) </w:t>
       </w:r>
       <w:r>
         <w:rPr>
@@ -726,7 +702,7 @@
           <w:sz w:val="21"/>
           <w:szCs w:val="21"/>
         </w:rPr>
-        <w:t xml:space="preserve">) </w:t>
+        <w:t xml:space="preserve">1:1.9 (a ratio of 0.526) – For a stock, for a price of $1 you would have $1.9 dollar </w:t>
       </w:r>
       <w:r>
         <w:rPr>
@@ -735,7 +711,7 @@
           <w:sz w:val="21"/>
           <w:szCs w:val="21"/>
         </w:rPr>
-        <w:t xml:space="preserve">1:1.9 (a ratio of 0.526) – For a stock, for a price of $1 you would have $1.9 dollar </w:t>
+        <w:t xml:space="preserve">of </w:t>
       </w:r>
       <w:r>
         <w:rPr>
@@ -744,25 +720,98 @@
           <w:sz w:val="21"/>
           <w:szCs w:val="21"/>
         </w:rPr>
-        <w:t xml:space="preserve">of </w:t>
-      </w:r>
-      <w:r>
-        <w:rPr>
-          <w:b w:val="0"/>
-          <w:bCs/>
-          <w:sz w:val="21"/>
-          <w:szCs w:val="21"/>
-        </w:rPr>
-        <w:t>sales</w:t>
-      </w:r>
-      <w:r>
-        <w:rPr>
-          <w:b w:val="0"/>
-          <w:bCs/>
-          <w:sz w:val="21"/>
-          <w:szCs w:val="21"/>
-        </w:rPr>
-        <w:t xml:space="preserve">.   </w:t>
+        <w:t xml:space="preserve">sales.  </w:t>
+      </w:r>
+    </w:p>
+    <w:p>
+      <w:pPr>
+        <w:widowControl/>
+        <w:jc w:val="left"/>
+        <w:rPr>
+          <w:b/>
+          <w:bCs/>
+        </w:rPr>
+      </w:pPr>
+      <w:r>
+        <w:rPr>
+          <w:b/>
+          <w:bCs/>
+        </w:rPr>
+        <w:t>Another example:</w:t>
+      </w:r>
+    </w:p>
+    <w:p>
+      <w:pPr>
+        <w:widowControl/>
+        <w:jc w:val="left"/>
+      </w:pPr>
+    </w:p>
+    <w:p>
+      <w:pPr>
+        <w:widowControl/>
+        <w:jc w:val="left"/>
+      </w:pPr>
+      <w:r>
+        <w:t>A stock company ABC has a quote price of $35.5 has earning per share is $12 dollar. What is the P/E?</w:t>
+      </w:r>
+    </w:p>
+    <w:p>
+      <w:pPr>
+        <w:widowControl/>
+        <w:jc w:val="left"/>
+      </w:pPr>
+    </w:p>
+    <w:p>
+      <w:pPr>
+        <w:widowControl/>
+        <w:jc w:val="left"/>
+        <w:rPr>
+          <w:b/>
+          <w:bCs/>
+          <w:sz w:val="32"/>
+        </w:rPr>
+      </w:pPr>
+      <w:r>
+        <w:t xml:space="preserve">The P/E will be $35.5 / $12 equals to </w:t>
+      </w:r>
+      <w:r>
+        <w:t xml:space="preserve">the ratio </w:t>
+      </w:r>
+      <w:r>
+        <w:t xml:space="preserve">2.958, that means for each $1 earnings there will be </w:t>
+      </w:r>
+      <w:r>
+        <w:t>$</w:t>
+      </w:r>
+      <w:r>
+        <w:t>2.958</w:t>
+      </w:r>
+      <w:r>
+        <w:t xml:space="preserve"> </w:t>
+      </w:r>
+      <w:r>
+        <w:rPr>
+          <w:b/>
+          <w:bCs/>
+          <w:color w:val="FF0000"/>
+        </w:rPr>
+        <w:t>contributions</w:t>
+      </w:r>
+      <w:r>
+        <w:rPr>
+          <w:color w:val="FF0000"/>
+        </w:rPr>
+        <w:t xml:space="preserve"> </w:t>
+      </w:r>
+      <w:r>
+        <w:t xml:space="preserve">made to the quote price.  </w:t>
+      </w:r>
+      <w:r>
+        <w:rPr>
+          <w:b/>
+          <w:bCs/>
+        </w:rPr>
+        <w:br w:type="page"/>
       </w:r>
     </w:p>
     <w:p>
@@ -770,6 +819,7 @@
         <w:pStyle w:val="Heading3"/>
       </w:pPr>
       <w:r>
+        <w:lastRenderedPageBreak/>
         <w:t>Price/Earnings (PE)</w:t>
       </w:r>
     </w:p>
@@ -795,7 +845,23 @@
           <w:bCs/>
           <w:color w:val="FF0000"/>
         </w:rPr>
-        <w:t>P/E less than 25 is good</w:t>
+        <w:t xml:space="preserve">P/E </w:t>
+      </w:r>
+      <w:r>
+        <w:rPr>
+          <w:b/>
+          <w:bCs/>
+          <w:color w:val="FF0000"/>
+        </w:rPr>
+        <w:t xml:space="preserve">ratio </w:t>
+      </w:r>
+      <w:r>
+        <w:rPr>
+          <w:b/>
+          <w:bCs/>
+          <w:color w:val="FF0000"/>
+        </w:rPr>
+        <w:t>less than 25 is good</w:t>
       </w:r>
       <w:r>
         <w:t xml:space="preserve">. But the rule of thumb, the </w:t>
@@ -1221,39 +1287,39 @@
         <w:pStyle w:val="Heading3"/>
       </w:pPr>
       <w:r>
+        <w:t>Pros of P/E</w:t>
+      </w:r>
+    </w:p>
+    <w:p>
+      <w:r>
+        <w:t xml:space="preserve">Investors can valuate short to </w:t>
+      </w:r>
+      <w:r>
+        <w:t>long-term</w:t>
+      </w:r>
+      <w:r>
+        <w:t xml:space="preserve"> valuation trends such as P/E 10 to P/E 30, which the average of 10 to 30 years. The benefit of long-term measures can </w:t>
+      </w:r>
+      <w:r>
+        <w:t>compensate for</w:t>
+      </w:r>
+      <w:r>
+        <w:t xml:space="preserve"> the changes or fruition of the business cycle. Can be used as a tool for the company’s future </w:t>
+      </w:r>
+      <w:r>
+        <w:t>estimates</w:t>
+      </w:r>
+      <w:r>
+        <w:t xml:space="preserve">, which provides a clear picture of what earnings will look like, without changes or accounting adjustment. </w:t>
+      </w:r>
+    </w:p>
+    <w:p/>
+    <w:p>
+      <w:pPr>
+        <w:pStyle w:val="Heading3"/>
+      </w:pPr>
+      <w:r>
         <w:lastRenderedPageBreak/>
-        <w:t>Pros of P/E</w:t>
-      </w:r>
-    </w:p>
-    <w:p>
-      <w:r>
-        <w:t xml:space="preserve">Investors can valuate short to </w:t>
-      </w:r>
-      <w:r>
-        <w:t>long-term</w:t>
-      </w:r>
-      <w:r>
-        <w:t xml:space="preserve"> valuation trends such as P/E 10 to P/E 30, which the average of 10 to 30 years. The benefit of long-term measures can </w:t>
-      </w:r>
-      <w:r>
-        <w:t>compensate for</w:t>
-      </w:r>
-      <w:r>
-        <w:t xml:space="preserve"> the changes or fruition of the business cycle. Can be used as a tool for the company’s future </w:t>
-      </w:r>
-      <w:r>
-        <w:t>estimates</w:t>
-      </w:r>
-      <w:r>
-        <w:t xml:space="preserve">, which provides a clear picture of what earnings will look like, without changes or accounting adjustment. </w:t>
-      </w:r>
-    </w:p>
-    <w:p/>
-    <w:p>
-      <w:pPr>
-        <w:pStyle w:val="Heading3"/>
-      </w:pPr>
-      <w:r>
         <w:t>Cons of P/E</w:t>
       </w:r>
     </w:p>
@@ -5665,6 +5731,7 @@
   <w:style w:type="character" w:default="1" w:styleId="DefaultParagraphFont">
     <w:name w:val="Default Paragraph Font"/>
     <w:uiPriority w:val="1"/>
+    <w:semiHidden/>
     <w:unhideWhenUsed/>
   </w:style>
   <w:style w:type="table" w:default="1" w:styleId="TableNormal">

</xml_diff>

<commit_message>
docs: Update ratio definition.
</commit_message>
<xml_diff>
--- a/Finanace/Stock Market Investing And Trading Foundation.docx
+++ b/Finanace/Stock Market Investing And Trading Foundation.docx
@@ -490,7 +490,23 @@
         <w:rPr>
           <w:lang w:val="en-HK"/>
         </w:rPr>
-        <w:t>A ratio is a way to compare two quantities by showing the relative size of one quantity to another. It is often written in the form (a:b) or as a fraction (\frac{a}{b}).</w:t>
+        <w:t>A ratio is a way to compare two quantities by showing the relative size of one quantity to another. It is often written in the form (</w:t>
+      </w:r>
+      <w:proofErr w:type="spellStart"/>
+      <w:proofErr w:type="gramStart"/>
+      <w:r>
+        <w:rPr>
+          <w:lang w:val="en-HK"/>
+        </w:rPr>
+        <w:t>a:b</w:t>
+      </w:r>
+      <w:proofErr w:type="spellEnd"/>
+      <w:proofErr w:type="gramEnd"/>
+      <w:r>
+        <w:rPr>
+          <w:lang w:val="en-HK"/>
+        </w:rPr>
+        <w:t>) or as a fraction (\frac{a}{b}).</w:t>
       </w:r>
     </w:p>
     <w:p>
@@ -764,7 +780,6 @@
     <w:p>
       <w:pPr>
         <w:widowControl/>
-        <w:jc w:val="left"/>
         <w:rPr>
           <w:b/>
           <w:bCs/>
@@ -804,7 +819,19 @@
         <w:t xml:space="preserve"> </w:t>
       </w:r>
       <w:r>
-        <w:t xml:space="preserve">made to the quote price.  </w:t>
+        <w:t>made to the quote price</w:t>
+      </w:r>
+      <w:r>
+        <w:t xml:space="preserve">, or maybe you can say for </w:t>
+      </w:r>
+      <w:r>
+        <w:rPr>
+          <w:color w:val="FF0000"/>
+        </w:rPr>
+        <w:t xml:space="preserve">each and every </w:t>
+      </w:r>
+      <w:r>
+        <w:t xml:space="preserve">earnings there is $2.958 contributions. </w:t>
       </w:r>
       <w:r>
         <w:rPr>
@@ -3068,7 +3095,21 @@
         <w:rPr>
           <w:lang w:val="en-HK"/>
         </w:rPr>
-        <w:t xml:space="preserve"> Therefore, taken into account of theses two figures will give you a general understanding about a company’s business. As a rule of thumb, it is best to select a stock of low P/S (high sales), and low P/</w:t>
+        <w:t xml:space="preserve"> Therefore, taken into account of </w:t>
+      </w:r>
+      <w:proofErr w:type="spellStart"/>
+      <w:r>
+        <w:rPr>
+          <w:lang w:val="en-HK"/>
+        </w:rPr>
+        <w:t>theses</w:t>
+      </w:r>
+      <w:proofErr w:type="spellEnd"/>
+      <w:r>
+        <w:rPr>
+          <w:lang w:val="en-HK"/>
+        </w:rPr>
+        <w:t xml:space="preserve"> two figures will give you a general understanding about a company’s business. As a rule of thumb, it is best to select a stock of low P/S (high sales), and low P/</w:t>
       </w:r>
       <w:r>
         <w:rPr>
@@ -3104,7 +3145,21 @@
         <w:rPr>
           <w:lang w:val="en-HK"/>
         </w:rPr>
-        <w:t>But theses companies due to low P/S, they are very sensitive or fluctuated by the surrounding economic environment</w:t>
+        <w:t xml:space="preserve">But </w:t>
+      </w:r>
+      <w:proofErr w:type="spellStart"/>
+      <w:r>
+        <w:rPr>
+          <w:lang w:val="en-HK"/>
+        </w:rPr>
+        <w:t>theses</w:t>
+      </w:r>
+      <w:proofErr w:type="spellEnd"/>
+      <w:r>
+        <w:rPr>
+          <w:lang w:val="en-HK"/>
+        </w:rPr>
+        <w:t xml:space="preserve"> companies due to low P/S, they are very sensitive or fluctuated by the surrounding economic environment</w:t>
       </w:r>
       <w:r>
         <w:rPr>

</xml_diff>

<commit_message>
docs: Updated relation bewteen P/E and P/S
</commit_message>
<xml_diff>
--- a/Finanace/Stock Market Investing And Trading Foundation.docx
+++ b/Finanace/Stock Market Investing And Trading Foundation.docx
@@ -780,59 +780,140 @@
     <w:p>
       <w:pPr>
         <w:widowControl/>
+      </w:pPr>
+      <w:r>
+        <w:t xml:space="preserve">The P/E will be $35.5 / $12 equals to </w:t>
+      </w:r>
+      <w:r>
+        <w:t xml:space="preserve">the ratio </w:t>
+      </w:r>
+      <w:r>
+        <w:t xml:space="preserve">2.958, that means for each $1 earnings there will be </w:t>
+      </w:r>
+      <w:r>
+        <w:t>$</w:t>
+      </w:r>
+      <w:r>
+        <w:t>2.958</w:t>
+      </w:r>
+      <w:r>
+        <w:t xml:space="preserve"> </w:t>
+      </w:r>
+      <w:r>
+        <w:rPr>
+          <w:b/>
+          <w:bCs/>
+          <w:color w:val="FF0000"/>
+        </w:rPr>
+        <w:t>contributions</w:t>
+      </w:r>
+      <w:r>
+        <w:rPr>
+          <w:color w:val="FF0000"/>
+        </w:rPr>
+        <w:t xml:space="preserve"> </w:t>
+      </w:r>
+      <w:r>
+        <w:t>made to the quote price</w:t>
+      </w:r>
+      <w:r>
+        <w:t xml:space="preserve">, or maybe you can say for </w:t>
+      </w:r>
+      <w:r>
+        <w:rPr>
+          <w:color w:val="FF0000"/>
+        </w:rPr>
+        <w:t xml:space="preserve">each and every </w:t>
+      </w:r>
+      <w:r>
+        <w:t xml:space="preserve">earnings there is $2.958 contributions. </w:t>
+      </w:r>
+    </w:p>
+    <w:p>
+      <w:pPr>
+        <w:widowControl/>
+      </w:pPr>
+    </w:p>
+    <w:p>
+      <w:pPr>
+        <w:widowControl/>
         <w:rPr>
           <w:b/>
           <w:bCs/>
           <w:sz w:val="32"/>
-        </w:rPr>
-      </w:pPr>
-      <w:r>
-        <w:t xml:space="preserve">The P/E will be $35.5 / $12 equals to </w:t>
-      </w:r>
-      <w:r>
-        <w:t xml:space="preserve">the ratio </w:t>
-      </w:r>
-      <w:r>
-        <w:t xml:space="preserve">2.958, that means for each $1 earnings there will be </w:t>
-      </w:r>
-      <w:r>
-        <w:t>$</w:t>
-      </w:r>
-      <w:r>
-        <w:t>2.958</w:t>
-      </w:r>
-      <w:r>
-        <w:t xml:space="preserve"> </w:t>
-      </w:r>
-      <w:r>
-        <w:rPr>
-          <w:b/>
-          <w:bCs/>
-          <w:color w:val="FF0000"/>
-        </w:rPr>
-        <w:t>contributions</w:t>
-      </w:r>
-      <w:r>
-        <w:rPr>
-          <w:color w:val="FF0000"/>
-        </w:rPr>
-        <w:t xml:space="preserve"> </w:t>
-      </w:r>
-      <w:r>
-        <w:t>made to the quote price</w:t>
-      </w:r>
-      <w:r>
-        <w:t xml:space="preserve">, or maybe you can say for </w:t>
-      </w:r>
-      <w:r>
-        <w:rPr>
-          <w:color w:val="FF0000"/>
-        </w:rPr>
-        <w:t xml:space="preserve">each and every </w:t>
-      </w:r>
-      <w:r>
-        <w:t xml:space="preserve">earnings there is $2.958 contributions. </w:t>
-      </w:r>
+          <w:szCs w:val="32"/>
+          <w:lang w:val="en-HK"/>
+        </w:rPr>
+      </w:pPr>
+      <w:r>
+        <w:rPr>
+          <w:b/>
+          <w:bCs/>
+          <w:sz w:val="32"/>
+          <w:szCs w:val="32"/>
+          <w:lang w:val="en-HK"/>
+        </w:rPr>
+        <w:t>F</w:t>
+      </w:r>
+      <w:r>
+        <w:rPr>
+          <w:b/>
+          <w:bCs/>
+          <w:sz w:val="32"/>
+          <w:szCs w:val="32"/>
+          <w:lang w:val="en-HK"/>
+        </w:rPr>
+        <w:t>or a stock what is earnings compared to sales?</w:t>
+      </w:r>
+    </w:p>
+    <w:p>
+      <w:pPr>
+        <w:widowControl/>
+        <w:numPr>
+          <w:ilvl w:val="0"/>
+          <w:numId w:val="18"/>
+        </w:numPr>
+        <w:rPr>
+          <w:lang w:val="en-HK"/>
+        </w:rPr>
+      </w:pPr>
+      <w:r>
+        <w:rPr>
+          <w:lang w:val="en-HK"/>
+        </w:rPr>
+        <w:t>Sales (Revenue): This is the total amount of money a company generates from selling its products or services. It represents the “top line” of the income statement because it is the starting point for calculating profit. Sales indicate the company’s ability to generate income from its core operations.</w:t>
+      </w:r>
+    </w:p>
+    <w:p>
+      <w:pPr>
+        <w:widowControl/>
+        <w:numPr>
+          <w:ilvl w:val="0"/>
+          <w:numId w:val="18"/>
+        </w:numPr>
+        <w:rPr>
+          <w:lang w:val="en-HK"/>
+        </w:rPr>
+      </w:pPr>
+      <w:r>
+        <w:rPr>
+          <w:lang w:val="en-HK"/>
+        </w:rPr>
+        <w:t>Earnings (Net Income): This is the profit a company makes after deducting all expenses, including the cost of goods sold, operating expenses, taxes, and interest. Earnings are often referred to as the “bottom line” because they show the final profit figure after all costs have been subtracted from revenue</w:t>
+      </w:r>
+      <w:r>
+        <w:t>.</w:t>
+      </w:r>
+    </w:p>
+    <w:p>
+      <w:pPr>
+        <w:widowControl/>
+        <w:rPr>
+          <w:b/>
+          <w:bCs/>
+          <w:sz w:val="32"/>
+        </w:rPr>
+      </w:pPr>
       <w:r>
         <w:rPr>
           <w:b/>
@@ -3047,7 +3128,7 @@
         <w:rPr>
           <w:lang w:val="en-HK"/>
         </w:rPr>
-        <w:t>Although P/E and P/S ratio each has its own usage. But for an overview and evaluation of a particular stock whether to buy or not. It is better to take into account of these two values. For instance, a retail stock, P/S ratio seems be better for evaluation, because we are looking at the company’s sales. However, if the P/S ratio is low, that is undervalued, however, we need also need to know whether the company is making a profit that is what we are talking about P/E ratio. Low P/S ratio sometimes have high P/E</w:t>
+        <w:t>Although P/E and P/S ratio each has its own usage. But for an overview and evaluation of a particular stock whether to buy or not. It is better to take into account of these two values. For instance, a retail stock, P/S ratio seems be better for evaluation, because we are looking at the company’s sales. However, if the P/S ratio is low, that is undervalued, we need also need to know whether the company is making a profit that is what we are talking about P/E ratio. Low P/S ratio sometimes have high P/E</w:t>
       </w:r>
       <w:r>
         <w:rPr>
@@ -3071,7 +3152,69 @@
         <w:rPr>
           <w:lang w:val="en-HK"/>
         </w:rPr>
-        <w:t xml:space="preserve"> we have the sales but not making profit</w:t>
+        <w:t xml:space="preserve"> we have </w:t>
+      </w:r>
+      <w:r>
+        <w:rPr>
+          <w:color w:val="FF0000"/>
+          <w:lang w:val="en-HK"/>
+        </w:rPr>
+        <w:t>undervalued</w:t>
+      </w:r>
+      <w:r>
+        <w:rPr>
+          <w:color w:val="FF0000"/>
+          <w:lang w:val="en-HK"/>
+        </w:rPr>
+        <w:t xml:space="preserve"> </w:t>
+      </w:r>
+      <w:r>
+        <w:rPr>
+          <w:lang w:val="en-HK"/>
+        </w:rPr>
+        <w:t>sales</w:t>
+      </w:r>
+      <w:r>
+        <w:rPr>
+          <w:lang w:val="en-HK"/>
+        </w:rPr>
+        <w:t xml:space="preserve"> contribution</w:t>
+      </w:r>
+      <w:r>
+        <w:rPr>
+          <w:lang w:val="en-HK"/>
+        </w:rPr>
+        <w:t xml:space="preserve"> </w:t>
+      </w:r>
+      <w:r>
+        <w:rPr>
+          <w:lang w:val="en-HK"/>
+        </w:rPr>
+        <w:t>but</w:t>
+      </w:r>
+      <w:r>
+        <w:rPr>
+          <w:lang w:val="en-HK"/>
+        </w:rPr>
+        <w:t xml:space="preserve"> </w:t>
+      </w:r>
+      <w:r>
+        <w:rPr>
+          <w:lang w:val="en-HK"/>
+        </w:rPr>
+        <w:t xml:space="preserve">does not </w:t>
+      </w:r>
+      <w:r>
+        <w:rPr>
+          <w:lang w:val="en-HK"/>
+        </w:rPr>
+        <w:t>have</w:t>
+      </w:r>
+      <w:r>
+        <w:rPr>
+          <w:lang w:val="en-HK"/>
+        </w:rPr>
+        <w:t xml:space="preserve"> earnings</w:t>
       </w:r>
       <w:r>
         <w:rPr>
@@ -3083,33 +3226,148 @@
         <w:rPr>
           <w:lang w:val="en-HK"/>
         </w:rPr>
-        <w:t xml:space="preserve">in </w:t>
-      </w:r>
-      <w:r>
-        <w:rPr>
-          <w:lang w:val="en-HK"/>
-        </w:rPr>
-        <w:t>retail this is largely due to high store rents or high products or transportation costs or even staff’s salaries.</w:t>
-      </w:r>
-      <w:r>
-        <w:rPr>
-          <w:lang w:val="en-HK"/>
-        </w:rPr>
-        <w:t xml:space="preserve"> Therefore, taken into account of </w:t>
-      </w:r>
-      <w:proofErr w:type="spellStart"/>
-      <w:r>
-        <w:rPr>
-          <w:lang w:val="en-HK"/>
-        </w:rPr>
-        <w:t>theses</w:t>
-      </w:r>
-      <w:proofErr w:type="spellEnd"/>
-      <w:r>
-        <w:rPr>
-          <w:lang w:val="en-HK"/>
-        </w:rPr>
-        <w:t xml:space="preserve"> two figures will give you a general understanding about a company’s business. As a rule of thumb, it is best to select a stock of low P/S (high sales), and low P/</w:t>
+        <w:t xml:space="preserve">in selecting retail stock, this is </w:t>
+      </w:r>
+      <w:r>
+        <w:rPr>
+          <w:lang w:val="en-HK"/>
+        </w:rPr>
+        <w:t>not</w:t>
+      </w:r>
+      <w:r>
+        <w:rPr>
+          <w:lang w:val="en-HK"/>
+        </w:rPr>
+        <w:t xml:space="preserve"> suitable</w:t>
+      </w:r>
+      <w:r>
+        <w:rPr>
+          <w:lang w:val="en-HK"/>
+        </w:rPr>
+        <w:t>, although</w:t>
+      </w:r>
+      <w:r>
+        <w:rPr>
+          <w:lang w:val="en-HK"/>
+        </w:rPr>
+        <w:t xml:space="preserve"> the stock price does not yet reflect the sales contribution</w:t>
+      </w:r>
+      <w:r>
+        <w:rPr>
+          <w:lang w:val="en-HK"/>
+        </w:rPr>
+        <w:t xml:space="preserve"> (potential stock growth)</w:t>
+      </w:r>
+      <w:r>
+        <w:rPr>
+          <w:lang w:val="en-HK"/>
+        </w:rPr>
+        <w:t xml:space="preserve"> but </w:t>
+      </w:r>
+      <w:r>
+        <w:rPr>
+          <w:lang w:val="en-HK"/>
+        </w:rPr>
+        <w:t>by</w:t>
+      </w:r>
+      <w:r>
+        <w:rPr>
+          <w:lang w:val="en-HK"/>
+        </w:rPr>
+        <w:t xml:space="preserve"> also</w:t>
+      </w:r>
+      <w:r>
+        <w:rPr>
+          <w:lang w:val="en-HK"/>
+        </w:rPr>
+        <w:t xml:space="preserve"> looking at the P/E ratio; </w:t>
+      </w:r>
+      <w:r>
+        <w:rPr>
+          <w:lang w:val="en-HK"/>
+        </w:rPr>
+        <w:t xml:space="preserve">the stock is </w:t>
+      </w:r>
+      <w:r>
+        <w:rPr>
+          <w:lang w:val="en-HK"/>
+        </w:rPr>
+        <w:t xml:space="preserve">not </w:t>
+      </w:r>
+      <w:r>
+        <w:rPr>
+          <w:lang w:val="en-HK"/>
+        </w:rPr>
+        <w:t>making money (high P/E</w:t>
+      </w:r>
+      <w:r>
+        <w:rPr>
+          <w:lang w:val="en-HK"/>
+        </w:rPr>
+        <w:t xml:space="preserve"> contribution</w:t>
+      </w:r>
+      <w:r>
+        <w:rPr>
+          <w:lang w:val="en-HK"/>
+        </w:rPr>
+        <w:t>)</w:t>
+      </w:r>
+      <w:r>
+        <w:rPr>
+          <w:lang w:val="en-HK"/>
+        </w:rPr>
+        <w:t>.</w:t>
+      </w:r>
+      <w:r>
+        <w:rPr>
+          <w:lang w:val="en-HK"/>
+        </w:rPr>
+        <w:t xml:space="preserve"> </w:t>
+      </w:r>
+      <w:r>
+        <w:rPr>
+          <w:lang w:val="en-HK"/>
+        </w:rPr>
+        <w:t xml:space="preserve">Therefore, taken into account of </w:t>
+      </w:r>
+      <w:r>
+        <w:rPr>
+          <w:lang w:val="en-HK"/>
+        </w:rPr>
+        <w:t>these</w:t>
+      </w:r>
+      <w:r>
+        <w:rPr>
+          <w:lang w:val="en-HK"/>
+        </w:rPr>
+        <w:t xml:space="preserve"> two figures will give you a general understanding about a company’s business. As a rule of thumb, it is best to select a stock of low P/S (</w:t>
+      </w:r>
+      <w:r>
+        <w:rPr>
+          <w:lang w:val="en-HK"/>
+        </w:rPr>
+        <w:t xml:space="preserve">potential </w:t>
+      </w:r>
+      <w:r>
+        <w:t>stock growth</w:t>
+      </w:r>
+      <w:r>
+        <w:rPr>
+          <w:lang w:val="en-HK"/>
+        </w:rPr>
+        <w:t xml:space="preserve">), and </w:t>
+      </w:r>
+      <w:r>
+        <w:rPr>
+          <w:lang w:val="en-HK"/>
+        </w:rPr>
+        <w:t>low</w:t>
+      </w:r>
+      <w:r>
+        <w:rPr>
+          <w:lang w:val="en-HK"/>
+        </w:rPr>
+        <w:t xml:space="preserve"> P/</w:t>
       </w:r>
       <w:r>
         <w:rPr>
@@ -3121,13 +3379,62 @@
         <w:rPr>
           <w:lang w:val="en-HK"/>
         </w:rPr>
-        <w:t xml:space="preserve">high earnings). </w:t>
-      </w:r>
-      <w:r>
-        <w:rPr>
-          <w:lang w:val="en-HK"/>
-        </w:rPr>
-        <w:t>However, if a company has low P/S (high sales) and high P/E not earning money, does that means we are not considering this stock. No, it is up to the management of the company, based on what strategies they use, that is either switching the business from off line (store) to online, or perhaps the most effective way, increase the purchase price</w:t>
+        <w:t>high</w:t>
+      </w:r>
+      <w:r>
+        <w:rPr>
+          <w:lang w:val="en-HK"/>
+        </w:rPr>
+        <w:t xml:space="preserve"> </w:t>
+      </w:r>
+      <w:r>
+        <w:rPr>
+          <w:lang w:val="en-HK"/>
+        </w:rPr>
+        <w:t>earnings</w:t>
+      </w:r>
+      <w:r>
+        <w:rPr>
+          <w:lang w:val="en-HK"/>
+        </w:rPr>
+        <w:t xml:space="preserve"> contributions</w:t>
+      </w:r>
+      <w:r>
+        <w:rPr>
+          <w:lang w:val="en-HK"/>
+        </w:rPr>
+        <w:t xml:space="preserve">). </w:t>
+      </w:r>
+    </w:p>
+    <w:p>
+      <w:pPr>
+        <w:rPr>
+          <w:lang w:val="en-HK"/>
+        </w:rPr>
+      </w:pPr>
+      <w:r>
+        <w:rPr>
+          <w:lang w:val="en-HK"/>
+        </w:rPr>
+        <w:tab/>
+      </w:r>
+      <w:r>
+        <w:rPr>
+          <w:lang w:val="en-HK"/>
+        </w:rPr>
+        <w:t>However, if a company has low P/S (</w:t>
+      </w:r>
+      <w:r>
+        <w:rPr>
+          <w:lang w:val="en-HK"/>
+        </w:rPr>
+        <w:t>undervalued sales contributions</w:t>
+      </w:r>
+      <w:r>
+        <w:rPr>
+          <w:lang w:val="en-HK"/>
+        </w:rPr>
+        <w:t>) and high P/E not earning money, does that means we are not considering this stock. No, it is up to the management of the company, based on what strategies they use, that is either switching the business from off line (store) to online, or perhaps the most effective way, increase the purchase price</w:t>
       </w:r>
       <w:r>
         <w:rPr>
@@ -3139,7 +3446,25 @@
         <w:rPr>
           <w:lang w:val="en-HK"/>
         </w:rPr>
-        <w:t xml:space="preserve"> But are there any companies has high P/S and low P/E. Yes, usually these companies come from selling luxuries, such as gold smith, high end bag store (LV, Chanel for instances). </w:t>
+        <w:t xml:space="preserve"> There are</w:t>
+      </w:r>
+      <w:r>
+        <w:rPr>
+          <w:lang w:val="en-HK"/>
+        </w:rPr>
+        <w:t xml:space="preserve"> </w:t>
+      </w:r>
+      <w:r>
+        <w:rPr>
+          <w:lang w:val="en-HK"/>
+        </w:rPr>
+        <w:t>even</w:t>
+      </w:r>
+      <w:r>
+        <w:rPr>
+          <w:lang w:val="en-HK"/>
+        </w:rPr>
+        <w:t xml:space="preserve"> companies has high P/S and low P/E. Yes, usually these companies come from selling luxuries, such as gold smith, high end bag store (LV, Chanel for instances). </w:t>
       </w:r>
       <w:r>
         <w:rPr>
@@ -3147,25 +3472,35 @@
         </w:rPr>
         <w:t xml:space="preserve">But </w:t>
       </w:r>
-      <w:proofErr w:type="spellStart"/>
-      <w:r>
-        <w:rPr>
-          <w:lang w:val="en-HK"/>
-        </w:rPr>
-        <w:t>theses</w:t>
-      </w:r>
-      <w:proofErr w:type="spellEnd"/>
-      <w:r>
-        <w:rPr>
-          <w:lang w:val="en-HK"/>
-        </w:rPr>
-        <w:t xml:space="preserve"> companies due to low P/S, they are very sensitive or fluctuated by the surrounding economic environment</w:t>
-      </w:r>
-      <w:r>
-        <w:rPr>
-          <w:lang w:val="en-HK"/>
-        </w:rPr>
-        <w:t xml:space="preserve"> and it is not easy to increase the sales.</w:t>
+      <w:r>
+        <w:rPr>
+          <w:lang w:val="en-HK"/>
+        </w:rPr>
+        <w:t>these</w:t>
+      </w:r>
+      <w:r>
+        <w:rPr>
+          <w:lang w:val="en-HK"/>
+        </w:rPr>
+        <w:t xml:space="preserve"> companies are very sensitive or fluctuated by the surrounding economic environment</w:t>
+      </w:r>
+      <w:r>
+        <w:rPr>
+          <w:lang w:val="en-HK"/>
+        </w:rPr>
+        <w:t xml:space="preserve"> and it is not easy to increase the sales</w:t>
+      </w:r>
+      <w:r>
+        <w:rPr>
+          <w:lang w:val="en-HK"/>
+        </w:rPr>
+        <w:t xml:space="preserve"> when economic crisis comes</w:t>
+      </w:r>
+      <w:r>
+        <w:rPr>
+          <w:lang w:val="en-HK"/>
+        </w:rPr>
+        <w:t>.</w:t>
       </w:r>
       <w:r>
         <w:rPr>
@@ -5215,6 +5550,155 @@
       </w:rPr>
     </w:lvl>
     <w:lvl w:ilvl="1">
+      <w:start w:val="1"/>
+      <w:numFmt w:val="bullet"/>
+      <w:lvlText w:val="o"/>
+      <w:lvlJc w:val="left"/>
+      <w:pPr>
+        <w:tabs>
+          <w:tab w:val="num" w:pos="1440"/>
+        </w:tabs>
+        <w:ind w:left="1440" w:hanging="360"/>
+      </w:pPr>
+      <w:rPr>
+        <w:rFonts w:ascii="Courier New" w:hAnsi="Courier New" w:hint="default"/>
+        <w:sz w:val="20"/>
+      </w:rPr>
+    </w:lvl>
+    <w:lvl w:ilvl="2" w:tentative="1">
+      <w:start w:val="1"/>
+      <w:numFmt w:val="bullet"/>
+      <w:lvlText w:val=""/>
+      <w:lvlJc w:val="left"/>
+      <w:pPr>
+        <w:tabs>
+          <w:tab w:val="num" w:pos="2160"/>
+        </w:tabs>
+        <w:ind w:left="2160" w:hanging="360"/>
+      </w:pPr>
+      <w:rPr>
+        <w:rFonts w:ascii="Wingdings" w:hAnsi="Wingdings" w:hint="default"/>
+        <w:sz w:val="20"/>
+      </w:rPr>
+    </w:lvl>
+    <w:lvl w:ilvl="3" w:tentative="1">
+      <w:start w:val="1"/>
+      <w:numFmt w:val="bullet"/>
+      <w:lvlText w:val=""/>
+      <w:lvlJc w:val="left"/>
+      <w:pPr>
+        <w:tabs>
+          <w:tab w:val="num" w:pos="2880"/>
+        </w:tabs>
+        <w:ind w:left="2880" w:hanging="360"/>
+      </w:pPr>
+      <w:rPr>
+        <w:rFonts w:ascii="Wingdings" w:hAnsi="Wingdings" w:hint="default"/>
+        <w:sz w:val="20"/>
+      </w:rPr>
+    </w:lvl>
+    <w:lvl w:ilvl="4" w:tentative="1">
+      <w:start w:val="1"/>
+      <w:numFmt w:val="bullet"/>
+      <w:lvlText w:val=""/>
+      <w:lvlJc w:val="left"/>
+      <w:pPr>
+        <w:tabs>
+          <w:tab w:val="num" w:pos="3600"/>
+        </w:tabs>
+        <w:ind w:left="3600" w:hanging="360"/>
+      </w:pPr>
+      <w:rPr>
+        <w:rFonts w:ascii="Wingdings" w:hAnsi="Wingdings" w:hint="default"/>
+        <w:sz w:val="20"/>
+      </w:rPr>
+    </w:lvl>
+    <w:lvl w:ilvl="5" w:tentative="1">
+      <w:start w:val="1"/>
+      <w:numFmt w:val="bullet"/>
+      <w:lvlText w:val=""/>
+      <w:lvlJc w:val="left"/>
+      <w:pPr>
+        <w:tabs>
+          <w:tab w:val="num" w:pos="4320"/>
+        </w:tabs>
+        <w:ind w:left="4320" w:hanging="360"/>
+      </w:pPr>
+      <w:rPr>
+        <w:rFonts w:ascii="Wingdings" w:hAnsi="Wingdings" w:hint="default"/>
+        <w:sz w:val="20"/>
+      </w:rPr>
+    </w:lvl>
+    <w:lvl w:ilvl="6" w:tentative="1">
+      <w:start w:val="1"/>
+      <w:numFmt w:val="bullet"/>
+      <w:lvlText w:val=""/>
+      <w:lvlJc w:val="left"/>
+      <w:pPr>
+        <w:tabs>
+          <w:tab w:val="num" w:pos="5040"/>
+        </w:tabs>
+        <w:ind w:left="5040" w:hanging="360"/>
+      </w:pPr>
+      <w:rPr>
+        <w:rFonts w:ascii="Wingdings" w:hAnsi="Wingdings" w:hint="default"/>
+        <w:sz w:val="20"/>
+      </w:rPr>
+    </w:lvl>
+    <w:lvl w:ilvl="7" w:tentative="1">
+      <w:start w:val="1"/>
+      <w:numFmt w:val="bullet"/>
+      <w:lvlText w:val=""/>
+      <w:lvlJc w:val="left"/>
+      <w:pPr>
+        <w:tabs>
+          <w:tab w:val="num" w:pos="5760"/>
+        </w:tabs>
+        <w:ind w:left="5760" w:hanging="360"/>
+      </w:pPr>
+      <w:rPr>
+        <w:rFonts w:ascii="Wingdings" w:hAnsi="Wingdings" w:hint="default"/>
+        <w:sz w:val="20"/>
+      </w:rPr>
+    </w:lvl>
+    <w:lvl w:ilvl="8" w:tentative="1">
+      <w:start w:val="1"/>
+      <w:numFmt w:val="bullet"/>
+      <w:lvlText w:val=""/>
+      <w:lvlJc w:val="left"/>
+      <w:pPr>
+        <w:tabs>
+          <w:tab w:val="num" w:pos="6480"/>
+        </w:tabs>
+        <w:ind w:left="6480" w:hanging="360"/>
+      </w:pPr>
+      <w:rPr>
+        <w:rFonts w:ascii="Wingdings" w:hAnsi="Wingdings" w:hint="default"/>
+        <w:sz w:val="20"/>
+      </w:rPr>
+    </w:lvl>
+  </w:abstractNum>
+  <w:abstractNum w:abstractNumId="17" w15:restartNumberingAfterBreak="0">
+    <w:nsid w:val="683D2D2F"/>
+    <w:multiLevelType w:val="multilevel"/>
+    <w:tmpl w:val="5EC87E3E"/>
+    <w:lvl w:ilvl="0">
+      <w:start w:val="1"/>
+      <w:numFmt w:val="bullet"/>
+      <w:lvlText w:val=""/>
+      <w:lvlJc w:val="left"/>
+      <w:pPr>
+        <w:tabs>
+          <w:tab w:val="num" w:pos="720"/>
+        </w:tabs>
+        <w:ind w:left="720" w:hanging="360"/>
+      </w:pPr>
+      <w:rPr>
+        <w:rFonts w:ascii="Symbol" w:hAnsi="Symbol" w:hint="default"/>
+        <w:sz w:val="20"/>
+      </w:rPr>
+    </w:lvl>
+    <w:lvl w:ilvl="1" w:tentative="1">
       <w:start w:val="1"/>
       <w:numFmt w:val="bullet"/>
       <w:lvlText w:val="o"/>
@@ -5393,6 +5877,9 @@
   </w:num>
   <w:num w:numId="17" w16cid:durableId="254751665">
     <w:abstractNumId w:val="7"/>
+  </w:num>
+  <w:num w:numId="18" w16cid:durableId="1497500096">
+    <w:abstractNumId w:val="17"/>
   </w:num>
 </w:numbering>
 </file>
@@ -5786,7 +6273,6 @@
   <w:style w:type="character" w:default="1" w:styleId="DefaultParagraphFont">
     <w:name w:val="Default Paragraph Font"/>
     <w:uiPriority w:val="1"/>
-    <w:semiHidden/>
     <w:unhideWhenUsed/>
   </w:style>
   <w:style w:type="table" w:default="1" w:styleId="TableNormal">

</xml_diff>